<commit_message>
updated file conversion guide, updated week 8 log
</commit_message>
<xml_diff>
--- a/File Processing Guide v0.1.docx
+++ b/File Processing Guide v0.1.docx
@@ -9,7 +9,7 @@
           <w:lang w:val="en-US"/>
         </w:rPr>
       </w:pPr>
-      <w:bookmarkStart w:id="0" w:name="_Toc239345188"/>
+      <w:bookmarkStart w:id="0" w:name="_Toc239345940"/>
       <w:r>
         <w:rPr>
           <w:lang w:val="en-US"/>
@@ -70,21 +70,7 @@
         <w:rPr>
           <w:lang w:val="en-US"/>
         </w:rPr>
-        <w:t xml:space="preserve"> into formats that can be fed into </w:t>
-      </w:r>
-      <w:proofErr w:type="spellStart"/>
-      <w:r>
-        <w:rPr>
-          <w:lang w:val="en-US"/>
-        </w:rPr>
-        <w:t>Ollama</w:t>
-      </w:r>
-      <w:proofErr w:type="spellEnd"/>
-      <w:r>
-        <w:rPr>
-          <w:lang w:val="en-US"/>
-        </w:rPr>
-        <w:t xml:space="preserve">. </w:t>
+        <w:t xml:space="preserve"> into formats that can be fed into Ollama. </w:t>
       </w:r>
     </w:p>
     <w:p>
@@ -309,7 +295,7 @@
           <w:r>
             <w:fldChar w:fldCharType="separate"/>
           </w:r>
-          <w:hyperlink w:anchor="_Toc239345188" w:history="1">
+          <w:hyperlink w:anchor="_Toc239345940" w:history="1">
             <w:r>
               <w:rPr>
                 <w:rStyle w:val="Hyperlink"/>
@@ -337,7 +323,7 @@
                 <w:noProof/>
                 <w:webHidden/>
               </w:rPr>
-              <w:instrText xml:space="preserve"> PAGEREF _Toc239345188 \h </w:instrText>
+              <w:instrText xml:space="preserve"> PAGEREF _Toc239345940 \h </w:instrText>
             </w:r>
             <w:r>
               <w:rPr>
@@ -380,7 +366,7 @@
               <w:lang w:eastAsia="en-NZ"/>
             </w:rPr>
           </w:pPr>
-          <w:hyperlink w:anchor="_Toc239345189" w:history="1">
+          <w:hyperlink w:anchor="_Toc239345941" w:history="1">
             <w:r>
               <w:rPr>
                 <w:rStyle w:val="Hyperlink"/>
@@ -408,7 +394,7 @@
                 <w:noProof/>
                 <w:webHidden/>
               </w:rPr>
-              <w:instrText xml:space="preserve"> PAGEREF _Toc239345189 \h </w:instrText>
+              <w:instrText xml:space="preserve"> PAGEREF _Toc239345941 \h </w:instrText>
             </w:r>
             <w:r>
               <w:rPr>
@@ -451,7 +437,7 @@
               <w:lang w:eastAsia="en-NZ"/>
             </w:rPr>
           </w:pPr>
-          <w:hyperlink w:anchor="_Toc239345190" w:history="1">
+          <w:hyperlink w:anchor="_Toc239345942" w:history="1">
             <w:r>
               <w:rPr>
                 <w:rStyle w:val="Hyperlink"/>
@@ -479,7 +465,7 @@
                 <w:noProof/>
                 <w:webHidden/>
               </w:rPr>
-              <w:instrText xml:space="preserve"> PAGEREF _Toc239345190 \h </w:instrText>
+              <w:instrText xml:space="preserve"> PAGEREF _Toc239345942 \h </w:instrText>
             </w:r>
             <w:r>
               <w:rPr>
@@ -522,7 +508,7 @@
               <w:lang w:eastAsia="en-NZ"/>
             </w:rPr>
           </w:pPr>
-          <w:hyperlink w:anchor="_Toc239345191" w:history="1">
+          <w:hyperlink w:anchor="_Toc239345943" w:history="1">
             <w:r>
               <w:rPr>
                 <w:rStyle w:val="Hyperlink"/>
@@ -550,7 +536,7 @@
                 <w:noProof/>
                 <w:webHidden/>
               </w:rPr>
-              <w:instrText xml:space="preserve"> PAGEREF _Toc239345191 \h </w:instrText>
+              <w:instrText xml:space="preserve"> PAGEREF _Toc239345943 \h </w:instrText>
             </w:r>
             <w:r>
               <w:rPr>
@@ -593,7 +579,7 @@
               <w:lang w:eastAsia="en-NZ"/>
             </w:rPr>
           </w:pPr>
-          <w:hyperlink w:anchor="_Toc239345192" w:history="1">
+          <w:hyperlink w:anchor="_Toc239345944" w:history="1">
             <w:r>
               <w:rPr>
                 <w:rStyle w:val="Hyperlink"/>
@@ -621,7 +607,7 @@
                 <w:noProof/>
                 <w:webHidden/>
               </w:rPr>
-              <w:instrText xml:space="preserve"> PAGEREF _Toc239345192 \h </w:instrText>
+              <w:instrText xml:space="preserve"> PAGEREF _Toc239345944 \h </w:instrText>
             </w:r>
             <w:r>
               <w:rPr>
@@ -664,7 +650,7 @@
               <w:lang w:eastAsia="en-NZ"/>
             </w:rPr>
           </w:pPr>
-          <w:hyperlink w:anchor="_Toc239345193" w:history="1">
+          <w:hyperlink w:anchor="_Toc239345945" w:history="1">
             <w:r>
               <w:rPr>
                 <w:rStyle w:val="Hyperlink"/>
@@ -692,7 +678,7 @@
                 <w:noProof/>
                 <w:webHidden/>
               </w:rPr>
-              <w:instrText xml:space="preserve"> PAGEREF _Toc239345193 \h </w:instrText>
+              <w:instrText xml:space="preserve"> PAGEREF _Toc239345945 \h </w:instrText>
             </w:r>
             <w:r>
               <w:rPr>
@@ -735,7 +721,7 @@
               <w:lang w:eastAsia="en-NZ"/>
             </w:rPr>
           </w:pPr>
-          <w:hyperlink w:anchor="_Toc239345194" w:history="1">
+          <w:hyperlink w:anchor="_Toc239345946" w:history="1">
             <w:r>
               <w:rPr>
                 <w:rStyle w:val="Hyperlink"/>
@@ -763,7 +749,7 @@
                 <w:noProof/>
                 <w:webHidden/>
               </w:rPr>
-              <w:instrText xml:space="preserve"> PAGEREF _Toc239345194 \h </w:instrText>
+              <w:instrText xml:space="preserve"> PAGEREF _Toc239345946 \h </w:instrText>
             </w:r>
             <w:r>
               <w:rPr>
@@ -806,7 +792,7 @@
               <w:lang w:eastAsia="en-NZ"/>
             </w:rPr>
           </w:pPr>
-          <w:hyperlink w:anchor="_Toc239345195" w:history="1">
+          <w:hyperlink w:anchor="_Toc239345947" w:history="1">
             <w:r>
               <w:rPr>
                 <w:rStyle w:val="Hyperlink"/>
@@ -834,7 +820,7 @@
                 <w:noProof/>
                 <w:webHidden/>
               </w:rPr>
-              <w:instrText xml:space="preserve"> PAGEREF _Toc239345195 \h </w:instrText>
+              <w:instrText xml:space="preserve"> PAGEREF _Toc239345947 \h </w:instrText>
             </w:r>
             <w:r>
               <w:rPr>
@@ -877,7 +863,7 @@
               <w:lang w:eastAsia="en-NZ"/>
             </w:rPr>
           </w:pPr>
-          <w:hyperlink w:anchor="_Toc239345196" w:history="1">
+          <w:hyperlink w:anchor="_Toc239345948" w:history="1">
             <w:r>
               <w:rPr>
                 <w:rStyle w:val="Hyperlink"/>
@@ -905,7 +891,7 @@
                 <w:noProof/>
                 <w:webHidden/>
               </w:rPr>
-              <w:instrText xml:space="preserve"> PAGEREF _Toc239345196 \h </w:instrText>
+              <w:instrText xml:space="preserve"> PAGEREF _Toc239345948 \h </w:instrText>
             </w:r>
             <w:r>
               <w:rPr>
@@ -948,7 +934,7 @@
               <w:lang w:eastAsia="en-NZ"/>
             </w:rPr>
           </w:pPr>
-          <w:hyperlink w:anchor="_Toc239345197" w:history="1">
+          <w:hyperlink w:anchor="_Toc239345949" w:history="1">
             <w:r>
               <w:rPr>
                 <w:rStyle w:val="Hyperlink"/>
@@ -976,7 +962,7 @@
                 <w:noProof/>
                 <w:webHidden/>
               </w:rPr>
-              <w:instrText xml:space="preserve"> PAGEREF _Toc239345197 \h </w:instrText>
+              <w:instrText xml:space="preserve"> PAGEREF _Toc239345949 \h </w:instrText>
             </w:r>
             <w:r>
               <w:rPr>
@@ -1019,7 +1005,7 @@
               <w:lang w:eastAsia="en-NZ"/>
             </w:rPr>
           </w:pPr>
-          <w:hyperlink w:anchor="_Toc239345198" w:history="1">
+          <w:hyperlink w:anchor="_Toc239345950" w:history="1">
             <w:r>
               <w:rPr>
                 <w:rStyle w:val="Hyperlink"/>
@@ -1047,7 +1033,7 @@
                 <w:noProof/>
                 <w:webHidden/>
               </w:rPr>
-              <w:instrText xml:space="preserve"> PAGEREF _Toc239345198 \h </w:instrText>
+              <w:instrText xml:space="preserve"> PAGEREF _Toc239345950 \h </w:instrText>
             </w:r>
             <w:r>
               <w:rPr>
@@ -1090,7 +1076,7 @@
               <w:lang w:eastAsia="en-NZ"/>
             </w:rPr>
           </w:pPr>
-          <w:hyperlink w:anchor="_Toc239345199" w:history="1">
+          <w:hyperlink w:anchor="_Toc239345951" w:history="1">
             <w:r>
               <w:rPr>
                 <w:rStyle w:val="Hyperlink"/>
@@ -1118,7 +1104,7 @@
                 <w:noProof/>
                 <w:webHidden/>
               </w:rPr>
-              <w:instrText xml:space="preserve"> PAGEREF _Toc239345199 \h </w:instrText>
+              <w:instrText xml:space="preserve"> PAGEREF _Toc239345951 \h </w:instrText>
             </w:r>
             <w:r>
               <w:rPr>
@@ -1161,7 +1147,7 @@
               <w:lang w:eastAsia="en-NZ"/>
             </w:rPr>
           </w:pPr>
-          <w:hyperlink w:anchor="_Toc239345200" w:history="1">
+          <w:hyperlink w:anchor="_Toc239345952" w:history="1">
             <w:r>
               <w:rPr>
                 <w:rStyle w:val="Hyperlink"/>
@@ -1189,7 +1175,7 @@
                 <w:noProof/>
                 <w:webHidden/>
               </w:rPr>
-              <w:instrText xml:space="preserve"> PAGEREF _Toc239345200 \h </w:instrText>
+              <w:instrText xml:space="preserve"> PAGEREF _Toc239345952 \h </w:instrText>
             </w:r>
             <w:r>
               <w:rPr>
@@ -1232,7 +1218,7 @@
               <w:lang w:eastAsia="en-NZ"/>
             </w:rPr>
           </w:pPr>
-          <w:hyperlink w:anchor="_Toc239345201" w:history="1">
+          <w:hyperlink w:anchor="_Toc239345953" w:history="1">
             <w:r>
               <w:rPr>
                 <w:rStyle w:val="Hyperlink"/>
@@ -1260,7 +1246,7 @@
                 <w:noProof/>
                 <w:webHidden/>
               </w:rPr>
-              <w:instrText xml:space="preserve"> PAGEREF _Toc239345201 \h </w:instrText>
+              <w:instrText xml:space="preserve"> PAGEREF _Toc239345953 \h </w:instrText>
             </w:r>
             <w:r>
               <w:rPr>
@@ -1303,7 +1289,7 @@
               <w:lang w:eastAsia="en-NZ"/>
             </w:rPr>
           </w:pPr>
-          <w:hyperlink w:anchor="_Toc239345202" w:history="1">
+          <w:hyperlink w:anchor="_Toc239345954" w:history="1">
             <w:r>
               <w:rPr>
                 <w:rStyle w:val="Hyperlink"/>
@@ -1331,7 +1317,7 @@
                 <w:noProof/>
                 <w:webHidden/>
               </w:rPr>
-              <w:instrText xml:space="preserve"> PAGEREF _Toc239345202 \h </w:instrText>
+              <w:instrText xml:space="preserve"> PAGEREF _Toc239345954 \h </w:instrText>
             </w:r>
             <w:r>
               <w:rPr>
@@ -1352,6 +1338,148 @@
                 <w:webHidden/>
               </w:rPr>
               <w:t>7</w:t>
+            </w:r>
+            <w:r>
+              <w:rPr>
+                <w:noProof/>
+                <w:webHidden/>
+              </w:rPr>
+              <w:fldChar w:fldCharType="end"/>
+            </w:r>
+          </w:hyperlink>
+        </w:p>
+        <w:p>
+          <w:pPr>
+            <w:pStyle w:val="TOC1"/>
+            <w:tabs>
+              <w:tab w:val="right" w:leader="dot" w:pos="9016"/>
+            </w:tabs>
+            <w:rPr>
+              <w:rFonts w:eastAsiaTheme="minorEastAsia"/>
+              <w:noProof/>
+              <w:lang w:eastAsia="en-NZ"/>
+            </w:rPr>
+          </w:pPr>
+          <w:hyperlink w:anchor="_Toc239345955" w:history="1">
+            <w:r>
+              <w:rPr>
+                <w:rStyle w:val="Hyperlink"/>
+                <w:noProof/>
+                <w:lang w:val="en-US"/>
+              </w:rPr>
+              <w:t>Nmap</w:t>
+            </w:r>
+            <w:r>
+              <w:rPr>
+                <w:noProof/>
+                <w:webHidden/>
+              </w:rPr>
+              <w:tab/>
+            </w:r>
+            <w:r>
+              <w:rPr>
+                <w:noProof/>
+                <w:webHidden/>
+              </w:rPr>
+              <w:fldChar w:fldCharType="begin"/>
+            </w:r>
+            <w:r>
+              <w:rPr>
+                <w:noProof/>
+                <w:webHidden/>
+              </w:rPr>
+              <w:instrText xml:space="preserve"> PAGEREF _Toc239345955 \h </w:instrText>
+            </w:r>
+            <w:r>
+              <w:rPr>
+                <w:noProof/>
+                <w:webHidden/>
+              </w:rPr>
+            </w:r>
+            <w:r>
+              <w:rPr>
+                <w:noProof/>
+                <w:webHidden/>
+              </w:rPr>
+              <w:fldChar w:fldCharType="separate"/>
+            </w:r>
+            <w:r>
+              <w:rPr>
+                <w:noProof/>
+                <w:webHidden/>
+              </w:rPr>
+              <w:t>8</w:t>
+            </w:r>
+            <w:r>
+              <w:rPr>
+                <w:noProof/>
+                <w:webHidden/>
+              </w:rPr>
+              <w:fldChar w:fldCharType="end"/>
+            </w:r>
+          </w:hyperlink>
+        </w:p>
+        <w:p>
+          <w:pPr>
+            <w:pStyle w:val="TOC2"/>
+            <w:tabs>
+              <w:tab w:val="right" w:leader="dot" w:pos="9016"/>
+            </w:tabs>
+            <w:rPr>
+              <w:rFonts w:eastAsiaTheme="minorEastAsia"/>
+              <w:noProof/>
+              <w:lang w:eastAsia="en-NZ"/>
+            </w:rPr>
+          </w:pPr>
+          <w:hyperlink w:anchor="_Toc239345956" w:history="1">
+            <w:r>
+              <w:rPr>
+                <w:rStyle w:val="Hyperlink"/>
+                <w:noProof/>
+                <w:lang w:val="en-US"/>
+              </w:rPr>
+              <w:t>XML</w:t>
+            </w:r>
+            <w:r>
+              <w:rPr>
+                <w:noProof/>
+                <w:webHidden/>
+              </w:rPr>
+              <w:tab/>
+            </w:r>
+            <w:r>
+              <w:rPr>
+                <w:noProof/>
+                <w:webHidden/>
+              </w:rPr>
+              <w:fldChar w:fldCharType="begin"/>
+            </w:r>
+            <w:r>
+              <w:rPr>
+                <w:noProof/>
+                <w:webHidden/>
+              </w:rPr>
+              <w:instrText xml:space="preserve"> PAGEREF _Toc239345956 \h </w:instrText>
+            </w:r>
+            <w:r>
+              <w:rPr>
+                <w:noProof/>
+                <w:webHidden/>
+              </w:rPr>
+            </w:r>
+            <w:r>
+              <w:rPr>
+                <w:noProof/>
+                <w:webHidden/>
+              </w:rPr>
+              <w:fldChar w:fldCharType="separate"/>
+            </w:r>
+            <w:r>
+              <w:rPr>
+                <w:noProof/>
+                <w:webHidden/>
+              </w:rPr>
+              <w:t>8</w:t>
             </w:r>
             <w:r>
               <w:rPr>
@@ -1453,26 +1581,12 @@
     </w:p>
     <w:p>
       <w:pPr>
-        <w:rPr>
-          <w:lang w:val="en-US"/>
-        </w:rPr>
-      </w:pPr>
-    </w:p>
-    <w:p>
-      <w:pPr>
-        <w:rPr>
-          <w:lang w:val="en-US"/>
-        </w:rPr>
-      </w:pPr>
-    </w:p>
-    <w:p>
-      <w:pPr>
         <w:pStyle w:val="Heading1"/>
         <w:rPr>
           <w:lang w:val="en-US"/>
         </w:rPr>
       </w:pPr>
-      <w:bookmarkStart w:id="1" w:name="_Toc239345189"/>
+      <w:bookmarkStart w:id="1" w:name="_Toc239345941"/>
       <w:r>
         <w:rPr>
           <w:lang w:val="en-US"/>
@@ -1542,7 +1656,7 @@
         </w:rPr>
       </w:pPr>
       <w:bookmarkStart w:id="2" w:name="_Toc239337273"/>
-      <w:bookmarkStart w:id="3" w:name="_Toc239345190"/>
+      <w:bookmarkStart w:id="3" w:name="_Toc239345942"/>
       <w:r>
         <w:rPr>
           <w:lang w:val="en-US"/>
@@ -1593,35 +1707,21 @@
         <w:rPr>
           <w:lang w:val="en-US"/>
         </w:rPr>
+        <w:t>-Ollama/Gemma4 have trouble reading large text files</w:t>
+      </w:r>
+    </w:p>
+    <w:p>
+      <w:pPr>
+        <w:rPr>
+          <w:lang w:val="en-US"/>
+        </w:rPr>
+      </w:pPr>
+      <w:r>
+        <w:rPr>
+          <w:lang w:val="en-US"/>
+        </w:rPr>
         <w:t>-</w:t>
       </w:r>
-      <w:proofErr w:type="spellStart"/>
-      <w:r>
-        <w:rPr>
-          <w:lang w:val="en-US"/>
-        </w:rPr>
-        <w:t>Ollama</w:t>
-      </w:r>
-      <w:proofErr w:type="spellEnd"/>
-      <w:r>
-        <w:rPr>
-          <w:lang w:val="en-US"/>
-        </w:rPr>
-        <w:t>/Gemma4 have trouble reading large text files</w:t>
-      </w:r>
-    </w:p>
-    <w:p>
-      <w:pPr>
-        <w:rPr>
-          <w:lang w:val="en-US"/>
-        </w:rPr>
-      </w:pPr>
-      <w:r>
-        <w:rPr>
-          <w:lang w:val="en-US"/>
-        </w:rPr>
-        <w:t>-</w:t>
-      </w:r>
       <w:r>
         <w:rPr>
           <w:lang w:val="en-US"/>
@@ -1638,48 +1738,24 @@
         <w:rPr>
           <w:lang w:val="en-US"/>
         </w:rPr>
-        <w:t>‘</w:t>
-      </w:r>
-      <w:proofErr w:type="spellStart"/>
-      <w:r>
-        <w:rPr>
-          <w:lang w:val="en-US"/>
-        </w:rPr>
-        <w:t>pdftotext</w:t>
-      </w:r>
-      <w:proofErr w:type="spellEnd"/>
-      <w:r>
-        <w:rPr>
-          <w:lang w:val="en-US"/>
-        </w:rPr>
-        <w:t xml:space="preserve">’ </w:t>
-      </w:r>
-    </w:p>
-    <w:p>
-      <w:pPr>
-        <w:rPr>
-          <w:b/>
-          <w:bCs/>
-          <w:lang w:val="en-US"/>
-        </w:rPr>
-      </w:pPr>
-      <w:proofErr w:type="spellStart"/>
-      <w:r>
-        <w:rPr>
-          <w:b/>
-          <w:bCs/>
-          <w:lang w:val="en-US"/>
-        </w:rPr>
-        <w:t>pdftotext</w:t>
-      </w:r>
-      <w:proofErr w:type="spellEnd"/>
-      <w:r>
-        <w:rPr>
-          <w:b/>
-          <w:bCs/>
-          <w:lang w:val="en-US"/>
-        </w:rPr>
-        <w:t xml:space="preserve"> </w:t>
+        <w:t xml:space="preserve">‘pdftotext’ </w:t>
+      </w:r>
+    </w:p>
+    <w:p>
+      <w:pPr>
+        <w:rPr>
+          <w:b/>
+          <w:bCs/>
+          <w:lang w:val="en-US"/>
+        </w:rPr>
+      </w:pPr>
+      <w:r>
+        <w:rPr>
+          <w:b/>
+          <w:bCs/>
+          <w:lang w:val="en-US"/>
+        </w:rPr>
+        <w:t xml:space="preserve">pdftotext </w:t>
       </w:r>
       <w:r>
         <w:rPr>
@@ -1767,25 +1843,7 @@
           <w:bCs/>
           <w:lang w:val="en-US"/>
         </w:rPr>
-        <w:t xml:space="preserve">.txt | </w:t>
-      </w:r>
-      <w:proofErr w:type="spellStart"/>
-      <w:r>
-        <w:rPr>
-          <w:b/>
-          <w:bCs/>
-          <w:lang w:val="en-US"/>
-        </w:rPr>
-        <w:t>ollama</w:t>
-      </w:r>
-      <w:proofErr w:type="spellEnd"/>
-      <w:r>
-        <w:rPr>
-          <w:b/>
-          <w:bCs/>
-          <w:lang w:val="en-US"/>
-        </w:rPr>
-        <w:t xml:space="preserve"> run gemma4:26b </w:t>
+        <w:t xml:space="preserve">.txt | ollama run gemma4:26b </w:t>
       </w:r>
       <w:r>
         <w:rPr>
@@ -1874,7 +1932,6 @@
           <w:lang w:val="en-US"/>
         </w:rPr>
       </w:pPr>
-      <w:proofErr w:type="spellStart"/>
       <w:r>
         <w:rPr>
           <w:b/>
@@ -1889,16 +1946,7 @@
           <w:bCs/>
           <w:lang w:val="en-US"/>
         </w:rPr>
-        <w:t>llama</w:t>
-      </w:r>
-      <w:proofErr w:type="spellEnd"/>
-      <w:r>
-        <w:rPr>
-          <w:b/>
-          <w:bCs/>
-          <w:lang w:val="en-US"/>
-        </w:rPr>
-        <w:t xml:space="preserve"> run gemma4:26b </w:t>
+        <w:t xml:space="preserve">llama run gemma4:26b </w:t>
       </w:r>
       <w:r>
         <w:rPr>
@@ -2033,25 +2081,7 @@
           <w:bCs/>
           <w:lang w:val="en-US"/>
         </w:rPr>
-        <w:t xml:space="preserve">cat *.txt | </w:t>
-      </w:r>
-      <w:proofErr w:type="spellStart"/>
-      <w:r>
-        <w:rPr>
-          <w:b/>
-          <w:bCs/>
-          <w:lang w:val="en-US"/>
-        </w:rPr>
-        <w:t>ollama</w:t>
-      </w:r>
-      <w:proofErr w:type="spellEnd"/>
-      <w:r>
-        <w:rPr>
-          <w:b/>
-          <w:bCs/>
-          <w:lang w:val="en-US"/>
-        </w:rPr>
-        <w:t xml:space="preserve"> run gemma4:26b </w:t>
+        <w:t xml:space="preserve">cat *.txt | ollama run gemma4:26b </w:t>
       </w:r>
       <w:r>
         <w:rPr>
@@ -2176,7 +2206,7 @@
           <w:lang w:val="en-US"/>
         </w:rPr>
       </w:pPr>
-      <w:bookmarkStart w:id="4" w:name="_Toc239345191"/>
+      <w:bookmarkStart w:id="4" w:name="_Toc239345943"/>
       <w:r>
         <w:rPr>
           <w:lang w:val="en-US"/>
@@ -2193,7 +2223,7 @@
           <w:lang w:val="en-US"/>
         </w:rPr>
       </w:pPr>
-      <w:bookmarkStart w:id="5" w:name="_Toc239345192"/>
+      <w:bookmarkStart w:id="5" w:name="_Toc239345944"/>
       <w:r>
         <w:rPr>
           <w:lang w:val="en-US"/>
@@ -2212,50 +2242,25 @@
         <w:rPr>
           <w:lang w:val="en-US"/>
         </w:rPr>
-        <w:t>-use ‘</w:t>
-      </w:r>
-      <w:proofErr w:type="spellStart"/>
-      <w:r>
-        <w:rPr>
-          <w:lang w:val="en-US"/>
-        </w:rPr>
-        <w:t>unrar</w:t>
-      </w:r>
-      <w:proofErr w:type="spellEnd"/>
-      <w:r>
-        <w:rPr>
-          <w:lang w:val="en-US"/>
-        </w:rPr>
-        <w:t>’</w:t>
-      </w:r>
-    </w:p>
-    <w:p>
-      <w:pPr>
-        <w:rPr>
-          <w:b/>
-          <w:bCs/>
-          <w:lang w:val="en-US"/>
-        </w:rPr>
-      </w:pPr>
-      <w:proofErr w:type="spellStart"/>
-      <w:r>
-        <w:rPr>
-          <w:b/>
-          <w:bCs/>
-          <w:lang w:val="en-US"/>
-        </w:rPr>
-        <w:t>unrar</w:t>
-      </w:r>
-      <w:proofErr w:type="spellEnd"/>
-      <w:r>
-        <w:rPr>
-          <w:b/>
-          <w:bCs/>
-          <w:lang w:val="en-US"/>
-        </w:rPr>
-        <w:t xml:space="preserve"> x </w:t>
-      </w:r>
-      <w:proofErr w:type="spellStart"/>
+        <w:t>-use ‘unrar’</w:t>
+      </w:r>
+    </w:p>
+    <w:p>
+      <w:pPr>
+        <w:rPr>
+          <w:b/>
+          <w:bCs/>
+          <w:lang w:val="en-US"/>
+        </w:rPr>
+      </w:pPr>
+      <w:r>
+        <w:rPr>
+          <w:b/>
+          <w:bCs/>
+          <w:lang w:val="en-US"/>
+        </w:rPr>
+        <w:t xml:space="preserve">unrar x </w:t>
+      </w:r>
       <w:r>
         <w:rPr>
           <w:b/>
@@ -2273,7 +2278,6 @@
         </w:rPr>
         <w:t>.rar</w:t>
       </w:r>
-      <w:proofErr w:type="spellEnd"/>
     </w:p>
     <w:p>
       <w:pPr>
@@ -2295,25 +2299,14 @@
           <w:bCs/>
         </w:rPr>
       </w:pPr>
-      <w:proofErr w:type="spellStart"/>
-      <w:r>
-        <w:rPr>
-          <w:b/>
-          <w:bCs/>
-          <w:lang w:val="en-US"/>
-        </w:rPr>
-        <w:t>unrar</w:t>
-      </w:r>
-      <w:proofErr w:type="spellEnd"/>
-      <w:r>
-        <w:rPr>
-          <w:b/>
-          <w:bCs/>
-          <w:lang w:val="en-US"/>
-        </w:rPr>
-        <w:t xml:space="preserve"> x </w:t>
-      </w:r>
-      <w:proofErr w:type="spellStart"/>
+      <w:r>
+        <w:rPr>
+          <w:b/>
+          <w:bCs/>
+          <w:lang w:val="en-US"/>
+        </w:rPr>
+        <w:t xml:space="preserve">unrar x </w:t>
+      </w:r>
       <w:r>
         <w:rPr>
           <w:b/>
@@ -2331,7 +2324,6 @@
         </w:rPr>
         <w:t>.rar</w:t>
       </w:r>
-      <w:proofErr w:type="spellEnd"/>
       <w:r>
         <w:rPr>
           <w:b/>
@@ -2415,7 +2407,7 @@
           <w:lang w:val="en-US"/>
         </w:rPr>
       </w:pPr>
-      <w:bookmarkStart w:id="6" w:name="_Toc239345193"/>
+      <w:bookmarkStart w:id="6" w:name="_Toc239345945"/>
       <w:r>
         <w:rPr>
           <w:lang w:val="en-US"/>
@@ -2635,7 +2627,7 @@
           <w:lang w:val="en-US"/>
         </w:rPr>
       </w:pPr>
-      <w:bookmarkStart w:id="7" w:name="_Toc239345194"/>
+      <w:bookmarkStart w:id="7" w:name="_Toc239345946"/>
       <w:r>
         <w:rPr>
           <w:lang w:val="en-US"/>
@@ -2652,7 +2644,7 @@
           <w:lang w:val="en-US"/>
         </w:rPr>
       </w:pPr>
-      <w:bookmarkStart w:id="8" w:name="_Toc239345195"/>
+      <w:bookmarkStart w:id="8" w:name="_Toc239345947"/>
       <w:r>
         <w:rPr>
           <w:lang w:val="en-US"/>
@@ -2671,66 +2663,24 @@
         <w:rPr>
           <w:lang w:val="en-US"/>
         </w:rPr>
-        <w:t>-Use ‘</w:t>
-      </w:r>
-      <w:proofErr w:type="spellStart"/>
-      <w:r>
-        <w:rPr>
-          <w:lang w:val="en-US"/>
-        </w:rPr>
-        <w:t>ffmpeg</w:t>
-      </w:r>
-      <w:proofErr w:type="spellEnd"/>
-      <w:r>
-        <w:rPr>
-          <w:lang w:val="en-US"/>
-        </w:rPr>
-        <w:t>’</w:t>
-      </w:r>
-    </w:p>
-    <w:p>
-      <w:pPr>
-        <w:rPr>
-          <w:b/>
-          <w:bCs/>
-          <w:lang w:val="en-US"/>
-        </w:rPr>
-      </w:pPr>
-      <w:proofErr w:type="spellStart"/>
-      <w:r>
-        <w:rPr>
-          <w:b/>
-          <w:bCs/>
-          <w:lang w:val="en-US"/>
-        </w:rPr>
-        <w:t>ffmpeg</w:t>
-      </w:r>
-      <w:proofErr w:type="spellEnd"/>
-      <w:r>
-        <w:rPr>
-          <w:b/>
-          <w:bCs/>
-          <w:lang w:val="en-US"/>
-        </w:rPr>
-        <w:t xml:space="preserve"> -</w:t>
-      </w:r>
-      <w:proofErr w:type="spellStart"/>
-      <w:r>
-        <w:rPr>
-          <w:b/>
-          <w:bCs/>
-          <w:lang w:val="en-US"/>
-        </w:rPr>
-        <w:t>i</w:t>
-      </w:r>
-      <w:proofErr w:type="spellEnd"/>
-      <w:r>
-        <w:rPr>
-          <w:b/>
-          <w:bCs/>
-          <w:lang w:val="en-US"/>
-        </w:rPr>
-        <w:t xml:space="preserve"> </w:t>
+        <w:t>-Use ‘ffmpeg’</w:t>
+      </w:r>
+    </w:p>
+    <w:p>
+      <w:pPr>
+        <w:rPr>
+          <w:b/>
+          <w:bCs/>
+          <w:lang w:val="en-US"/>
+        </w:rPr>
+      </w:pPr>
+      <w:r>
+        <w:rPr>
+          <w:b/>
+          <w:bCs/>
+          <w:lang w:val="en-US"/>
+        </w:rPr>
+        <w:t xml:space="preserve">ffmpeg -i </w:t>
       </w:r>
       <w:r>
         <w:rPr>
@@ -2891,7 +2841,7 @@
           <w:lang w:val="en-US"/>
         </w:rPr>
       </w:pPr>
-      <w:bookmarkStart w:id="9" w:name="_Toc239345196"/>
+      <w:bookmarkStart w:id="9" w:name="_Toc239345948"/>
       <w:r>
         <w:rPr>
           <w:lang w:val="en-US"/>
@@ -2923,74 +2873,24 @@
         <w:rPr>
           <w:lang w:val="en-US"/>
         </w:rPr>
-        <w:t>-Or you could convert a single frame (say the first) with ‘</w:t>
-      </w:r>
-      <w:proofErr w:type="spellStart"/>
-      <w:r>
-        <w:rPr>
-          <w:lang w:val="en-US"/>
-        </w:rPr>
-        <w:t>ffmpeg</w:t>
-      </w:r>
-      <w:proofErr w:type="spellEnd"/>
-      <w:r>
-        <w:rPr>
-          <w:lang w:val="en-US"/>
-        </w:rPr>
-        <w:t xml:space="preserve">’ to </w:t>
-      </w:r>
-      <w:proofErr w:type="spellStart"/>
-      <w:r>
-        <w:rPr>
-          <w:lang w:val="en-US"/>
-        </w:rPr>
-        <w:t>png</w:t>
-      </w:r>
-      <w:proofErr w:type="spellEnd"/>
-    </w:p>
-    <w:p>
-      <w:pPr>
-        <w:rPr>
-          <w:b/>
-          <w:bCs/>
-          <w:lang w:val="en-US"/>
-        </w:rPr>
-      </w:pPr>
-      <w:proofErr w:type="spellStart"/>
-      <w:r>
-        <w:rPr>
-          <w:b/>
-          <w:bCs/>
-          <w:lang w:val="en-US"/>
-        </w:rPr>
-        <w:t>ffmpeg</w:t>
-      </w:r>
-      <w:proofErr w:type="spellEnd"/>
-      <w:r>
-        <w:rPr>
-          <w:b/>
-          <w:bCs/>
-          <w:lang w:val="en-US"/>
-        </w:rPr>
-        <w:t xml:space="preserve"> -</w:t>
-      </w:r>
-      <w:proofErr w:type="spellStart"/>
-      <w:r>
-        <w:rPr>
-          <w:b/>
-          <w:bCs/>
-          <w:lang w:val="en-US"/>
-        </w:rPr>
-        <w:t>i</w:t>
-      </w:r>
-      <w:proofErr w:type="spellEnd"/>
-      <w:r>
-        <w:rPr>
-          <w:b/>
-          <w:bCs/>
-          <w:lang w:val="en-US"/>
-        </w:rPr>
-        <w:t xml:space="preserve"> </w:t>
+        <w:t>-Or you could convert a single frame (say the first) with ‘ffmpeg’ to png</w:t>
+      </w:r>
+    </w:p>
+    <w:p>
+      <w:pPr>
+        <w:rPr>
+          <w:b/>
+          <w:bCs/>
+          <w:lang w:val="en-US"/>
+        </w:rPr>
+      </w:pPr>
+      <w:r>
+        <w:rPr>
+          <w:b/>
+          <w:bCs/>
+          <w:lang w:val="en-US"/>
+        </w:rPr>
+        <w:t xml:space="preserve">ffmpeg -i </w:t>
       </w:r>
       <w:r>
         <w:rPr>
@@ -3007,27 +2907,7 @@
           <w:bCs/>
           <w:lang w:val="en-US"/>
         </w:rPr>
-        <w:t>.gif -</w:t>
-      </w:r>
-      <w:proofErr w:type="spellStart"/>
-      <w:proofErr w:type="gramStart"/>
-      <w:r>
-        <w:rPr>
-          <w:b/>
-          <w:bCs/>
-          <w:lang w:val="en-US"/>
-        </w:rPr>
-        <w:t>frames:v</w:t>
-      </w:r>
-      <w:proofErr w:type="spellEnd"/>
-      <w:proofErr w:type="gramEnd"/>
-      <w:r>
-        <w:rPr>
-          <w:b/>
-          <w:bCs/>
-          <w:lang w:val="en-US"/>
-        </w:rPr>
-        <w:t xml:space="preserve"> </w:t>
+        <w:t xml:space="preserve">.gif -frames:v </w:t>
       </w:r>
       <w:r>
         <w:rPr>
@@ -3197,7 +3077,7 @@
           <w:lang w:val="en-US"/>
         </w:rPr>
       </w:pPr>
-      <w:bookmarkStart w:id="10" w:name="_Toc239345197"/>
+      <w:bookmarkStart w:id="10" w:name="_Toc239345949"/>
       <w:r>
         <w:rPr>
           <w:lang w:val="en-US"/>
@@ -3288,7 +3168,7 @@
           <w:lang w:val="en-US"/>
         </w:rPr>
       </w:pPr>
-      <w:bookmarkStart w:id="11" w:name="_Toc239345198"/>
+      <w:bookmarkStart w:id="11" w:name="_Toc239345950"/>
       <w:r>
         <w:rPr>
           <w:lang w:val="en-US"/>
@@ -3513,7 +3393,7 @@
           <w:lang w:val="en-US"/>
         </w:rPr>
       </w:pPr>
-      <w:bookmarkStart w:id="12" w:name="_Toc239345199"/>
+      <w:bookmarkStart w:id="12" w:name="_Toc239345951"/>
       <w:r>
         <w:rPr>
           <w:lang w:val="en-US"/>
@@ -3530,7 +3410,7 @@
           <w:lang w:val="en-US"/>
         </w:rPr>
       </w:pPr>
-      <w:bookmarkStart w:id="13" w:name="_Toc239345200"/>
+      <w:bookmarkStart w:id="13" w:name="_Toc239345952"/>
       <w:r>
         <w:rPr>
           <w:lang w:val="en-US"/>
@@ -3549,23 +3429,8 @@
         <w:rPr>
           <w:lang w:val="en-US"/>
         </w:rPr>
-        <w:t>-Use ‘</w:t>
-      </w:r>
-      <w:proofErr w:type="spellStart"/>
-      <w:r>
-        <w:rPr>
-          <w:lang w:val="en-US"/>
-        </w:rPr>
-        <w:t>pandoc</w:t>
-      </w:r>
-      <w:proofErr w:type="spellEnd"/>
-      <w:r>
-        <w:rPr>
-          <w:lang w:val="en-US"/>
-        </w:rPr>
-        <w:t xml:space="preserve">’ to convert a DOCX to a .txt and pipe it directly to </w:t>
-      </w:r>
-      <w:proofErr w:type="spellStart"/>
+        <w:t xml:space="preserve">-Use ‘pandoc’ to convert a DOCX to a .txt and pipe it directly to </w:t>
+      </w:r>
       <w:r>
         <w:rPr>
           <w:lang w:val="en-US"/>
@@ -3578,7 +3443,6 @@
         </w:rPr>
         <w:t>llama</w:t>
       </w:r>
-      <w:proofErr w:type="spellEnd"/>
       <w:r>
         <w:rPr>
           <w:lang w:val="en-US"/>
@@ -3595,7 +3459,6 @@
           <w:lang w:val="en-US"/>
         </w:rPr>
       </w:pPr>
-      <w:proofErr w:type="spellStart"/>
       <w:r>
         <w:rPr>
           <w:b/>
@@ -3610,16 +3473,7 @@
           <w:bCs/>
           <w:lang w:val="en-US"/>
         </w:rPr>
-        <w:t>andoc</w:t>
-      </w:r>
-      <w:proofErr w:type="spellEnd"/>
-      <w:r>
-        <w:rPr>
-          <w:b/>
-          <w:bCs/>
-          <w:lang w:val="en-US"/>
-        </w:rPr>
-        <w:t xml:space="preserve"> </w:t>
+        <w:t xml:space="preserve">andoc </w:t>
       </w:r>
       <w:r>
         <w:rPr>
@@ -3644,25 +3498,7 @@
           <w:bCs/>
           <w:lang w:val="en-US"/>
         </w:rPr>
-        <w:t xml:space="preserve">plain | </w:t>
-      </w:r>
-      <w:proofErr w:type="spellStart"/>
-      <w:r>
-        <w:rPr>
-          <w:b/>
-          <w:bCs/>
-          <w:lang w:val="en-US"/>
-        </w:rPr>
-        <w:t>ollama</w:t>
-      </w:r>
-      <w:proofErr w:type="spellEnd"/>
-      <w:r>
-        <w:rPr>
-          <w:b/>
-          <w:bCs/>
-          <w:lang w:val="en-US"/>
-        </w:rPr>
-        <w:t xml:space="preserve"> run gemma4:26b </w:t>
+        <w:t xml:space="preserve">plain | ollama run gemma4:26b </w:t>
       </w:r>
       <w:r>
         <w:rPr>
@@ -3733,7 +3569,7 @@
           <w:lang w:val="en-US"/>
         </w:rPr>
       </w:pPr>
-      <w:bookmarkStart w:id="14" w:name="_Toc239345201"/>
+      <w:bookmarkStart w:id="14" w:name="_Toc239345953"/>
       <w:r>
         <w:rPr>
           <w:lang w:val="en-US"/>
@@ -3752,62 +3588,24 @@
         <w:rPr>
           <w:lang w:val="en-US"/>
         </w:rPr>
-        <w:t>-Use ‘</w:t>
-      </w:r>
-      <w:proofErr w:type="spellStart"/>
-      <w:r>
-        <w:rPr>
-          <w:lang w:val="en-US"/>
-        </w:rPr>
-        <w:t>pandoc</w:t>
-      </w:r>
-      <w:proofErr w:type="spellEnd"/>
-      <w:r>
-        <w:rPr>
-          <w:lang w:val="en-US"/>
-        </w:rPr>
-        <w:t xml:space="preserve">’ to convert a PPTX to a .txt and pipe it directly to </w:t>
-      </w:r>
-      <w:proofErr w:type="spellStart"/>
-      <w:r>
-        <w:rPr>
-          <w:lang w:val="en-US"/>
-        </w:rPr>
-        <w:t>Ollama</w:t>
-      </w:r>
-      <w:proofErr w:type="spellEnd"/>
-      <w:r>
-        <w:rPr>
-          <w:lang w:val="en-US"/>
-        </w:rPr>
-        <w:t xml:space="preserve"> with |</w:t>
-      </w:r>
-    </w:p>
-    <w:p>
-      <w:pPr>
-        <w:rPr>
-          <w:b/>
-          <w:bCs/>
-          <w:lang w:val="en-US"/>
-        </w:rPr>
-      </w:pPr>
-      <w:proofErr w:type="spellStart"/>
-      <w:r>
-        <w:rPr>
-          <w:b/>
-          <w:bCs/>
-          <w:lang w:val="en-US"/>
-        </w:rPr>
-        <w:t>pandoc</w:t>
-      </w:r>
-      <w:proofErr w:type="spellEnd"/>
-      <w:r>
-        <w:rPr>
-          <w:b/>
-          <w:bCs/>
-          <w:lang w:val="en-US"/>
-        </w:rPr>
-        <w:t xml:space="preserve"> </w:t>
+        <w:t>-Use ‘pandoc’ to convert a PPTX to a .txt and pipe it directly to Ollama with |</w:t>
+      </w:r>
+    </w:p>
+    <w:p>
+      <w:pPr>
+        <w:rPr>
+          <w:b/>
+          <w:bCs/>
+          <w:lang w:val="en-US"/>
+        </w:rPr>
+      </w:pPr>
+      <w:r>
+        <w:rPr>
+          <w:b/>
+          <w:bCs/>
+          <w:lang w:val="en-US"/>
+        </w:rPr>
+        <w:t xml:space="preserve">pandoc </w:t>
       </w:r>
       <w:r>
         <w:rPr>
@@ -3824,25 +3622,7 @@
           <w:bCs/>
           <w:lang w:val="en-US"/>
         </w:rPr>
-        <w:t xml:space="preserve">.PPTX -t plain | </w:t>
-      </w:r>
-      <w:proofErr w:type="spellStart"/>
-      <w:r>
-        <w:rPr>
-          <w:b/>
-          <w:bCs/>
-          <w:lang w:val="en-US"/>
-        </w:rPr>
-        <w:t>ollama</w:t>
-      </w:r>
-      <w:proofErr w:type="spellEnd"/>
-      <w:r>
-        <w:rPr>
-          <w:b/>
-          <w:bCs/>
-          <w:lang w:val="en-US"/>
-        </w:rPr>
-        <w:t xml:space="preserve"> run gemma4:26b </w:t>
+        <w:t xml:space="preserve">.PPTX -t plain | ollama run gemma4:26b </w:t>
       </w:r>
       <w:r>
         <w:rPr>
@@ -3949,7 +3729,7 @@
           <w:lang w:val="en-US"/>
         </w:rPr>
       </w:pPr>
-      <w:bookmarkStart w:id="15" w:name="_Toc239345202"/>
+      <w:bookmarkStart w:id="15" w:name="_Toc239345954"/>
       <w:r>
         <w:rPr>
           <w:lang w:val="en-US"/>
@@ -3968,41 +3748,42 @@
         <w:rPr>
           <w:lang w:val="en-US"/>
         </w:rPr>
-        <w:t>-Use ‘</w:t>
-      </w:r>
-      <w:proofErr w:type="spellStart"/>
-      <w:r>
-        <w:rPr>
-          <w:lang w:val="en-US"/>
-        </w:rPr>
-        <w:t>ssconvert</w:t>
-      </w:r>
-      <w:proofErr w:type="spellEnd"/>
-      <w:r>
-        <w:rPr>
-          <w:lang w:val="en-US"/>
-        </w:rPr>
-        <w:t>’ to convert an XLSX to .txt</w:t>
-      </w:r>
-    </w:p>
-    <w:p>
-      <w:pPr>
-        <w:rPr>
-          <w:b/>
-          <w:bCs/>
-          <w:lang w:val="en-US"/>
-        </w:rPr>
-      </w:pPr>
-      <w:proofErr w:type="spellStart"/>
-      <w:r>
-        <w:rPr>
-          <w:b/>
-          <w:bCs/>
-          <w:lang w:val="en-US"/>
-        </w:rPr>
-        <w:t>ssconvert</w:t>
-      </w:r>
-      <w:proofErr w:type="spellEnd"/>
+        <w:t>-Use ‘ssconvert’ to convert an XLSX to .txt</w:t>
+      </w:r>
+    </w:p>
+    <w:p>
+      <w:pPr>
+        <w:rPr>
+          <w:b/>
+          <w:bCs/>
+          <w:lang w:val="en-US"/>
+        </w:rPr>
+      </w:pPr>
+      <w:r>
+        <w:rPr>
+          <w:b/>
+          <w:bCs/>
+          <w:lang w:val="en-US"/>
+        </w:rPr>
+        <w:t xml:space="preserve">ssconvert </w:t>
+      </w:r>
+      <w:r>
+        <w:rPr>
+          <w:b/>
+          <w:bCs/>
+          <w:color w:val="47D459" w:themeColor="accent3" w:themeTint="99"/>
+          <w:lang w:val="en-US"/>
+        </w:rPr>
+        <w:t>file</w:t>
+      </w:r>
+      <w:r>
+        <w:rPr>
+          <w:b/>
+          <w:bCs/>
+          <w:lang w:val="en-US"/>
+        </w:rPr>
+        <w:t>.xlsx</w:t>
+      </w:r>
       <w:r>
         <w:rPr>
           <w:b/>
@@ -4026,23 +3807,58 @@
           <w:bCs/>
           <w:lang w:val="en-US"/>
         </w:rPr>
-        <w:t>.xlsx</w:t>
-      </w:r>
-      <w:r>
-        <w:rPr>
-          <w:b/>
-          <w:bCs/>
-          <w:lang w:val="en-US"/>
-        </w:rPr>
-        <w:t xml:space="preserve"> </w:t>
-      </w:r>
-      <w:r>
+        <w:t>.txt</w:t>
+      </w:r>
+    </w:p>
+    <w:p>
+      <w:pPr>
+        <w:rPr>
+          <w:lang w:val="en-US"/>
+        </w:rPr>
+      </w:pPr>
+      <w:r>
+        <w:rPr>
+          <w:lang w:val="en-US"/>
+        </w:rPr>
+        <w:t>-</w:t>
+      </w:r>
+      <w:r>
+        <w:rPr>
+          <w:lang w:val="en-US"/>
+        </w:rPr>
+        <w:t>T</w:t>
+      </w:r>
+      <w:r>
+        <w:rPr>
+          <w:lang w:val="en-US"/>
+        </w:rPr>
+        <w:t>hen either</w:t>
+      </w:r>
+    </w:p>
+    <w:p>
+      <w:pPr>
         <w:rPr>
           <w:b/>
           <w:bCs/>
           <w:color w:val="47D459" w:themeColor="accent3" w:themeTint="99"/>
           <w:lang w:val="en-US"/>
         </w:rPr>
+      </w:pPr>
+      <w:r>
+        <w:rPr>
+          <w:b/>
+          <w:bCs/>
+          <w:lang w:val="en-US"/>
+        </w:rPr>
+        <w:t xml:space="preserve">cat </w:t>
+      </w:r>
+      <w:r>
+        <w:rPr>
+          <w:b/>
+          <w:bCs/>
+          <w:color w:val="47D459" w:themeColor="accent3" w:themeTint="99"/>
+          <w:lang w:val="en-US"/>
+        </w:rPr>
         <w:t>file</w:t>
       </w:r>
       <w:r>
@@ -4051,85 +3867,7 @@
           <w:bCs/>
           <w:lang w:val="en-US"/>
         </w:rPr>
-        <w:t>.txt</w:t>
-      </w:r>
-    </w:p>
-    <w:p>
-      <w:pPr>
-        <w:rPr>
-          <w:lang w:val="en-US"/>
-        </w:rPr>
-      </w:pPr>
-      <w:r>
-        <w:rPr>
-          <w:lang w:val="en-US"/>
-        </w:rPr>
-        <w:t>-</w:t>
-      </w:r>
-      <w:r>
-        <w:rPr>
-          <w:lang w:val="en-US"/>
-        </w:rPr>
-        <w:t>T</w:t>
-      </w:r>
-      <w:r>
-        <w:rPr>
-          <w:lang w:val="en-US"/>
-        </w:rPr>
-        <w:t>hen either</w:t>
-      </w:r>
-    </w:p>
-    <w:p>
-      <w:pPr>
-        <w:rPr>
-          <w:b/>
-          <w:bCs/>
-          <w:color w:val="47D459" w:themeColor="accent3" w:themeTint="99"/>
-          <w:lang w:val="en-US"/>
-        </w:rPr>
-      </w:pPr>
-      <w:r>
-        <w:rPr>
-          <w:b/>
-          <w:bCs/>
-          <w:lang w:val="en-US"/>
-        </w:rPr>
-        <w:t xml:space="preserve">cat </w:t>
-      </w:r>
-      <w:r>
-        <w:rPr>
-          <w:b/>
-          <w:bCs/>
-          <w:color w:val="47D459" w:themeColor="accent3" w:themeTint="99"/>
-          <w:lang w:val="en-US"/>
-        </w:rPr>
-        <w:t>file</w:t>
-      </w:r>
-      <w:r>
-        <w:rPr>
-          <w:b/>
-          <w:bCs/>
-          <w:lang w:val="en-US"/>
-        </w:rPr>
-        <w:t xml:space="preserve">.txt | </w:t>
-      </w:r>
-      <w:proofErr w:type="spellStart"/>
-      <w:r>
-        <w:rPr>
-          <w:b/>
-          <w:bCs/>
-          <w:lang w:val="en-US"/>
-        </w:rPr>
-        <w:t>ollama</w:t>
-      </w:r>
-      <w:proofErr w:type="spellEnd"/>
-      <w:r>
-        <w:rPr>
-          <w:b/>
-          <w:bCs/>
-          <w:lang w:val="en-US"/>
-        </w:rPr>
-        <w:t xml:space="preserve"> run gemma4:26b </w:t>
+        <w:t xml:space="preserve">.txt | ollama run gemma4:26b </w:t>
       </w:r>
       <w:r>
         <w:rPr>
@@ -4214,23 +3952,13 @@
           <w:lang w:val="en-US"/>
         </w:rPr>
       </w:pPr>
-      <w:proofErr w:type="spellStart"/>
-      <w:r>
-        <w:rPr>
-          <w:b/>
-          <w:bCs/>
-          <w:lang w:val="en-US"/>
-        </w:rPr>
-        <w:t>ollama</w:t>
-      </w:r>
-      <w:proofErr w:type="spellEnd"/>
-      <w:r>
-        <w:rPr>
-          <w:b/>
-          <w:bCs/>
-          <w:lang w:val="en-US"/>
-        </w:rPr>
-        <w:t xml:space="preserve"> run gemma4:26b </w:t>
+      <w:r>
+        <w:rPr>
+          <w:b/>
+          <w:bCs/>
+          <w:lang w:val="en-US"/>
+        </w:rPr>
+        <w:t xml:space="preserve">ollama run gemma4:26b </w:t>
       </w:r>
       <w:r>
         <w:rPr>
@@ -4343,6 +4071,7 @@
           <w:lang w:val="en-US"/>
         </w:rPr>
       </w:pPr>
+      <w:bookmarkStart w:id="16" w:name="_Toc239345955"/>
       <w:r>
         <w:rPr>
           <w:lang w:val="en-US"/>
@@ -4350,6 +4079,7 @@
         <w:lastRenderedPageBreak/>
         <w:t>Nmap</w:t>
       </w:r>
+      <w:bookmarkEnd w:id="16"/>
     </w:p>
     <w:p>
       <w:pPr>
@@ -4358,41 +4088,27 @@
           <w:lang w:val="en-US"/>
         </w:rPr>
       </w:pPr>
+      <w:bookmarkStart w:id="17" w:name="_Toc239345956"/>
       <w:r>
         <w:rPr>
           <w:lang w:val="en-US"/>
         </w:rPr>
         <w:t>XML</w:t>
       </w:r>
-    </w:p>
-    <w:p>
-      <w:pPr>
-        <w:rPr>
-          <w:lang w:val="en-US"/>
-        </w:rPr>
-      </w:pPr>
-      <w:proofErr w:type="gramStart"/>
-      <w:r>
-        <w:rPr>
-          <w:lang w:val="en-US"/>
-        </w:rPr>
-        <w:t>-‘</w:t>
-      </w:r>
-      <w:proofErr w:type="gramEnd"/>
-      <w:r>
-        <w:rPr>
-          <w:lang w:val="en-US"/>
-        </w:rPr>
-        <w:t xml:space="preserve">Cat’ the XML and pipe it directly into </w:t>
-      </w:r>
-      <w:proofErr w:type="spellStart"/>
-      <w:r>
-        <w:rPr>
-          <w:lang w:val="en-US"/>
-        </w:rPr>
-        <w:t>Ollama</w:t>
-      </w:r>
-      <w:proofErr w:type="spellEnd"/>
+      <w:bookmarkEnd w:id="17"/>
+    </w:p>
+    <w:p>
+      <w:pPr>
+        <w:rPr>
+          <w:lang w:val="en-US"/>
+        </w:rPr>
+      </w:pPr>
+      <w:r>
+        <w:rPr>
+          <w:lang w:val="en-US"/>
+        </w:rPr>
+        <w:t>-‘Cat’ the XML and pipe it directly into Ollama</w:t>
+      </w:r>
     </w:p>
     <w:p>
       <w:pPr>
@@ -4433,25 +4149,7 @@
           <w:bCs/>
           <w:lang w:val="en-US"/>
         </w:rPr>
-        <w:t xml:space="preserve">.xml | </w:t>
-      </w:r>
-      <w:proofErr w:type="spellStart"/>
-      <w:r>
-        <w:rPr>
-          <w:b/>
-          <w:bCs/>
-          <w:lang w:val="en-US"/>
-        </w:rPr>
-        <w:t>ollama</w:t>
-      </w:r>
-      <w:proofErr w:type="spellEnd"/>
-      <w:r>
-        <w:rPr>
-          <w:b/>
-          <w:bCs/>
-          <w:lang w:val="en-US"/>
-        </w:rPr>
-        <w:t xml:space="preserve"> run gemma4:26b </w:t>
+        <w:t xml:space="preserve">.xml | ollama run gemma4:26b </w:t>
       </w:r>
       <w:r>
         <w:rPr>
@@ -4498,6 +4196,7 @@
       </w:pPr>
       <w:r>
         <w:rPr>
+          <w:noProof/>
           <w:lang w:val="en-US"/>
         </w:rPr>
         <w:drawing>
@@ -4539,10 +4238,651 @@
     </w:p>
     <w:p>
       <w:pPr>
-        <w:rPr>
-          <w:lang w:val="en-US"/>
-        </w:rPr>
-      </w:pPr>
+        <w:pStyle w:val="Heading1"/>
+        <w:rPr>
+          <w:lang w:val="en-US"/>
+        </w:rPr>
+      </w:pPr>
+      <w:r>
+        <w:rPr>
+          <w:lang w:val="en-US"/>
+        </w:rPr>
+        <w:t>Wireshark</w:t>
+      </w:r>
+    </w:p>
+    <w:p>
+      <w:pPr>
+        <w:pStyle w:val="Heading2"/>
+        <w:rPr>
+          <w:lang w:val="en-US"/>
+        </w:rPr>
+      </w:pPr>
+      <w:r>
+        <w:rPr>
+          <w:lang w:val="en-US"/>
+        </w:rPr>
+        <w:t>Pcap</w:t>
+      </w:r>
+    </w:p>
+    <w:p>
+      <w:pPr>
+        <w:rPr>
+          <w:color w:val="EE0000"/>
+          <w:lang w:val="en-US"/>
+        </w:rPr>
+      </w:pPr>
+      <w:r>
+        <w:rPr>
+          <w:color w:val="EE0000"/>
+          <w:lang w:val="en-US"/>
+        </w:rPr>
+        <w:t>LIMITATIONS</w:t>
+      </w:r>
+    </w:p>
+    <w:p>
+      <w:pPr>
+        <w:rPr>
+          <w:lang w:val="en-US"/>
+        </w:rPr>
+      </w:pPr>
+      <w:r>
+        <w:rPr>
+          <w:lang w:val="en-US"/>
+        </w:rPr>
+        <w:t>-</w:t>
+      </w:r>
+      <w:r>
+        <w:rPr>
+          <w:lang w:val="en-US"/>
+        </w:rPr>
+        <w:t xml:space="preserve">PCAP Files are </w:t>
+      </w:r>
+      <w:r>
+        <w:rPr>
+          <w:lang w:val="en-US"/>
+        </w:rPr>
+        <w:t>LARGE and</w:t>
+      </w:r>
+      <w:r>
+        <w:rPr>
+          <w:lang w:val="en-US"/>
+        </w:rPr>
+        <w:t xml:space="preserve"> require incremental processing.</w:t>
+      </w:r>
+    </w:p>
+    <w:p>
+      <w:pPr>
+        <w:rPr>
+          <w:lang w:val="en-US"/>
+        </w:rPr>
+      </w:pPr>
+      <w:r>
+        <w:rPr>
+          <w:lang w:val="en-US"/>
+        </w:rPr>
+        <w:t>-Use ‘tshark’ to write the protocol hierarchy statistics</w:t>
+      </w:r>
+      <w:r>
+        <w:rPr>
+          <w:lang w:val="en-US"/>
+        </w:rPr>
+        <w:t>:</w:t>
+      </w:r>
+    </w:p>
+    <w:p>
+      <w:pPr>
+        <w:rPr>
+          <w:b/>
+          <w:bCs/>
+          <w:lang w:val="en-US"/>
+        </w:rPr>
+      </w:pPr>
+      <w:r>
+        <w:rPr>
+          <w:b/>
+          <w:bCs/>
+          <w:lang w:val="en-US"/>
+        </w:rPr>
+        <w:t xml:space="preserve">tshark -r </w:t>
+      </w:r>
+      <w:r>
+        <w:rPr>
+          <w:b/>
+          <w:bCs/>
+          <w:color w:val="47D459" w:themeColor="accent3" w:themeTint="99"/>
+          <w:lang w:val="en-US"/>
+        </w:rPr>
+        <w:t>evidence01</w:t>
+      </w:r>
+      <w:r>
+        <w:rPr>
+          <w:b/>
+          <w:bCs/>
+          <w:lang w:val="en-US"/>
+        </w:rPr>
+        <w:t>.pcap -q -z io,phs</w:t>
+      </w:r>
+      <w:r>
+        <w:rPr>
+          <w:b/>
+          <w:bCs/>
+          <w:lang w:val="en-US"/>
+        </w:rPr>
+        <w:t xml:space="preserve"> &gt; </w:t>
+      </w:r>
+      <w:r>
+        <w:rPr>
+          <w:b/>
+          <w:bCs/>
+          <w:color w:val="47D459" w:themeColor="accent3" w:themeTint="99"/>
+          <w:lang w:val="en-US"/>
+        </w:rPr>
+        <w:t>overview</w:t>
+      </w:r>
+      <w:r>
+        <w:rPr>
+          <w:b/>
+          <w:bCs/>
+          <w:lang w:val="en-US"/>
+        </w:rPr>
+        <w:t>.txt</w:t>
+      </w:r>
+    </w:p>
+    <w:p>
+      <w:pPr>
+        <w:rPr>
+          <w:b/>
+          <w:bCs/>
+          <w:lang w:val="en-US"/>
+        </w:rPr>
+      </w:pPr>
+      <w:r>
+        <w:rPr>
+          <w:b/>
+          <w:bCs/>
+          <w:lang w:val="en-US"/>
+        </w:rPr>
+        <w:drawing>
+          <wp:inline distT="0" distB="0" distL="0" distR="0" wp14:anchorId="42FA5100" wp14:editId="18024C9C">
+            <wp:extent cx="4525006" cy="428685"/>
+            <wp:effectExtent l="0" t="0" r="0" b="9525"/>
+            <wp:docPr id="1831401178" name="Picture 1"/>
+            <wp:cNvGraphicFramePr>
+              <a:graphicFrameLocks xmlns:a="http://schemas.openxmlformats.org/drawingml/2006/main" noChangeAspect="1"/>
+            </wp:cNvGraphicFramePr>
+            <a:graphic xmlns:a="http://schemas.openxmlformats.org/drawingml/2006/main">
+              <a:graphicData uri="http://schemas.openxmlformats.org/drawingml/2006/picture">
+                <pic:pic xmlns:pic="http://schemas.openxmlformats.org/drawingml/2006/picture">
+                  <pic:nvPicPr>
+                    <pic:cNvPr id="1831401178" name=""/>
+                    <pic:cNvPicPr/>
+                  </pic:nvPicPr>
+                  <pic:blipFill>
+                    <a:blip r:embed="rId22"/>
+                    <a:stretch>
+                      <a:fillRect/>
+                    </a:stretch>
+                  </pic:blipFill>
+                  <pic:spPr>
+                    <a:xfrm>
+                      <a:off x="0" y="0"/>
+                      <a:ext cx="4525006" cy="428685"/>
+                    </a:xfrm>
+                    <a:prstGeom prst="rect">
+                      <a:avLst/>
+                    </a:prstGeom>
+                  </pic:spPr>
+                </pic:pic>
+              </a:graphicData>
+            </a:graphic>
+          </wp:inline>
+        </w:drawing>
+      </w:r>
+    </w:p>
+    <w:p>
+      <w:pPr>
+        <w:rPr>
+          <w:lang w:val="en-US"/>
+        </w:rPr>
+      </w:pPr>
+      <w:r>
+        <w:rPr>
+          <w:lang w:val="en-US"/>
+        </w:rPr>
+        <w:t>-</w:t>
+      </w:r>
+      <w:r>
+        <w:rPr>
+          <w:lang w:val="en-US"/>
+        </w:rPr>
+        <w:t>append the ip conversations into the same file</w:t>
+      </w:r>
+      <w:r>
+        <w:rPr>
+          <w:lang w:val="en-US"/>
+        </w:rPr>
+        <w:t>:</w:t>
+      </w:r>
+    </w:p>
+    <w:p>
+      <w:pPr>
+        <w:rPr>
+          <w:b/>
+          <w:bCs/>
+          <w:lang w:val="en-US"/>
+        </w:rPr>
+      </w:pPr>
+      <w:r>
+        <w:rPr>
+          <w:b/>
+          <w:bCs/>
+          <w:lang w:val="en-US"/>
+        </w:rPr>
+        <w:t xml:space="preserve">tshark -r </w:t>
+      </w:r>
+      <w:r>
+        <w:rPr>
+          <w:b/>
+          <w:bCs/>
+          <w:color w:val="47D459" w:themeColor="accent3" w:themeTint="99"/>
+          <w:lang w:val="en-US"/>
+        </w:rPr>
+        <w:t>evidence01</w:t>
+      </w:r>
+      <w:r>
+        <w:rPr>
+          <w:b/>
+          <w:bCs/>
+          <w:lang w:val="en-US"/>
+        </w:rPr>
+        <w:t xml:space="preserve">.pcap -q -z </w:t>
+      </w:r>
+      <w:r>
+        <w:rPr>
+          <w:b/>
+          <w:bCs/>
+          <w:lang w:val="en-US"/>
+        </w:rPr>
+        <w:t>conv</w:t>
+      </w:r>
+      <w:r>
+        <w:rPr>
+          <w:b/>
+          <w:bCs/>
+          <w:lang w:val="en-US"/>
+        </w:rPr>
+        <w:t>,</w:t>
+      </w:r>
+      <w:r>
+        <w:rPr>
+          <w:b/>
+          <w:bCs/>
+          <w:lang w:val="en-US"/>
+        </w:rPr>
+        <w:t>ip</w:t>
+      </w:r>
+      <w:r>
+        <w:rPr>
+          <w:b/>
+          <w:bCs/>
+          <w:lang w:val="en-US"/>
+        </w:rPr>
+        <w:t xml:space="preserve"> &gt;</w:t>
+      </w:r>
+      <w:r>
+        <w:rPr>
+          <w:b/>
+          <w:bCs/>
+          <w:lang w:val="en-US"/>
+        </w:rPr>
+        <w:t>&gt;</w:t>
+      </w:r>
+      <w:r>
+        <w:rPr>
+          <w:b/>
+          <w:bCs/>
+          <w:lang w:val="en-US"/>
+        </w:rPr>
+        <w:t xml:space="preserve"> </w:t>
+      </w:r>
+      <w:r>
+        <w:rPr>
+          <w:b/>
+          <w:bCs/>
+          <w:color w:val="47D459" w:themeColor="accent3" w:themeTint="99"/>
+          <w:lang w:val="en-US"/>
+        </w:rPr>
+        <w:t>overview</w:t>
+      </w:r>
+      <w:r>
+        <w:rPr>
+          <w:b/>
+          <w:bCs/>
+          <w:lang w:val="en-US"/>
+        </w:rPr>
+        <w:t>.txt</w:t>
+      </w:r>
+    </w:p>
+    <w:p>
+      <w:pPr>
+        <w:rPr>
+          <w:b/>
+          <w:bCs/>
+          <w:lang w:val="en-US"/>
+        </w:rPr>
+      </w:pPr>
+      <w:r>
+        <w:rPr>
+          <w:b/>
+          <w:bCs/>
+          <w:lang w:val="en-US"/>
+        </w:rPr>
+        <w:drawing>
+          <wp:inline distT="0" distB="0" distL="0" distR="0" wp14:anchorId="1A993F29" wp14:editId="0418D4A0">
+            <wp:extent cx="4658375" cy="438211"/>
+            <wp:effectExtent l="0" t="0" r="8890" b="0"/>
+            <wp:docPr id="1871649328" name="Picture 1"/>
+            <wp:cNvGraphicFramePr>
+              <a:graphicFrameLocks xmlns:a="http://schemas.openxmlformats.org/drawingml/2006/main" noChangeAspect="1"/>
+            </wp:cNvGraphicFramePr>
+            <a:graphic xmlns:a="http://schemas.openxmlformats.org/drawingml/2006/main">
+              <a:graphicData uri="http://schemas.openxmlformats.org/drawingml/2006/picture">
+                <pic:pic xmlns:pic="http://schemas.openxmlformats.org/drawingml/2006/picture">
+                  <pic:nvPicPr>
+                    <pic:cNvPr id="1871649328" name=""/>
+                    <pic:cNvPicPr/>
+                  </pic:nvPicPr>
+                  <pic:blipFill>
+                    <a:blip r:embed="rId23"/>
+                    <a:stretch>
+                      <a:fillRect/>
+                    </a:stretch>
+                  </pic:blipFill>
+                  <pic:spPr>
+                    <a:xfrm>
+                      <a:off x="0" y="0"/>
+                      <a:ext cx="4658375" cy="438211"/>
+                    </a:xfrm>
+                    <a:prstGeom prst="rect">
+                      <a:avLst/>
+                    </a:prstGeom>
+                  </pic:spPr>
+                </pic:pic>
+              </a:graphicData>
+            </a:graphic>
+          </wp:inline>
+        </w:drawing>
+      </w:r>
+    </w:p>
+    <w:p>
+      <w:pPr>
+        <w:rPr>
+          <w:lang w:val="en-US"/>
+        </w:rPr>
+      </w:pPr>
+      <w:r>
+        <w:rPr>
+          <w:lang w:val="en-US"/>
+        </w:rPr>
+        <w:t>-You can then cat the combined file to give the AI an overview of the traffic without wasting context length</w:t>
+      </w:r>
+    </w:p>
+    <w:p>
+      <w:pPr>
+        <w:rPr>
+          <w:b/>
+          <w:bCs/>
+          <w:lang w:val="en-US"/>
+        </w:rPr>
+      </w:pPr>
+      <w:r>
+        <w:rPr>
+          <w:b/>
+          <w:bCs/>
+          <w:lang w:val="en-US"/>
+        </w:rPr>
+        <w:t xml:space="preserve">cat </w:t>
+      </w:r>
+      <w:r>
+        <w:rPr>
+          <w:b/>
+          <w:bCs/>
+          <w:color w:val="47D459" w:themeColor="accent3" w:themeTint="99"/>
+          <w:lang w:val="en-US"/>
+        </w:rPr>
+        <w:t>overview</w:t>
+      </w:r>
+      <w:r>
+        <w:rPr>
+          <w:b/>
+          <w:bCs/>
+          <w:lang w:val="en-US"/>
+        </w:rPr>
+        <w:t xml:space="preserve">.txt | ollama run gemma4:26b </w:t>
+      </w:r>
+      <w:r>
+        <w:rPr>
+          <w:b/>
+          <w:bCs/>
+          <w:color w:val="47D459" w:themeColor="accent3" w:themeTint="99"/>
+          <w:lang w:val="en-US"/>
+        </w:rPr>
+        <w:t xml:space="preserve">where should we go next in the </w:t>
+      </w:r>
+      <w:r>
+        <w:rPr>
+          <w:b/>
+          <w:bCs/>
+          <w:color w:val="47D459" w:themeColor="accent3" w:themeTint="99"/>
+          <w:lang w:val="en-US"/>
+        </w:rPr>
+        <w:t>P</w:t>
+      </w:r>
+      <w:r>
+        <w:rPr>
+          <w:b/>
+          <w:bCs/>
+          <w:color w:val="47D459" w:themeColor="accent3" w:themeTint="99"/>
+          <w:lang w:val="en-US"/>
+        </w:rPr>
+        <w:t>cap investigation?</w:t>
+      </w:r>
+    </w:p>
+    <w:p>
+      <w:pPr>
+        <w:rPr>
+          <w:lang w:val="en-US"/>
+        </w:rPr>
+      </w:pPr>
+      <w:r>
+        <w:rPr>
+          <w:lang w:val="en-US"/>
+        </w:rPr>
+        <w:drawing>
+          <wp:inline distT="0" distB="0" distL="0" distR="0" wp14:anchorId="50AEEA75" wp14:editId="6CAAAE82">
+            <wp:extent cx="5731510" cy="485140"/>
+            <wp:effectExtent l="0" t="0" r="2540" b="0"/>
+            <wp:docPr id="1413420666" name="Picture 1"/>
+            <wp:cNvGraphicFramePr>
+              <a:graphicFrameLocks xmlns:a="http://schemas.openxmlformats.org/drawingml/2006/main" noChangeAspect="1"/>
+            </wp:cNvGraphicFramePr>
+            <a:graphic xmlns:a="http://schemas.openxmlformats.org/drawingml/2006/main">
+              <a:graphicData uri="http://schemas.openxmlformats.org/drawingml/2006/picture">
+                <pic:pic xmlns:pic="http://schemas.openxmlformats.org/drawingml/2006/picture">
+                  <pic:nvPicPr>
+                    <pic:cNvPr id="1413420666" name=""/>
+                    <pic:cNvPicPr/>
+                  </pic:nvPicPr>
+                  <pic:blipFill>
+                    <a:blip r:embed="rId24"/>
+                    <a:stretch>
+                      <a:fillRect/>
+                    </a:stretch>
+                  </pic:blipFill>
+                  <pic:spPr>
+                    <a:xfrm>
+                      <a:off x="0" y="0"/>
+                      <a:ext cx="5731510" cy="485140"/>
+                    </a:xfrm>
+                    <a:prstGeom prst="rect">
+                      <a:avLst/>
+                    </a:prstGeom>
+                  </pic:spPr>
+                </pic:pic>
+              </a:graphicData>
+            </a:graphic>
+          </wp:inline>
+        </w:drawing>
+      </w:r>
+    </w:p>
+    <w:p>
+      <w:pPr>
+        <w:rPr>
+          <w:lang w:val="en-US"/>
+        </w:rPr>
+      </w:pPr>
+    </w:p>
+    <w:p>
+      <w:pPr>
+        <w:rPr>
+          <w:lang w:val="en-US"/>
+        </w:rPr>
+      </w:pPr>
+    </w:p>
+    <w:p>
+      <w:pPr>
+        <w:rPr>
+          <w:lang w:val="en-US"/>
+        </w:rPr>
+      </w:pPr>
+    </w:p>
+    <w:p>
+      <w:pPr>
+        <w:rPr>
+          <w:lang w:val="en-US"/>
+        </w:rPr>
+      </w:pPr>
+      <w:r>
+        <w:rPr>
+          <w:lang w:val="en-US"/>
+        </w:rPr>
+        <w:lastRenderedPageBreak/>
+        <w:t>-If given a particular service/protocol to inspect from that output, you can filter the packets by protocol with the -Y flag</w:t>
+      </w:r>
+      <w:r>
+        <w:rPr>
+          <w:lang w:val="en-US"/>
+        </w:rPr>
+        <w:t>, ofcourse we want to automate the selection of these protocols.</w:t>
+      </w:r>
+    </w:p>
+    <w:p>
+      <w:pPr>
+        <w:rPr>
+          <w:b/>
+          <w:bCs/>
+          <w:color w:val="47D459" w:themeColor="accent3" w:themeTint="99"/>
+          <w:lang w:val="en-US"/>
+        </w:rPr>
+      </w:pPr>
+      <w:r>
+        <w:rPr>
+          <w:b/>
+          <w:bCs/>
+          <w:lang w:val="en-US"/>
+        </w:rPr>
+        <w:t xml:space="preserve">Tshark -r </w:t>
+      </w:r>
+      <w:r>
+        <w:rPr>
+          <w:b/>
+          <w:bCs/>
+          <w:color w:val="47D459" w:themeColor="accent3" w:themeTint="99"/>
+          <w:lang w:val="en-US"/>
+        </w:rPr>
+        <w:t>evidence01</w:t>
+      </w:r>
+      <w:r>
+        <w:rPr>
+          <w:b/>
+          <w:bCs/>
+          <w:lang w:val="en-US"/>
+        </w:rPr>
+        <w:t>.pcap -Y “</w:t>
+      </w:r>
+      <w:r>
+        <w:rPr>
+          <w:b/>
+          <w:bCs/>
+          <w:color w:val="47D459" w:themeColor="accent3" w:themeTint="99"/>
+          <w:lang w:val="en-US"/>
+        </w:rPr>
+        <w:t>smtp</w:t>
+      </w:r>
+      <w:r>
+        <w:rPr>
+          <w:b/>
+          <w:bCs/>
+          <w:lang w:val="en-US"/>
+        </w:rPr>
+        <w:t xml:space="preserve">” | ollama run gemma4:26b </w:t>
+      </w:r>
+      <w:r>
+        <w:rPr>
+          <w:b/>
+          <w:bCs/>
+          <w:color w:val="47D459" w:themeColor="accent3" w:themeTint="99"/>
+          <w:lang w:val="en-US"/>
+        </w:rPr>
+        <w:t>find forensic insights</w:t>
+      </w:r>
+    </w:p>
+    <w:p>
+      <w:pPr>
+        <w:rPr>
+          <w:lang w:val="en-US"/>
+        </w:rPr>
+      </w:pPr>
+      <w:r>
+        <w:rPr>
+          <w:lang w:val="en-US"/>
+        </w:rPr>
+        <w:drawing>
+          <wp:inline distT="0" distB="0" distL="0" distR="0" wp14:anchorId="090E3751" wp14:editId="0DAA3574">
+            <wp:extent cx="6208386" cy="438150"/>
+            <wp:effectExtent l="0" t="0" r="2540" b="0"/>
+            <wp:docPr id="1368936514" name="Picture 1"/>
+            <wp:cNvGraphicFramePr>
+              <a:graphicFrameLocks xmlns:a="http://schemas.openxmlformats.org/drawingml/2006/main" noChangeAspect="1"/>
+            </wp:cNvGraphicFramePr>
+            <a:graphic xmlns:a="http://schemas.openxmlformats.org/drawingml/2006/main">
+              <a:graphicData uri="http://schemas.openxmlformats.org/drawingml/2006/picture">
+                <pic:pic xmlns:pic="http://schemas.openxmlformats.org/drawingml/2006/picture">
+                  <pic:nvPicPr>
+                    <pic:cNvPr id="1368936514" name=""/>
+                    <pic:cNvPicPr/>
+                  </pic:nvPicPr>
+                  <pic:blipFill>
+                    <a:blip r:embed="rId25"/>
+                    <a:stretch>
+                      <a:fillRect/>
+                    </a:stretch>
+                  </pic:blipFill>
+                  <pic:spPr>
+                    <a:xfrm>
+                      <a:off x="0" y="0"/>
+                      <a:ext cx="6212549" cy="438444"/>
+                    </a:xfrm>
+                    <a:prstGeom prst="rect">
+                      <a:avLst/>
+                    </a:prstGeom>
+                  </pic:spPr>
+                </pic:pic>
+              </a:graphicData>
+            </a:graphic>
+          </wp:inline>
+        </w:drawing>
+      </w:r>
     </w:p>
     <w:p>
       <w:pPr>
@@ -4571,10 +4911,11 @@
 <file path=word/numbering.xml><?xml version="1.0" encoding="utf-8"?>
 <w:numbering xmlns:wpc="http://schemas.microsoft.com/office/word/2010/wordprocessingCanvas" xmlns:cx="http://schemas.microsoft.com/office/drawing/2014/chartex" xmlns:cx1="http://schemas.microsoft.com/office/drawing/2015/9/8/chartex" xmlns:cx2="http://schemas.microsoft.com/office/drawing/2015/10/21/chartex" xmlns:cx3="http://schemas.microsoft.com/office/drawing/2016/5/9/chartex" xmlns:cx4="http://schemas.microsoft.com/office/drawing/2016/5/10/chartex" xmlns:cx5="http://schemas.microsoft.com/office/drawing/2016/5/11/chartex" xmlns:cx6="http://schemas.microsoft.com/office/drawing/2016/5/12/chartex" xmlns:cx7="http://schemas.microsoft.com/office/drawing/2016/5/13/chartex" xmlns:cx8="http://schemas.microsoft.com/office/drawing/2016/5/14/chartex" xmlns:mc="http://schemas.openxmlformats.org/markup-compatibility/2006" xmlns:aink="http://schemas.microsoft.com/office/drawing/2016/ink" xmlns:am3d="http://schemas.microsoft.com/office/drawing/2017/model3d" xmlns:o="urn:schemas-microsoft-com:office:office" xmlns:oel="http://schemas.microsoft.com/office/2019/extlst" xmlns:r="http://schemas.openxmlformats.org/officeDocument/2006/relationships" xmlns:m="http://schemas.openxmlformats.org/officeDocument/2006/math" xmlns:v="urn:schemas-microsoft-com:vml" xmlns:wp14="http://schemas.microsoft.com/office/word/2010/wordprocessingDrawing" xmlns:wp="http://schemas.openxmlformats.org/drawingml/2006/wordprocessingDrawing" xmlns:w10="urn:schemas-microsoft-com:office:word" xmlns:w="http://schemas.openxmlformats.org/wordprocessingml/2006/main" xmlns:w14="http://schemas.microsoft.com/office/word/2010/wordml" xmlns:w15="http://schemas.microsoft.com/office/word/2012/wordml" xmlns:w16cex="http://schemas.microsoft.com/office/word/2018/wordml/cex" xmlns:w16cid="http://schemas.microsoft.com/office/word/2016/wordml/cid" xmlns:w16="http://schemas.microsoft.com/office/word/2018/wordml" xmlns:w16du="http://schemas.microsoft.com/office/word/2023/wordml/word16du" xmlns:w16sdtdh="http://schemas.microsoft.com/office/word/2020/wordml/sdtdatahash" xmlns:w16sdtfl="http://schemas.microsoft.com/office/word/2024/wordml/sdtformatlock" xmlns:w16se="http://schemas.microsoft.com/office/word/2015/wordml/symex" xmlns:wpg="http://schemas.microsoft.com/office/word/2010/wordprocessingGroup" xmlns:wpi="http://schemas.microsoft.com/office/word/2010/wordprocessingInk" xmlns:wne="http://schemas.microsoft.com/office/word/2006/wordml" xmlns:wps="http://schemas.microsoft.com/office/word/2010/wordprocessingShape" mc:Ignorable="w14 w15 w16se w16cid w16 w16cex w16sdtdh w16sdtfl w16du wp14">
   <w:abstractNum w:abstractNumId="0" w15:restartNumberingAfterBreak="0">
-    <w:nsid w:val="26E97CE7"/>
+    <w:nsid w:val="10471585"/>
     <w:multiLevelType w:val="hybridMultilevel"/>
-    <w:tmpl w:val="1B50312A"/>
-    <w:lvl w:ilvl="0" w:tplc="A3604114">
+    <w:tmpl w:val="B9BE41FE"/>
+    <w:lvl w:ilvl="0" w:tplc="DA8A928E">
+      <w:start w:val="10"/>
       <w:numFmt w:val="bullet"/>
       <w:lvlText w:val="-"/>
       <w:lvlJc w:val="left"/>
@@ -4683,11 +5024,10 @@
     </w:lvl>
   </w:abstractNum>
   <w:abstractNum w:abstractNumId="1" w15:restartNumberingAfterBreak="0">
-    <w:nsid w:val="2C823C59"/>
+    <w:nsid w:val="26E97CE7"/>
     <w:multiLevelType w:val="hybridMultilevel"/>
-    <w:tmpl w:val="37FE686C"/>
-    <w:lvl w:ilvl="0" w:tplc="C55A8664">
-      <w:start w:val="2"/>
+    <w:tmpl w:val="1B50312A"/>
+    <w:lvl w:ilvl="0" w:tplc="A3604114">
       <w:numFmt w:val="bullet"/>
       <w:lvlText w:val="-"/>
       <w:lvlJc w:val="left"/>
@@ -4796,10 +5136,10 @@
     </w:lvl>
   </w:abstractNum>
   <w:abstractNum w:abstractNumId="2" w15:restartNumberingAfterBreak="0">
-    <w:nsid w:val="61F25AD8"/>
+    <w:nsid w:val="2C823C59"/>
     <w:multiLevelType w:val="hybridMultilevel"/>
-    <w:tmpl w:val="12CEDAC6"/>
-    <w:lvl w:ilvl="0" w:tplc="4E04755E">
+    <w:tmpl w:val="37FE686C"/>
+    <w:lvl w:ilvl="0" w:tplc="C55A8664">
       <w:start w:val="2"/>
       <w:numFmt w:val="bullet"/>
       <w:lvlText w:val="-"/>
@@ -4909,10 +5249,10 @@
     </w:lvl>
   </w:abstractNum>
   <w:abstractNum w:abstractNumId="3" w15:restartNumberingAfterBreak="0">
-    <w:nsid w:val="778A3759"/>
+    <w:nsid w:val="61F25AD8"/>
     <w:multiLevelType w:val="hybridMultilevel"/>
-    <w:tmpl w:val="E870BBB0"/>
-    <w:lvl w:ilvl="0" w:tplc="A104C756">
+    <w:tmpl w:val="12CEDAC6"/>
+    <w:lvl w:ilvl="0" w:tplc="4E04755E">
       <w:start w:val="2"/>
       <w:numFmt w:val="bullet"/>
       <w:lvlText w:val="-"/>
@@ -5021,17 +5361,133 @@
       </w:rPr>
     </w:lvl>
   </w:abstractNum>
+  <w:abstractNum w:abstractNumId="4" w15:restartNumberingAfterBreak="0">
+    <w:nsid w:val="778A3759"/>
+    <w:multiLevelType w:val="hybridMultilevel"/>
+    <w:tmpl w:val="E870BBB0"/>
+    <w:lvl w:ilvl="0" w:tplc="A104C756">
+      <w:start w:val="2"/>
+      <w:numFmt w:val="bullet"/>
+      <w:lvlText w:val="-"/>
+      <w:lvlJc w:val="left"/>
+      <w:pPr>
+        <w:ind w:left="720" w:hanging="360"/>
+      </w:pPr>
+      <w:rPr>
+        <w:rFonts w:ascii="Aptos" w:eastAsiaTheme="minorHAnsi" w:hAnsi="Aptos" w:cstheme="minorBidi" w:hint="default"/>
+      </w:rPr>
+    </w:lvl>
+    <w:lvl w:ilvl="1" w:tplc="14090003" w:tentative="1">
+      <w:start w:val="1"/>
+      <w:numFmt w:val="bullet"/>
+      <w:lvlText w:val="o"/>
+      <w:lvlJc w:val="left"/>
+      <w:pPr>
+        <w:ind w:left="1440" w:hanging="360"/>
+      </w:pPr>
+      <w:rPr>
+        <w:rFonts w:ascii="Courier New" w:hAnsi="Courier New" w:cs="Courier New" w:hint="default"/>
+      </w:rPr>
+    </w:lvl>
+    <w:lvl w:ilvl="2" w:tplc="14090005" w:tentative="1">
+      <w:start w:val="1"/>
+      <w:numFmt w:val="bullet"/>
+      <w:lvlText w:val=""/>
+      <w:lvlJc w:val="left"/>
+      <w:pPr>
+        <w:ind w:left="2160" w:hanging="360"/>
+      </w:pPr>
+      <w:rPr>
+        <w:rFonts w:ascii="Wingdings" w:hAnsi="Wingdings" w:hint="default"/>
+      </w:rPr>
+    </w:lvl>
+    <w:lvl w:ilvl="3" w:tplc="14090001" w:tentative="1">
+      <w:start w:val="1"/>
+      <w:numFmt w:val="bullet"/>
+      <w:lvlText w:val=""/>
+      <w:lvlJc w:val="left"/>
+      <w:pPr>
+        <w:ind w:left="2880" w:hanging="360"/>
+      </w:pPr>
+      <w:rPr>
+        <w:rFonts w:ascii="Symbol" w:hAnsi="Symbol" w:hint="default"/>
+      </w:rPr>
+    </w:lvl>
+    <w:lvl w:ilvl="4" w:tplc="14090003" w:tentative="1">
+      <w:start w:val="1"/>
+      <w:numFmt w:val="bullet"/>
+      <w:lvlText w:val="o"/>
+      <w:lvlJc w:val="left"/>
+      <w:pPr>
+        <w:ind w:left="3600" w:hanging="360"/>
+      </w:pPr>
+      <w:rPr>
+        <w:rFonts w:ascii="Courier New" w:hAnsi="Courier New" w:cs="Courier New" w:hint="default"/>
+      </w:rPr>
+    </w:lvl>
+    <w:lvl w:ilvl="5" w:tplc="14090005" w:tentative="1">
+      <w:start w:val="1"/>
+      <w:numFmt w:val="bullet"/>
+      <w:lvlText w:val=""/>
+      <w:lvlJc w:val="left"/>
+      <w:pPr>
+        <w:ind w:left="4320" w:hanging="360"/>
+      </w:pPr>
+      <w:rPr>
+        <w:rFonts w:ascii="Wingdings" w:hAnsi="Wingdings" w:hint="default"/>
+      </w:rPr>
+    </w:lvl>
+    <w:lvl w:ilvl="6" w:tplc="14090001" w:tentative="1">
+      <w:start w:val="1"/>
+      <w:numFmt w:val="bullet"/>
+      <w:lvlText w:val=""/>
+      <w:lvlJc w:val="left"/>
+      <w:pPr>
+        <w:ind w:left="5040" w:hanging="360"/>
+      </w:pPr>
+      <w:rPr>
+        <w:rFonts w:ascii="Symbol" w:hAnsi="Symbol" w:hint="default"/>
+      </w:rPr>
+    </w:lvl>
+    <w:lvl w:ilvl="7" w:tplc="14090003" w:tentative="1">
+      <w:start w:val="1"/>
+      <w:numFmt w:val="bullet"/>
+      <w:lvlText w:val="o"/>
+      <w:lvlJc w:val="left"/>
+      <w:pPr>
+        <w:ind w:left="5760" w:hanging="360"/>
+      </w:pPr>
+      <w:rPr>
+        <w:rFonts w:ascii="Courier New" w:hAnsi="Courier New" w:cs="Courier New" w:hint="default"/>
+      </w:rPr>
+    </w:lvl>
+    <w:lvl w:ilvl="8" w:tplc="14090005" w:tentative="1">
+      <w:start w:val="1"/>
+      <w:numFmt w:val="bullet"/>
+      <w:lvlText w:val=""/>
+      <w:lvlJc w:val="left"/>
+      <w:pPr>
+        <w:ind w:left="6480" w:hanging="360"/>
+      </w:pPr>
+      <w:rPr>
+        <w:rFonts w:ascii="Wingdings" w:hAnsi="Wingdings" w:hint="default"/>
+      </w:rPr>
+    </w:lvl>
+  </w:abstractNum>
   <w:num w:numId="1" w16cid:durableId="1140266764">
-    <w:abstractNumId w:val="0"/>
+    <w:abstractNumId w:val="1"/>
   </w:num>
   <w:num w:numId="2" w16cid:durableId="2037808572">
-    <w:abstractNumId w:val="1"/>
+    <w:abstractNumId w:val="2"/>
   </w:num>
   <w:num w:numId="3" w16cid:durableId="1909226655">
-    <w:abstractNumId w:val="2"/>
+    <w:abstractNumId w:val="3"/>
   </w:num>
   <w:num w:numId="4" w16cid:durableId="610867326">
-    <w:abstractNumId w:val="3"/>
+    <w:abstractNumId w:val="4"/>
+  </w:num>
+  <w:num w:numId="5" w16cid:durableId="967129457">
+    <w:abstractNumId w:val="0"/>
   </w:num>
 </w:numbering>
 </file>

</xml_diff>

<commit_message>
updated logs, updated file conversion/processing guide
</commit_message>
<xml_diff>
--- a/File Processing Guide v0.1.docx
+++ b/File Processing Guide v0.1.docx
@@ -9,7 +9,7 @@
           <w:lang w:val="en-US"/>
         </w:rPr>
       </w:pPr>
-      <w:bookmarkStart w:id="0" w:name="_Toc239345940"/>
+      <w:bookmarkStart w:id="0" w:name="_Toc239518449"/>
       <w:r>
         <w:rPr>
           <w:lang w:val="en-US"/>
@@ -52,7 +52,13 @@
         <w:rPr>
           <w:lang w:val="en-US"/>
         </w:rPr>
-        <w:t xml:space="preserve"> or produced by </w:t>
+        <w:t>,</w:t>
+      </w:r>
+      <w:r>
+        <w:rPr>
+          <w:lang w:val="en-US"/>
+        </w:rPr>
+        <w:t xml:space="preserve"> produced by </w:t>
       </w:r>
       <w:r>
         <w:rPr>
@@ -70,15 +76,47 @@
         <w:rPr>
           <w:lang w:val="en-US"/>
         </w:rPr>
-        <w:t xml:space="preserve"> into formats that can be fed into Ollama. </w:t>
-      </w:r>
-    </w:p>
-    <w:p>
-      <w:pPr>
-        <w:rPr>
-          <w:lang w:val="en-US"/>
-        </w:rPr>
-      </w:pPr>
+        <w:t xml:space="preserve">, or for packet analysis (Wireshark) </w:t>
+      </w:r>
+      <w:r>
+        <w:rPr>
+          <w:lang w:val="en-US"/>
+        </w:rPr>
+        <w:t xml:space="preserve">into formats that can be fed into </w:t>
+      </w:r>
+      <w:proofErr w:type="spellStart"/>
+      <w:r>
+        <w:rPr>
+          <w:lang w:val="en-US"/>
+        </w:rPr>
+        <w:t>Ollama</w:t>
+      </w:r>
+      <w:proofErr w:type="spellEnd"/>
+      <w:r>
+        <w:rPr>
+          <w:lang w:val="en-US"/>
+        </w:rPr>
+        <w:t xml:space="preserve">. </w:t>
+      </w:r>
+    </w:p>
+    <w:p>
+      <w:pPr>
+        <w:rPr>
+          <w:lang w:val="en-US"/>
+        </w:rPr>
+      </w:pPr>
+      <w:r>
+        <w:rPr>
+          <w:lang w:val="en-US"/>
+        </w:rPr>
+        <w:t xml:space="preserve">Also Includes how to convert E01 Disk images into </w:t>
+      </w:r>
+      <w:r>
+        <w:rPr>
+          <w:lang w:val="en-US"/>
+        </w:rPr>
+        <w:t>formats (DD/RAW) that can be fed into foremost.</w:t>
+      </w:r>
     </w:p>
     <w:p>
       <w:pPr>
@@ -295,7 +333,7 @@
           <w:r>
             <w:fldChar w:fldCharType="separate"/>
           </w:r>
-          <w:hyperlink w:anchor="_Toc239345940" w:history="1">
+          <w:hyperlink w:anchor="_Toc239518449" w:history="1">
             <w:r>
               <w:rPr>
                 <w:rStyle w:val="Hyperlink"/>
@@ -323,7 +361,7 @@
                 <w:noProof/>
                 <w:webHidden/>
               </w:rPr>
-              <w:instrText xml:space="preserve"> PAGEREF _Toc239345940 \h </w:instrText>
+              <w:instrText xml:space="preserve"> PAGEREF _Toc239518449 \h </w:instrText>
             </w:r>
             <w:r>
               <w:rPr>
@@ -366,7 +404,7 @@
               <w:lang w:eastAsia="en-NZ"/>
             </w:rPr>
           </w:pPr>
-          <w:hyperlink w:anchor="_Toc239345941" w:history="1">
+          <w:hyperlink w:anchor="_Toc239518450" w:history="1">
             <w:r>
               <w:rPr>
                 <w:rStyle w:val="Hyperlink"/>
@@ -394,7 +432,7 @@
                 <w:noProof/>
                 <w:webHidden/>
               </w:rPr>
-              <w:instrText xml:space="preserve"> PAGEREF _Toc239345941 \h </w:instrText>
+              <w:instrText xml:space="preserve"> PAGEREF _Toc239518450 \h </w:instrText>
             </w:r>
             <w:r>
               <w:rPr>
@@ -437,7 +475,7 @@
               <w:lang w:eastAsia="en-NZ"/>
             </w:rPr>
           </w:pPr>
-          <w:hyperlink w:anchor="_Toc239345942" w:history="1">
+          <w:hyperlink w:anchor="_Toc239518451" w:history="1">
             <w:r>
               <w:rPr>
                 <w:rStyle w:val="Hyperlink"/>
@@ -465,7 +503,7 @@
                 <w:noProof/>
                 <w:webHidden/>
               </w:rPr>
-              <w:instrText xml:space="preserve"> PAGEREF _Toc239345942 \h </w:instrText>
+              <w:instrText xml:space="preserve"> PAGEREF _Toc239518451 \h </w:instrText>
             </w:r>
             <w:r>
               <w:rPr>
@@ -508,7 +546,7 @@
               <w:lang w:eastAsia="en-NZ"/>
             </w:rPr>
           </w:pPr>
-          <w:hyperlink w:anchor="_Toc239345943" w:history="1">
+          <w:hyperlink w:anchor="_Toc239518452" w:history="1">
             <w:r>
               <w:rPr>
                 <w:rStyle w:val="Hyperlink"/>
@@ -536,7 +574,7 @@
                 <w:noProof/>
                 <w:webHidden/>
               </w:rPr>
-              <w:instrText xml:space="preserve"> PAGEREF _Toc239345943 \h </w:instrText>
+              <w:instrText xml:space="preserve"> PAGEREF _Toc239518452 \h </w:instrText>
             </w:r>
             <w:r>
               <w:rPr>
@@ -579,7 +617,7 @@
               <w:lang w:eastAsia="en-NZ"/>
             </w:rPr>
           </w:pPr>
-          <w:hyperlink w:anchor="_Toc239345944" w:history="1">
+          <w:hyperlink w:anchor="_Toc239518453" w:history="1">
             <w:r>
               <w:rPr>
                 <w:rStyle w:val="Hyperlink"/>
@@ -607,7 +645,7 @@
                 <w:noProof/>
                 <w:webHidden/>
               </w:rPr>
-              <w:instrText xml:space="preserve"> PAGEREF _Toc239345944 \h </w:instrText>
+              <w:instrText xml:space="preserve"> PAGEREF _Toc239518453 \h </w:instrText>
             </w:r>
             <w:r>
               <w:rPr>
@@ -650,7 +688,7 @@
               <w:lang w:eastAsia="en-NZ"/>
             </w:rPr>
           </w:pPr>
-          <w:hyperlink w:anchor="_Toc239345945" w:history="1">
+          <w:hyperlink w:anchor="_Toc239518454" w:history="1">
             <w:r>
               <w:rPr>
                 <w:rStyle w:val="Hyperlink"/>
@@ -678,7 +716,7 @@
                 <w:noProof/>
                 <w:webHidden/>
               </w:rPr>
-              <w:instrText xml:space="preserve"> PAGEREF _Toc239345945 \h </w:instrText>
+              <w:instrText xml:space="preserve"> PAGEREF _Toc239518454 \h </w:instrText>
             </w:r>
             <w:r>
               <w:rPr>
@@ -721,7 +759,7 @@
               <w:lang w:eastAsia="en-NZ"/>
             </w:rPr>
           </w:pPr>
-          <w:hyperlink w:anchor="_Toc239345946" w:history="1">
+          <w:hyperlink w:anchor="_Toc239518455" w:history="1">
             <w:r>
               <w:rPr>
                 <w:rStyle w:val="Hyperlink"/>
@@ -749,7 +787,7 @@
                 <w:noProof/>
                 <w:webHidden/>
               </w:rPr>
-              <w:instrText xml:space="preserve"> PAGEREF _Toc239345946 \h </w:instrText>
+              <w:instrText xml:space="preserve"> PAGEREF _Toc239518455 \h </w:instrText>
             </w:r>
             <w:r>
               <w:rPr>
@@ -792,7 +830,7 @@
               <w:lang w:eastAsia="en-NZ"/>
             </w:rPr>
           </w:pPr>
-          <w:hyperlink w:anchor="_Toc239345947" w:history="1">
+          <w:hyperlink w:anchor="_Toc239518456" w:history="1">
             <w:r>
               <w:rPr>
                 <w:rStyle w:val="Hyperlink"/>
@@ -820,7 +858,7 @@
                 <w:noProof/>
                 <w:webHidden/>
               </w:rPr>
-              <w:instrText xml:space="preserve"> PAGEREF _Toc239345947 \h </w:instrText>
+              <w:instrText xml:space="preserve"> PAGEREF _Toc239518456 \h </w:instrText>
             </w:r>
             <w:r>
               <w:rPr>
@@ -863,7 +901,7 @@
               <w:lang w:eastAsia="en-NZ"/>
             </w:rPr>
           </w:pPr>
-          <w:hyperlink w:anchor="_Toc239345948" w:history="1">
+          <w:hyperlink w:anchor="_Toc239518457" w:history="1">
             <w:r>
               <w:rPr>
                 <w:rStyle w:val="Hyperlink"/>
@@ -891,7 +929,7 @@
                 <w:noProof/>
                 <w:webHidden/>
               </w:rPr>
-              <w:instrText xml:space="preserve"> PAGEREF _Toc239345948 \h </w:instrText>
+              <w:instrText xml:space="preserve"> PAGEREF _Toc239518457 \h </w:instrText>
             </w:r>
             <w:r>
               <w:rPr>
@@ -934,7 +972,7 @@
               <w:lang w:eastAsia="en-NZ"/>
             </w:rPr>
           </w:pPr>
-          <w:hyperlink w:anchor="_Toc239345949" w:history="1">
+          <w:hyperlink w:anchor="_Toc239518458" w:history="1">
             <w:r>
               <w:rPr>
                 <w:rStyle w:val="Hyperlink"/>
@@ -962,7 +1000,7 @@
                 <w:noProof/>
                 <w:webHidden/>
               </w:rPr>
-              <w:instrText xml:space="preserve"> PAGEREF _Toc239345949 \h </w:instrText>
+              <w:instrText xml:space="preserve"> PAGEREF _Toc239518458 \h </w:instrText>
             </w:r>
             <w:r>
               <w:rPr>
@@ -1005,7 +1043,7 @@
               <w:lang w:eastAsia="en-NZ"/>
             </w:rPr>
           </w:pPr>
-          <w:hyperlink w:anchor="_Toc239345950" w:history="1">
+          <w:hyperlink w:anchor="_Toc239518459" w:history="1">
             <w:r>
               <w:rPr>
                 <w:rStyle w:val="Hyperlink"/>
@@ -1033,7 +1071,7 @@
                 <w:noProof/>
                 <w:webHidden/>
               </w:rPr>
-              <w:instrText xml:space="preserve"> PAGEREF _Toc239345950 \h </w:instrText>
+              <w:instrText xml:space="preserve"> PAGEREF _Toc239518459 \h </w:instrText>
             </w:r>
             <w:r>
               <w:rPr>
@@ -1076,7 +1114,7 @@
               <w:lang w:eastAsia="en-NZ"/>
             </w:rPr>
           </w:pPr>
-          <w:hyperlink w:anchor="_Toc239345951" w:history="1">
+          <w:hyperlink w:anchor="_Toc239518460" w:history="1">
             <w:r>
               <w:rPr>
                 <w:rStyle w:val="Hyperlink"/>
@@ -1104,7 +1142,7 @@
                 <w:noProof/>
                 <w:webHidden/>
               </w:rPr>
-              <w:instrText xml:space="preserve"> PAGEREF _Toc239345951 \h </w:instrText>
+              <w:instrText xml:space="preserve"> PAGEREF _Toc239518460 \h </w:instrText>
             </w:r>
             <w:r>
               <w:rPr>
@@ -1147,7 +1185,7 @@
               <w:lang w:eastAsia="en-NZ"/>
             </w:rPr>
           </w:pPr>
-          <w:hyperlink w:anchor="_Toc239345952" w:history="1">
+          <w:hyperlink w:anchor="_Toc239518461" w:history="1">
             <w:r>
               <w:rPr>
                 <w:rStyle w:val="Hyperlink"/>
@@ -1175,7 +1213,7 @@
                 <w:noProof/>
                 <w:webHidden/>
               </w:rPr>
-              <w:instrText xml:space="preserve"> PAGEREF _Toc239345952 \h </w:instrText>
+              <w:instrText xml:space="preserve"> PAGEREF _Toc239518461 \h </w:instrText>
             </w:r>
             <w:r>
               <w:rPr>
@@ -1218,7 +1256,7 @@
               <w:lang w:eastAsia="en-NZ"/>
             </w:rPr>
           </w:pPr>
-          <w:hyperlink w:anchor="_Toc239345953" w:history="1">
+          <w:hyperlink w:anchor="_Toc239518462" w:history="1">
             <w:r>
               <w:rPr>
                 <w:rStyle w:val="Hyperlink"/>
@@ -1246,7 +1284,7 @@
                 <w:noProof/>
                 <w:webHidden/>
               </w:rPr>
-              <w:instrText xml:space="preserve"> PAGEREF _Toc239345953 \h </w:instrText>
+              <w:instrText xml:space="preserve"> PAGEREF _Toc239518462 \h </w:instrText>
             </w:r>
             <w:r>
               <w:rPr>
@@ -1289,7 +1327,7 @@
               <w:lang w:eastAsia="en-NZ"/>
             </w:rPr>
           </w:pPr>
-          <w:hyperlink w:anchor="_Toc239345954" w:history="1">
+          <w:hyperlink w:anchor="_Toc239518463" w:history="1">
             <w:r>
               <w:rPr>
                 <w:rStyle w:val="Hyperlink"/>
@@ -1317,7 +1355,7 @@
                 <w:noProof/>
                 <w:webHidden/>
               </w:rPr>
-              <w:instrText xml:space="preserve"> PAGEREF _Toc239345954 \h </w:instrText>
+              <w:instrText xml:space="preserve"> PAGEREF _Toc239518463 \h </w:instrText>
             </w:r>
             <w:r>
               <w:rPr>
@@ -1360,7 +1398,7 @@
               <w:lang w:eastAsia="en-NZ"/>
             </w:rPr>
           </w:pPr>
-          <w:hyperlink w:anchor="_Toc239345955" w:history="1">
+          <w:hyperlink w:anchor="_Toc239518464" w:history="1">
             <w:r>
               <w:rPr>
                 <w:rStyle w:val="Hyperlink"/>
@@ -1388,7 +1426,7 @@
                 <w:noProof/>
                 <w:webHidden/>
               </w:rPr>
-              <w:instrText xml:space="preserve"> PAGEREF _Toc239345955 \h </w:instrText>
+              <w:instrText xml:space="preserve"> PAGEREF _Toc239518464 \h </w:instrText>
             </w:r>
             <w:r>
               <w:rPr>
@@ -1431,7 +1469,7 @@
               <w:lang w:eastAsia="en-NZ"/>
             </w:rPr>
           </w:pPr>
-          <w:hyperlink w:anchor="_Toc239345956" w:history="1">
+          <w:hyperlink w:anchor="_Toc239518465" w:history="1">
             <w:r>
               <w:rPr>
                 <w:rStyle w:val="Hyperlink"/>
@@ -1459,7 +1497,149 @@
                 <w:noProof/>
                 <w:webHidden/>
               </w:rPr>
-              <w:instrText xml:space="preserve"> PAGEREF _Toc239345956 \h </w:instrText>
+              <w:instrText xml:space="preserve"> PAGEREF _Toc239518465 \h </w:instrText>
+            </w:r>
+            <w:r>
+              <w:rPr>
+                <w:noProof/>
+                <w:webHidden/>
+              </w:rPr>
+            </w:r>
+            <w:r>
+              <w:rPr>
+                <w:noProof/>
+                <w:webHidden/>
+              </w:rPr>
+              <w:fldChar w:fldCharType="separate"/>
+            </w:r>
+            <w:r>
+              <w:rPr>
+                <w:noProof/>
+                <w:webHidden/>
+              </w:rPr>
+              <w:t>8</w:t>
+            </w:r>
+            <w:r>
+              <w:rPr>
+                <w:noProof/>
+                <w:webHidden/>
+              </w:rPr>
+              <w:fldChar w:fldCharType="end"/>
+            </w:r>
+          </w:hyperlink>
+        </w:p>
+        <w:p>
+          <w:pPr>
+            <w:pStyle w:val="TOC1"/>
+            <w:tabs>
+              <w:tab w:val="right" w:leader="dot" w:pos="9016"/>
+            </w:tabs>
+            <w:rPr>
+              <w:rFonts w:eastAsiaTheme="minorEastAsia"/>
+              <w:noProof/>
+              <w:lang w:eastAsia="en-NZ"/>
+            </w:rPr>
+          </w:pPr>
+          <w:hyperlink w:anchor="_Toc239518466" w:history="1">
+            <w:r>
+              <w:rPr>
+                <w:rStyle w:val="Hyperlink"/>
+                <w:noProof/>
+                <w:lang w:val="en-US"/>
+              </w:rPr>
+              <w:t>Wireshark</w:t>
+            </w:r>
+            <w:r>
+              <w:rPr>
+                <w:noProof/>
+                <w:webHidden/>
+              </w:rPr>
+              <w:tab/>
+            </w:r>
+            <w:r>
+              <w:rPr>
+                <w:noProof/>
+                <w:webHidden/>
+              </w:rPr>
+              <w:fldChar w:fldCharType="begin"/>
+            </w:r>
+            <w:r>
+              <w:rPr>
+                <w:noProof/>
+                <w:webHidden/>
+              </w:rPr>
+              <w:instrText xml:space="preserve"> PAGEREF _Toc239518466 \h </w:instrText>
+            </w:r>
+            <w:r>
+              <w:rPr>
+                <w:noProof/>
+                <w:webHidden/>
+              </w:rPr>
+            </w:r>
+            <w:r>
+              <w:rPr>
+                <w:noProof/>
+                <w:webHidden/>
+              </w:rPr>
+              <w:fldChar w:fldCharType="separate"/>
+            </w:r>
+            <w:r>
+              <w:rPr>
+                <w:noProof/>
+                <w:webHidden/>
+              </w:rPr>
+              <w:t>8</w:t>
+            </w:r>
+            <w:r>
+              <w:rPr>
+                <w:noProof/>
+                <w:webHidden/>
+              </w:rPr>
+              <w:fldChar w:fldCharType="end"/>
+            </w:r>
+          </w:hyperlink>
+        </w:p>
+        <w:p>
+          <w:pPr>
+            <w:pStyle w:val="TOC2"/>
+            <w:tabs>
+              <w:tab w:val="right" w:leader="dot" w:pos="9016"/>
+            </w:tabs>
+            <w:rPr>
+              <w:rFonts w:eastAsiaTheme="minorEastAsia"/>
+              <w:noProof/>
+              <w:lang w:eastAsia="en-NZ"/>
+            </w:rPr>
+          </w:pPr>
+          <w:hyperlink w:anchor="_Toc239518467" w:history="1">
+            <w:r>
+              <w:rPr>
+                <w:rStyle w:val="Hyperlink"/>
+                <w:noProof/>
+                <w:lang w:val="en-US"/>
+              </w:rPr>
+              <w:t>Pcap</w:t>
+            </w:r>
+            <w:r>
+              <w:rPr>
+                <w:noProof/>
+                <w:webHidden/>
+              </w:rPr>
+              <w:tab/>
+            </w:r>
+            <w:r>
+              <w:rPr>
+                <w:noProof/>
+                <w:webHidden/>
+              </w:rPr>
+              <w:fldChar w:fldCharType="begin"/>
+            </w:r>
+            <w:r>
+              <w:rPr>
+                <w:noProof/>
+                <w:webHidden/>
+              </w:rPr>
+              <w:instrText xml:space="preserve"> PAGEREF _Toc239518467 \h </w:instrText>
             </w:r>
             <w:r>
               <w:rPr>
@@ -1586,12 +1766,11 @@
           <w:lang w:val="en-US"/>
         </w:rPr>
       </w:pPr>
-      <w:bookmarkStart w:id="1" w:name="_Toc239345941"/>
-      <w:r>
-        <w:rPr>
-          <w:lang w:val="en-US"/>
-        </w:rPr>
-        <w:lastRenderedPageBreak/>
+      <w:bookmarkStart w:id="1" w:name="_Toc239518450"/>
+      <w:r>
+        <w:rPr>
+          <w:lang w:val="en-US"/>
+        </w:rPr>
         <w:t>KEY</w:t>
       </w:r>
       <w:bookmarkEnd w:id="1"/>
@@ -1656,7 +1835,7 @@
         </w:rPr>
       </w:pPr>
       <w:bookmarkStart w:id="2" w:name="_Toc239337273"/>
-      <w:bookmarkStart w:id="3" w:name="_Toc239345942"/>
+      <w:bookmarkStart w:id="3" w:name="_Toc239518451"/>
       <w:r>
         <w:rPr>
           <w:lang w:val="en-US"/>
@@ -1707,21 +1886,35 @@
         <w:rPr>
           <w:lang w:val="en-US"/>
         </w:rPr>
-        <w:t>-Ollama/Gemma4 have trouble reading large text files</w:t>
-      </w:r>
-    </w:p>
-    <w:p>
-      <w:pPr>
-        <w:rPr>
-          <w:lang w:val="en-US"/>
-        </w:rPr>
-      </w:pPr>
-      <w:r>
-        <w:rPr>
-          <w:lang w:val="en-US"/>
-        </w:rPr>
         <w:t>-</w:t>
       </w:r>
+      <w:proofErr w:type="spellStart"/>
+      <w:r>
+        <w:rPr>
+          <w:lang w:val="en-US"/>
+        </w:rPr>
+        <w:t>Ollama</w:t>
+      </w:r>
+      <w:proofErr w:type="spellEnd"/>
+      <w:r>
+        <w:rPr>
+          <w:lang w:val="en-US"/>
+        </w:rPr>
+        <w:t>/Gemma4 have trouble reading large text files</w:t>
+      </w:r>
+    </w:p>
+    <w:p>
+      <w:pPr>
+        <w:rPr>
+          <w:lang w:val="en-US"/>
+        </w:rPr>
+      </w:pPr>
+      <w:r>
+        <w:rPr>
+          <w:lang w:val="en-US"/>
+        </w:rPr>
+        <w:t>-</w:t>
+      </w:r>
       <w:r>
         <w:rPr>
           <w:lang w:val="en-US"/>
@@ -1738,24 +1931,48 @@
         <w:rPr>
           <w:lang w:val="en-US"/>
         </w:rPr>
-        <w:t xml:space="preserve">‘pdftotext’ </w:t>
-      </w:r>
-    </w:p>
-    <w:p>
-      <w:pPr>
-        <w:rPr>
-          <w:b/>
-          <w:bCs/>
-          <w:lang w:val="en-US"/>
-        </w:rPr>
-      </w:pPr>
-      <w:r>
-        <w:rPr>
-          <w:b/>
-          <w:bCs/>
-          <w:lang w:val="en-US"/>
-        </w:rPr>
-        <w:t xml:space="preserve">pdftotext </w:t>
+        <w:t>‘</w:t>
+      </w:r>
+      <w:proofErr w:type="spellStart"/>
+      <w:r>
+        <w:rPr>
+          <w:lang w:val="en-US"/>
+        </w:rPr>
+        <w:t>pdftotext</w:t>
+      </w:r>
+      <w:proofErr w:type="spellEnd"/>
+      <w:r>
+        <w:rPr>
+          <w:lang w:val="en-US"/>
+        </w:rPr>
+        <w:t xml:space="preserve">’ </w:t>
+      </w:r>
+    </w:p>
+    <w:p>
+      <w:pPr>
+        <w:rPr>
+          <w:b/>
+          <w:bCs/>
+          <w:lang w:val="en-US"/>
+        </w:rPr>
+      </w:pPr>
+      <w:proofErr w:type="spellStart"/>
+      <w:r>
+        <w:rPr>
+          <w:b/>
+          <w:bCs/>
+          <w:lang w:val="en-US"/>
+        </w:rPr>
+        <w:t>pdftotext</w:t>
+      </w:r>
+      <w:proofErr w:type="spellEnd"/>
+      <w:r>
+        <w:rPr>
+          <w:b/>
+          <w:bCs/>
+          <w:lang w:val="en-US"/>
+        </w:rPr>
+        <w:t xml:space="preserve"> </w:t>
       </w:r>
       <w:r>
         <w:rPr>
@@ -1843,7 +2060,25 @@
           <w:bCs/>
           <w:lang w:val="en-US"/>
         </w:rPr>
-        <w:t xml:space="preserve">.txt | ollama run gemma4:26b </w:t>
+        <w:t xml:space="preserve">.txt | </w:t>
+      </w:r>
+      <w:proofErr w:type="spellStart"/>
+      <w:r>
+        <w:rPr>
+          <w:b/>
+          <w:bCs/>
+          <w:lang w:val="en-US"/>
+        </w:rPr>
+        <w:t>ollama</w:t>
+      </w:r>
+      <w:proofErr w:type="spellEnd"/>
+      <w:r>
+        <w:rPr>
+          <w:b/>
+          <w:bCs/>
+          <w:lang w:val="en-US"/>
+        </w:rPr>
+        <w:t xml:space="preserve"> run gemma4:26b </w:t>
       </w:r>
       <w:r>
         <w:rPr>
@@ -1932,6 +2167,7 @@
           <w:lang w:val="en-US"/>
         </w:rPr>
       </w:pPr>
+      <w:proofErr w:type="spellStart"/>
       <w:r>
         <w:rPr>
           <w:b/>
@@ -1946,7 +2182,16 @@
           <w:bCs/>
           <w:lang w:val="en-US"/>
         </w:rPr>
-        <w:t xml:space="preserve">llama run gemma4:26b </w:t>
+        <w:t>llama</w:t>
+      </w:r>
+      <w:proofErr w:type="spellEnd"/>
+      <w:r>
+        <w:rPr>
+          <w:b/>
+          <w:bCs/>
+          <w:lang w:val="en-US"/>
+        </w:rPr>
+        <w:t xml:space="preserve"> run gemma4:26b </w:t>
       </w:r>
       <w:r>
         <w:rPr>
@@ -2081,7 +2326,25 @@
           <w:bCs/>
           <w:lang w:val="en-US"/>
         </w:rPr>
-        <w:t xml:space="preserve">cat *.txt | ollama run gemma4:26b </w:t>
+        <w:t xml:space="preserve">cat *.txt | </w:t>
+      </w:r>
+      <w:proofErr w:type="spellStart"/>
+      <w:r>
+        <w:rPr>
+          <w:b/>
+          <w:bCs/>
+          <w:lang w:val="en-US"/>
+        </w:rPr>
+        <w:t>ollama</w:t>
+      </w:r>
+      <w:proofErr w:type="spellEnd"/>
+      <w:r>
+        <w:rPr>
+          <w:b/>
+          <w:bCs/>
+          <w:lang w:val="en-US"/>
+        </w:rPr>
+        <w:t xml:space="preserve"> run gemma4:26b </w:t>
       </w:r>
       <w:r>
         <w:rPr>
@@ -2206,12 +2469,11 @@
           <w:lang w:val="en-US"/>
         </w:rPr>
       </w:pPr>
-      <w:bookmarkStart w:id="4" w:name="_Toc239345943"/>
-      <w:r>
-        <w:rPr>
-          <w:lang w:val="en-US"/>
-        </w:rPr>
-        <w:lastRenderedPageBreak/>
+      <w:bookmarkStart w:id="4" w:name="_Toc239518452"/>
+      <w:r>
+        <w:rPr>
+          <w:lang w:val="en-US"/>
+        </w:rPr>
         <w:t>Compressed</w:t>
       </w:r>
       <w:bookmarkEnd w:id="4"/>
@@ -2223,7 +2485,7 @@
           <w:lang w:val="en-US"/>
         </w:rPr>
       </w:pPr>
-      <w:bookmarkStart w:id="5" w:name="_Toc239345944"/>
+      <w:bookmarkStart w:id="5" w:name="_Toc239518453"/>
       <w:r>
         <w:rPr>
           <w:lang w:val="en-US"/>
@@ -2242,25 +2504,50 @@
         <w:rPr>
           <w:lang w:val="en-US"/>
         </w:rPr>
-        <w:t>-use ‘unrar’</w:t>
-      </w:r>
-    </w:p>
-    <w:p>
-      <w:pPr>
-        <w:rPr>
-          <w:b/>
-          <w:bCs/>
-          <w:lang w:val="en-US"/>
-        </w:rPr>
-      </w:pPr>
-      <w:r>
-        <w:rPr>
-          <w:b/>
-          <w:bCs/>
-          <w:lang w:val="en-US"/>
-        </w:rPr>
-        <w:t xml:space="preserve">unrar x </w:t>
-      </w:r>
+        <w:t>-use ‘</w:t>
+      </w:r>
+      <w:proofErr w:type="spellStart"/>
+      <w:r>
+        <w:rPr>
+          <w:lang w:val="en-US"/>
+        </w:rPr>
+        <w:t>unrar</w:t>
+      </w:r>
+      <w:proofErr w:type="spellEnd"/>
+      <w:r>
+        <w:rPr>
+          <w:lang w:val="en-US"/>
+        </w:rPr>
+        <w:t>’</w:t>
+      </w:r>
+    </w:p>
+    <w:p>
+      <w:pPr>
+        <w:rPr>
+          <w:b/>
+          <w:bCs/>
+          <w:lang w:val="en-US"/>
+        </w:rPr>
+      </w:pPr>
+      <w:proofErr w:type="spellStart"/>
+      <w:r>
+        <w:rPr>
+          <w:b/>
+          <w:bCs/>
+          <w:lang w:val="en-US"/>
+        </w:rPr>
+        <w:t>unrar</w:t>
+      </w:r>
+      <w:proofErr w:type="spellEnd"/>
+      <w:r>
+        <w:rPr>
+          <w:b/>
+          <w:bCs/>
+          <w:lang w:val="en-US"/>
+        </w:rPr>
+        <w:t xml:space="preserve"> x </w:t>
+      </w:r>
+      <w:proofErr w:type="spellStart"/>
       <w:r>
         <w:rPr>
           <w:b/>
@@ -2278,6 +2565,7 @@
         </w:rPr>
         <w:t>.rar</w:t>
       </w:r>
+      <w:proofErr w:type="spellEnd"/>
     </w:p>
     <w:p>
       <w:pPr>
@@ -2299,14 +2587,25 @@
           <w:bCs/>
         </w:rPr>
       </w:pPr>
-      <w:r>
-        <w:rPr>
-          <w:b/>
-          <w:bCs/>
-          <w:lang w:val="en-US"/>
-        </w:rPr>
-        <w:t xml:space="preserve">unrar x </w:t>
-      </w:r>
+      <w:proofErr w:type="spellStart"/>
+      <w:r>
+        <w:rPr>
+          <w:b/>
+          <w:bCs/>
+          <w:lang w:val="en-US"/>
+        </w:rPr>
+        <w:t>unrar</w:t>
+      </w:r>
+      <w:proofErr w:type="spellEnd"/>
+      <w:r>
+        <w:rPr>
+          <w:b/>
+          <w:bCs/>
+          <w:lang w:val="en-US"/>
+        </w:rPr>
+        <w:t xml:space="preserve"> x </w:t>
+      </w:r>
+      <w:proofErr w:type="spellStart"/>
       <w:r>
         <w:rPr>
           <w:b/>
@@ -2324,6 +2623,7 @@
         </w:rPr>
         <w:t>.rar</w:t>
       </w:r>
+      <w:proofErr w:type="spellEnd"/>
       <w:r>
         <w:rPr>
           <w:b/>
@@ -2407,7 +2707,7 @@
           <w:lang w:val="en-US"/>
         </w:rPr>
       </w:pPr>
-      <w:bookmarkStart w:id="6" w:name="_Toc239345945"/>
+      <w:bookmarkStart w:id="6" w:name="_Toc239518454"/>
       <w:r>
         <w:rPr>
           <w:lang w:val="en-US"/>
@@ -2586,21 +2886,64 @@
     </w:p>
     <w:p>
       <w:pPr>
-        <w:rPr>
-          <w:b/>
-          <w:bCs/>
-          <w:lang w:val="en-US"/>
-        </w:rPr>
-      </w:pPr>
-    </w:p>
-    <w:p>
-      <w:pPr>
-        <w:rPr>
-          <w:b/>
-          <w:bCs/>
-          <w:lang w:val="en-US"/>
-        </w:rPr>
-      </w:pPr>
+        <w:pStyle w:val="Heading2"/>
+        <w:rPr>
+          <w:lang w:val="en-US"/>
+        </w:rPr>
+      </w:pPr>
+      <w:r>
+        <w:rPr>
+          <w:lang w:val="en-US"/>
+        </w:rPr>
+        <w:t>BZ2</w:t>
+      </w:r>
+    </w:p>
+    <w:p>
+      <w:pPr>
+        <w:rPr>
+          <w:lang w:val="en-US"/>
+        </w:rPr>
+      </w:pPr>
+      <w:r>
+        <w:rPr>
+          <w:lang w:val="en-US"/>
+        </w:rPr>
+        <w:t>-Use bzip2</w:t>
+      </w:r>
+    </w:p>
+    <w:p>
+      <w:pPr>
+        <w:rPr>
+          <w:b/>
+          <w:bCs/>
+          <w:lang w:val="en-US"/>
+        </w:rPr>
+      </w:pPr>
+      <w:r>
+        <w:rPr>
+          <w:b/>
+          <w:bCs/>
+          <w:lang w:val="en-US"/>
+        </w:rPr>
+        <w:t xml:space="preserve">bzip2 -d </w:t>
+      </w:r>
+      <w:r>
+        <w:rPr>
+          <w:b/>
+          <w:bCs/>
+          <w:color w:val="47D459" w:themeColor="accent3" w:themeTint="99"/>
+          <w:lang w:val="en-US"/>
+        </w:rPr>
+        <w:t>archive</w:t>
+      </w:r>
+      <w:r>
+        <w:rPr>
+          <w:b/>
+          <w:bCs/>
+          <w:lang w:val="en-US"/>
+        </w:rPr>
+        <w:t>.bz2</w:t>
+      </w:r>
     </w:p>
     <w:p>
       <w:pPr>
@@ -2627,7 +2970,7 @@
           <w:lang w:val="en-US"/>
         </w:rPr>
       </w:pPr>
-      <w:bookmarkStart w:id="7" w:name="_Toc239345946"/>
+      <w:bookmarkStart w:id="7" w:name="_Toc239518455"/>
       <w:r>
         <w:rPr>
           <w:lang w:val="en-US"/>
@@ -2644,7 +2987,7 @@
           <w:lang w:val="en-US"/>
         </w:rPr>
       </w:pPr>
-      <w:bookmarkStart w:id="8" w:name="_Toc239345947"/>
+      <w:bookmarkStart w:id="8" w:name="_Toc239518456"/>
       <w:r>
         <w:rPr>
           <w:lang w:val="en-US"/>
@@ -2663,24 +3006,66 @@
         <w:rPr>
           <w:lang w:val="en-US"/>
         </w:rPr>
-        <w:t>-Use ‘ffmpeg’</w:t>
-      </w:r>
-    </w:p>
-    <w:p>
-      <w:pPr>
-        <w:rPr>
-          <w:b/>
-          <w:bCs/>
-          <w:lang w:val="en-US"/>
-        </w:rPr>
-      </w:pPr>
-      <w:r>
-        <w:rPr>
-          <w:b/>
-          <w:bCs/>
-          <w:lang w:val="en-US"/>
-        </w:rPr>
-        <w:t xml:space="preserve">ffmpeg -i </w:t>
+        <w:t>-Use ‘</w:t>
+      </w:r>
+      <w:proofErr w:type="spellStart"/>
+      <w:r>
+        <w:rPr>
+          <w:lang w:val="en-US"/>
+        </w:rPr>
+        <w:t>ffmpeg</w:t>
+      </w:r>
+      <w:proofErr w:type="spellEnd"/>
+      <w:r>
+        <w:rPr>
+          <w:lang w:val="en-US"/>
+        </w:rPr>
+        <w:t>’</w:t>
+      </w:r>
+    </w:p>
+    <w:p>
+      <w:pPr>
+        <w:rPr>
+          <w:b/>
+          <w:bCs/>
+          <w:lang w:val="en-US"/>
+        </w:rPr>
+      </w:pPr>
+      <w:proofErr w:type="spellStart"/>
+      <w:r>
+        <w:rPr>
+          <w:b/>
+          <w:bCs/>
+          <w:lang w:val="en-US"/>
+        </w:rPr>
+        <w:t>ffmpeg</w:t>
+      </w:r>
+      <w:proofErr w:type="spellEnd"/>
+      <w:r>
+        <w:rPr>
+          <w:b/>
+          <w:bCs/>
+          <w:lang w:val="en-US"/>
+        </w:rPr>
+        <w:t xml:space="preserve"> -</w:t>
+      </w:r>
+      <w:proofErr w:type="spellStart"/>
+      <w:r>
+        <w:rPr>
+          <w:b/>
+          <w:bCs/>
+          <w:lang w:val="en-US"/>
+        </w:rPr>
+        <w:t>i</w:t>
+      </w:r>
+      <w:proofErr w:type="spellEnd"/>
+      <w:r>
+        <w:rPr>
+          <w:b/>
+          <w:bCs/>
+          <w:lang w:val="en-US"/>
+        </w:rPr>
+        <w:t xml:space="preserve"> </w:t>
       </w:r>
       <w:r>
         <w:rPr>
@@ -2841,7 +3226,7 @@
           <w:lang w:val="en-US"/>
         </w:rPr>
       </w:pPr>
-      <w:bookmarkStart w:id="9" w:name="_Toc239345948"/>
+      <w:bookmarkStart w:id="9" w:name="_Toc239518457"/>
       <w:r>
         <w:rPr>
           <w:lang w:val="en-US"/>
@@ -2873,24 +3258,74 @@
         <w:rPr>
           <w:lang w:val="en-US"/>
         </w:rPr>
-        <w:t>-Or you could convert a single frame (say the first) with ‘ffmpeg’ to png</w:t>
-      </w:r>
-    </w:p>
-    <w:p>
-      <w:pPr>
-        <w:rPr>
-          <w:b/>
-          <w:bCs/>
-          <w:lang w:val="en-US"/>
-        </w:rPr>
-      </w:pPr>
-      <w:r>
-        <w:rPr>
-          <w:b/>
-          <w:bCs/>
-          <w:lang w:val="en-US"/>
-        </w:rPr>
-        <w:t xml:space="preserve">ffmpeg -i </w:t>
+        <w:t>-Or you could convert a single frame (say the first) with ‘</w:t>
+      </w:r>
+      <w:proofErr w:type="spellStart"/>
+      <w:r>
+        <w:rPr>
+          <w:lang w:val="en-US"/>
+        </w:rPr>
+        <w:t>ffmpeg</w:t>
+      </w:r>
+      <w:proofErr w:type="spellEnd"/>
+      <w:r>
+        <w:rPr>
+          <w:lang w:val="en-US"/>
+        </w:rPr>
+        <w:t xml:space="preserve">’ to </w:t>
+      </w:r>
+      <w:proofErr w:type="spellStart"/>
+      <w:r>
+        <w:rPr>
+          <w:lang w:val="en-US"/>
+        </w:rPr>
+        <w:t>png</w:t>
+      </w:r>
+      <w:proofErr w:type="spellEnd"/>
+    </w:p>
+    <w:p>
+      <w:pPr>
+        <w:rPr>
+          <w:b/>
+          <w:bCs/>
+          <w:lang w:val="en-US"/>
+        </w:rPr>
+      </w:pPr>
+      <w:proofErr w:type="spellStart"/>
+      <w:r>
+        <w:rPr>
+          <w:b/>
+          <w:bCs/>
+          <w:lang w:val="en-US"/>
+        </w:rPr>
+        <w:t>ffmpeg</w:t>
+      </w:r>
+      <w:proofErr w:type="spellEnd"/>
+      <w:r>
+        <w:rPr>
+          <w:b/>
+          <w:bCs/>
+          <w:lang w:val="en-US"/>
+        </w:rPr>
+        <w:t xml:space="preserve"> -</w:t>
+      </w:r>
+      <w:proofErr w:type="spellStart"/>
+      <w:r>
+        <w:rPr>
+          <w:b/>
+          <w:bCs/>
+          <w:lang w:val="en-US"/>
+        </w:rPr>
+        <w:t>i</w:t>
+      </w:r>
+      <w:proofErr w:type="spellEnd"/>
+      <w:r>
+        <w:rPr>
+          <w:b/>
+          <w:bCs/>
+          <w:lang w:val="en-US"/>
+        </w:rPr>
+        <w:t xml:space="preserve"> </w:t>
       </w:r>
       <w:r>
         <w:rPr>
@@ -2907,7 +3342,27 @@
           <w:bCs/>
           <w:lang w:val="en-US"/>
         </w:rPr>
-        <w:t xml:space="preserve">.gif -frames:v </w:t>
+        <w:t>.gif -</w:t>
+      </w:r>
+      <w:proofErr w:type="spellStart"/>
+      <w:proofErr w:type="gramStart"/>
+      <w:r>
+        <w:rPr>
+          <w:b/>
+          <w:bCs/>
+          <w:lang w:val="en-US"/>
+        </w:rPr>
+        <w:t>frames:v</w:t>
+      </w:r>
+      <w:proofErr w:type="spellEnd"/>
+      <w:proofErr w:type="gramEnd"/>
+      <w:r>
+        <w:rPr>
+          <w:b/>
+          <w:bCs/>
+          <w:lang w:val="en-US"/>
+        </w:rPr>
+        <w:t xml:space="preserve"> </w:t>
       </w:r>
       <w:r>
         <w:rPr>
@@ -3077,7 +3532,7 @@
           <w:lang w:val="en-US"/>
         </w:rPr>
       </w:pPr>
-      <w:bookmarkStart w:id="10" w:name="_Toc239345949"/>
+      <w:bookmarkStart w:id="10" w:name="_Toc239518458"/>
       <w:r>
         <w:rPr>
           <w:lang w:val="en-US"/>
@@ -3168,7 +3623,7 @@
           <w:lang w:val="en-US"/>
         </w:rPr>
       </w:pPr>
-      <w:bookmarkStart w:id="11" w:name="_Toc239345950"/>
+      <w:bookmarkStart w:id="11" w:name="_Toc239518459"/>
       <w:r>
         <w:rPr>
           <w:lang w:val="en-US"/>
@@ -3393,7 +3848,7 @@
           <w:lang w:val="en-US"/>
         </w:rPr>
       </w:pPr>
-      <w:bookmarkStart w:id="12" w:name="_Toc239345951"/>
+      <w:bookmarkStart w:id="12" w:name="_Toc239518460"/>
       <w:r>
         <w:rPr>
           <w:lang w:val="en-US"/>
@@ -3410,7 +3865,7 @@
           <w:lang w:val="en-US"/>
         </w:rPr>
       </w:pPr>
-      <w:bookmarkStart w:id="13" w:name="_Toc239345952"/>
+      <w:bookmarkStart w:id="13" w:name="_Toc239518461"/>
       <w:r>
         <w:rPr>
           <w:lang w:val="en-US"/>
@@ -3429,8 +3884,23 @@
         <w:rPr>
           <w:lang w:val="en-US"/>
         </w:rPr>
-        <w:t xml:space="preserve">-Use ‘pandoc’ to convert a DOCX to a .txt and pipe it directly to </w:t>
-      </w:r>
+        <w:t>-Use ‘</w:t>
+      </w:r>
+      <w:proofErr w:type="spellStart"/>
+      <w:r>
+        <w:rPr>
+          <w:lang w:val="en-US"/>
+        </w:rPr>
+        <w:t>pandoc</w:t>
+      </w:r>
+      <w:proofErr w:type="spellEnd"/>
+      <w:r>
+        <w:rPr>
+          <w:lang w:val="en-US"/>
+        </w:rPr>
+        <w:t xml:space="preserve">’ to convert a DOCX to a .txt and pipe it directly to </w:t>
+      </w:r>
+      <w:proofErr w:type="spellStart"/>
       <w:r>
         <w:rPr>
           <w:lang w:val="en-US"/>
@@ -3443,6 +3913,7 @@
         </w:rPr>
         <w:t>llama</w:t>
       </w:r>
+      <w:proofErr w:type="spellEnd"/>
       <w:r>
         <w:rPr>
           <w:lang w:val="en-US"/>
@@ -3459,6 +3930,7 @@
           <w:lang w:val="en-US"/>
         </w:rPr>
       </w:pPr>
+      <w:proofErr w:type="spellStart"/>
       <w:r>
         <w:rPr>
           <w:b/>
@@ -3473,7 +3945,16 @@
           <w:bCs/>
           <w:lang w:val="en-US"/>
         </w:rPr>
-        <w:t xml:space="preserve">andoc </w:t>
+        <w:t>andoc</w:t>
+      </w:r>
+      <w:proofErr w:type="spellEnd"/>
+      <w:r>
+        <w:rPr>
+          <w:b/>
+          <w:bCs/>
+          <w:lang w:val="en-US"/>
+        </w:rPr>
+        <w:t xml:space="preserve"> </w:t>
       </w:r>
       <w:r>
         <w:rPr>
@@ -3498,7 +3979,25 @@
           <w:bCs/>
           <w:lang w:val="en-US"/>
         </w:rPr>
-        <w:t xml:space="preserve">plain | ollama run gemma4:26b </w:t>
+        <w:t xml:space="preserve">plain | </w:t>
+      </w:r>
+      <w:proofErr w:type="spellStart"/>
+      <w:r>
+        <w:rPr>
+          <w:b/>
+          <w:bCs/>
+          <w:lang w:val="en-US"/>
+        </w:rPr>
+        <w:t>ollama</w:t>
+      </w:r>
+      <w:proofErr w:type="spellEnd"/>
+      <w:r>
+        <w:rPr>
+          <w:b/>
+          <w:bCs/>
+          <w:lang w:val="en-US"/>
+        </w:rPr>
+        <w:t xml:space="preserve"> run gemma4:26b </w:t>
       </w:r>
       <w:r>
         <w:rPr>
@@ -3569,7 +4068,7 @@
           <w:lang w:val="en-US"/>
         </w:rPr>
       </w:pPr>
-      <w:bookmarkStart w:id="14" w:name="_Toc239345953"/>
+      <w:bookmarkStart w:id="14" w:name="_Toc239518462"/>
       <w:r>
         <w:rPr>
           <w:lang w:val="en-US"/>
@@ -3588,24 +4087,62 @@
         <w:rPr>
           <w:lang w:val="en-US"/>
         </w:rPr>
-        <w:t>-Use ‘pandoc’ to convert a PPTX to a .txt and pipe it directly to Ollama with |</w:t>
-      </w:r>
-    </w:p>
-    <w:p>
-      <w:pPr>
-        <w:rPr>
-          <w:b/>
-          <w:bCs/>
-          <w:lang w:val="en-US"/>
-        </w:rPr>
-      </w:pPr>
-      <w:r>
-        <w:rPr>
-          <w:b/>
-          <w:bCs/>
-          <w:lang w:val="en-US"/>
-        </w:rPr>
-        <w:t xml:space="preserve">pandoc </w:t>
+        <w:t>-Use ‘</w:t>
+      </w:r>
+      <w:proofErr w:type="spellStart"/>
+      <w:r>
+        <w:rPr>
+          <w:lang w:val="en-US"/>
+        </w:rPr>
+        <w:t>pandoc</w:t>
+      </w:r>
+      <w:proofErr w:type="spellEnd"/>
+      <w:r>
+        <w:rPr>
+          <w:lang w:val="en-US"/>
+        </w:rPr>
+        <w:t xml:space="preserve">’ to convert a PPTX to a .txt and pipe it directly to </w:t>
+      </w:r>
+      <w:proofErr w:type="spellStart"/>
+      <w:r>
+        <w:rPr>
+          <w:lang w:val="en-US"/>
+        </w:rPr>
+        <w:t>Ollama</w:t>
+      </w:r>
+      <w:proofErr w:type="spellEnd"/>
+      <w:r>
+        <w:rPr>
+          <w:lang w:val="en-US"/>
+        </w:rPr>
+        <w:t xml:space="preserve"> with |</w:t>
+      </w:r>
+    </w:p>
+    <w:p>
+      <w:pPr>
+        <w:rPr>
+          <w:b/>
+          <w:bCs/>
+          <w:lang w:val="en-US"/>
+        </w:rPr>
+      </w:pPr>
+      <w:proofErr w:type="spellStart"/>
+      <w:r>
+        <w:rPr>
+          <w:b/>
+          <w:bCs/>
+          <w:lang w:val="en-US"/>
+        </w:rPr>
+        <w:t>pandoc</w:t>
+      </w:r>
+      <w:proofErr w:type="spellEnd"/>
+      <w:r>
+        <w:rPr>
+          <w:b/>
+          <w:bCs/>
+          <w:lang w:val="en-US"/>
+        </w:rPr>
+        <w:t xml:space="preserve"> </w:t>
       </w:r>
       <w:r>
         <w:rPr>
@@ -3622,7 +4159,25 @@
           <w:bCs/>
           <w:lang w:val="en-US"/>
         </w:rPr>
-        <w:t xml:space="preserve">.PPTX -t plain | ollama run gemma4:26b </w:t>
+        <w:t xml:space="preserve">.PPTX -t plain | </w:t>
+      </w:r>
+      <w:proofErr w:type="spellStart"/>
+      <w:r>
+        <w:rPr>
+          <w:b/>
+          <w:bCs/>
+          <w:lang w:val="en-US"/>
+        </w:rPr>
+        <w:t>ollama</w:t>
+      </w:r>
+      <w:proofErr w:type="spellEnd"/>
+      <w:r>
+        <w:rPr>
+          <w:b/>
+          <w:bCs/>
+          <w:lang w:val="en-US"/>
+        </w:rPr>
+        <w:t xml:space="preserve"> run gemma4:26b </w:t>
       </w:r>
       <w:r>
         <w:rPr>
@@ -3729,7 +4284,7 @@
           <w:lang w:val="en-US"/>
         </w:rPr>
       </w:pPr>
-      <w:bookmarkStart w:id="15" w:name="_Toc239345954"/>
+      <w:bookmarkStart w:id="15" w:name="_Toc239518463"/>
       <w:r>
         <w:rPr>
           <w:lang w:val="en-US"/>
@@ -3748,24 +4303,48 @@
         <w:rPr>
           <w:lang w:val="en-US"/>
         </w:rPr>
-        <w:t>-Use ‘ssconvert’ to convert an XLSX to .txt</w:t>
-      </w:r>
-    </w:p>
-    <w:p>
-      <w:pPr>
-        <w:rPr>
-          <w:b/>
-          <w:bCs/>
-          <w:lang w:val="en-US"/>
-        </w:rPr>
-      </w:pPr>
-      <w:r>
-        <w:rPr>
-          <w:b/>
-          <w:bCs/>
-          <w:lang w:val="en-US"/>
-        </w:rPr>
-        <w:t xml:space="preserve">ssconvert </w:t>
+        <w:t>-Use ‘</w:t>
+      </w:r>
+      <w:proofErr w:type="spellStart"/>
+      <w:r>
+        <w:rPr>
+          <w:lang w:val="en-US"/>
+        </w:rPr>
+        <w:t>ssconvert</w:t>
+      </w:r>
+      <w:proofErr w:type="spellEnd"/>
+      <w:r>
+        <w:rPr>
+          <w:lang w:val="en-US"/>
+        </w:rPr>
+        <w:t>’ to convert an XLSX to .txt</w:t>
+      </w:r>
+    </w:p>
+    <w:p>
+      <w:pPr>
+        <w:rPr>
+          <w:b/>
+          <w:bCs/>
+          <w:lang w:val="en-US"/>
+        </w:rPr>
+      </w:pPr>
+      <w:proofErr w:type="spellStart"/>
+      <w:r>
+        <w:rPr>
+          <w:b/>
+          <w:bCs/>
+          <w:lang w:val="en-US"/>
+        </w:rPr>
+        <w:t>ssconvert</w:t>
+      </w:r>
+      <w:proofErr w:type="spellEnd"/>
+      <w:r>
+        <w:rPr>
+          <w:b/>
+          <w:bCs/>
+          <w:lang w:val="en-US"/>
+        </w:rPr>
+        <w:t xml:space="preserve"> </w:t>
       </w:r>
       <w:r>
         <w:rPr>
@@ -3867,7 +4446,25 @@
           <w:bCs/>
           <w:lang w:val="en-US"/>
         </w:rPr>
-        <w:t xml:space="preserve">.txt | ollama run gemma4:26b </w:t>
+        <w:t xml:space="preserve">.txt | </w:t>
+      </w:r>
+      <w:proofErr w:type="spellStart"/>
+      <w:r>
+        <w:rPr>
+          <w:b/>
+          <w:bCs/>
+          <w:lang w:val="en-US"/>
+        </w:rPr>
+        <w:t>ollama</w:t>
+      </w:r>
+      <w:proofErr w:type="spellEnd"/>
+      <w:r>
+        <w:rPr>
+          <w:b/>
+          <w:bCs/>
+          <w:lang w:val="en-US"/>
+        </w:rPr>
+        <w:t xml:space="preserve"> run gemma4:26b </w:t>
       </w:r>
       <w:r>
         <w:rPr>
@@ -3952,13 +4549,23 @@
           <w:lang w:val="en-US"/>
         </w:rPr>
       </w:pPr>
-      <w:r>
-        <w:rPr>
-          <w:b/>
-          <w:bCs/>
-          <w:lang w:val="en-US"/>
-        </w:rPr>
-        <w:t xml:space="preserve">ollama run gemma4:26b </w:t>
+      <w:proofErr w:type="spellStart"/>
+      <w:r>
+        <w:rPr>
+          <w:b/>
+          <w:bCs/>
+          <w:lang w:val="en-US"/>
+        </w:rPr>
+        <w:t>ollama</w:t>
+      </w:r>
+      <w:proofErr w:type="spellEnd"/>
+      <w:r>
+        <w:rPr>
+          <w:b/>
+          <w:bCs/>
+          <w:lang w:val="en-US"/>
+        </w:rPr>
+        <w:t xml:space="preserve"> run gemma4:26b </w:t>
       </w:r>
       <w:r>
         <w:rPr>
@@ -4071,7 +4678,7 @@
           <w:lang w:val="en-US"/>
         </w:rPr>
       </w:pPr>
-      <w:bookmarkStart w:id="16" w:name="_Toc239345955"/>
+      <w:bookmarkStart w:id="16" w:name="_Toc239518464"/>
       <w:r>
         <w:rPr>
           <w:lang w:val="en-US"/>
@@ -4088,7 +4695,7 @@
           <w:lang w:val="en-US"/>
         </w:rPr>
       </w:pPr>
-      <w:bookmarkStart w:id="17" w:name="_Toc239345956"/>
+      <w:bookmarkStart w:id="17" w:name="_Toc239518465"/>
       <w:r>
         <w:rPr>
           <w:lang w:val="en-US"/>
@@ -4103,12 +4710,28 @@
           <w:lang w:val="en-US"/>
         </w:rPr>
       </w:pPr>
-      <w:r>
-        <w:rPr>
-          <w:lang w:val="en-US"/>
-        </w:rPr>
-        <w:t>-‘Cat’ the XML and pipe it directly into Ollama</w:t>
-      </w:r>
+      <w:proofErr w:type="gramStart"/>
+      <w:r>
+        <w:rPr>
+          <w:lang w:val="en-US"/>
+        </w:rPr>
+        <w:t>-‘</w:t>
+      </w:r>
+      <w:proofErr w:type="gramEnd"/>
+      <w:r>
+        <w:rPr>
+          <w:lang w:val="en-US"/>
+        </w:rPr>
+        <w:t xml:space="preserve">Cat’ the XML and pipe it directly into </w:t>
+      </w:r>
+      <w:proofErr w:type="spellStart"/>
+      <w:r>
+        <w:rPr>
+          <w:lang w:val="en-US"/>
+        </w:rPr>
+        <w:t>Ollama</w:t>
+      </w:r>
+      <w:proofErr w:type="spellEnd"/>
     </w:p>
     <w:p>
       <w:pPr>
@@ -4149,7 +4772,25 @@
           <w:bCs/>
           <w:lang w:val="en-US"/>
         </w:rPr>
-        <w:t xml:space="preserve">.xml | ollama run gemma4:26b </w:t>
+        <w:t xml:space="preserve">.xml | </w:t>
+      </w:r>
+      <w:proofErr w:type="spellStart"/>
+      <w:r>
+        <w:rPr>
+          <w:b/>
+          <w:bCs/>
+          <w:lang w:val="en-US"/>
+        </w:rPr>
+        <w:t>ollama</w:t>
+      </w:r>
+      <w:proofErr w:type="spellEnd"/>
+      <w:r>
+        <w:rPr>
+          <w:b/>
+          <w:bCs/>
+          <w:lang w:val="en-US"/>
+        </w:rPr>
+        <w:t xml:space="preserve"> run gemma4:26b </w:t>
       </w:r>
       <w:r>
         <w:rPr>
@@ -4243,12 +4884,14 @@
           <w:lang w:val="en-US"/>
         </w:rPr>
       </w:pPr>
+      <w:bookmarkStart w:id="18" w:name="_Toc239518466"/>
       <w:r>
         <w:rPr>
           <w:lang w:val="en-US"/>
         </w:rPr>
         <w:t>Wireshark</w:t>
       </w:r>
+      <w:bookmarkEnd w:id="18"/>
     </w:p>
     <w:p>
       <w:pPr>
@@ -4257,12 +4900,16 @@
           <w:lang w:val="en-US"/>
         </w:rPr>
       </w:pPr>
+      <w:bookmarkStart w:id="19" w:name="_Toc239518467"/>
+      <w:proofErr w:type="spellStart"/>
       <w:r>
         <w:rPr>
           <w:lang w:val="en-US"/>
         </w:rPr>
         <w:t>Pcap</w:t>
       </w:r>
+      <w:bookmarkEnd w:id="19"/>
+      <w:proofErr w:type="spellEnd"/>
     </w:p>
     <w:p>
       <w:pPr>
@@ -4320,7 +4967,21 @@
         <w:rPr>
           <w:lang w:val="en-US"/>
         </w:rPr>
-        <w:t>-Use ‘tshark’ to write the protocol hierarchy statistics</w:t>
+        <w:t>-Use ‘</w:t>
+      </w:r>
+      <w:proofErr w:type="spellStart"/>
+      <w:r>
+        <w:rPr>
+          <w:lang w:val="en-US"/>
+        </w:rPr>
+        <w:t>tshark</w:t>
+      </w:r>
+      <w:proofErr w:type="spellEnd"/>
+      <w:r>
+        <w:rPr>
+          <w:lang w:val="en-US"/>
+        </w:rPr>
+        <w:t>’ to write the protocol hierarchy statistics</w:t>
       </w:r>
       <w:r>
         <w:rPr>
@@ -4337,13 +4998,23 @@
           <w:lang w:val="en-US"/>
         </w:rPr>
       </w:pPr>
-      <w:r>
-        <w:rPr>
-          <w:b/>
-          <w:bCs/>
-          <w:lang w:val="en-US"/>
-        </w:rPr>
-        <w:t xml:space="preserve">tshark -r </w:t>
+      <w:proofErr w:type="spellStart"/>
+      <w:r>
+        <w:rPr>
+          <w:b/>
+          <w:bCs/>
+          <w:lang w:val="en-US"/>
+        </w:rPr>
+        <w:t>tshark</w:t>
+      </w:r>
+      <w:proofErr w:type="spellEnd"/>
+      <w:r>
+        <w:rPr>
+          <w:b/>
+          <w:bCs/>
+          <w:lang w:val="en-US"/>
+        </w:rPr>
+        <w:t xml:space="preserve"> -r </w:t>
       </w:r>
       <w:r>
         <w:rPr>
@@ -4360,8 +5031,20 @@
           <w:bCs/>
           <w:lang w:val="en-US"/>
         </w:rPr>
-        <w:t>.pcap -q -z io,phs</w:t>
-      </w:r>
+        <w:t xml:space="preserve">.pcap -q -z </w:t>
+      </w:r>
+      <w:proofErr w:type="spellStart"/>
+      <w:proofErr w:type="gramStart"/>
+      <w:r>
+        <w:rPr>
+          <w:b/>
+          <w:bCs/>
+          <w:lang w:val="en-US"/>
+        </w:rPr>
+        <w:t>io,phs</w:t>
+      </w:r>
+      <w:proofErr w:type="spellEnd"/>
+      <w:proofErr w:type="gramEnd"/>
       <w:r>
         <w:rPr>
           <w:b/>
@@ -4400,6 +5083,7 @@
         <w:rPr>
           <w:b/>
           <w:bCs/>
+          <w:noProof/>
           <w:lang w:val="en-US"/>
         </w:rPr>
         <w:drawing>
@@ -4449,36 +5133,48 @@
         <w:rPr>
           <w:lang w:val="en-US"/>
         </w:rPr>
-        <w:t>-</w:t>
-      </w:r>
-      <w:r>
-        <w:rPr>
-          <w:lang w:val="en-US"/>
-        </w:rPr>
-        <w:t>append the ip conversations into the same file</w:t>
-      </w:r>
-      <w:r>
-        <w:rPr>
-          <w:lang w:val="en-US"/>
-        </w:rPr>
-        <w:t>:</w:t>
-      </w:r>
-    </w:p>
-    <w:p>
-      <w:pPr>
-        <w:rPr>
-          <w:b/>
-          <w:bCs/>
-          <w:lang w:val="en-US"/>
-        </w:rPr>
-      </w:pPr>
-      <w:r>
-        <w:rPr>
-          <w:b/>
-          <w:bCs/>
-          <w:lang w:val="en-US"/>
-        </w:rPr>
-        <w:t xml:space="preserve">tshark -r </w:t>
+        <w:t xml:space="preserve">-append the </w:t>
+      </w:r>
+      <w:proofErr w:type="spellStart"/>
+      <w:r>
+        <w:rPr>
+          <w:lang w:val="en-US"/>
+        </w:rPr>
+        <w:t>ip</w:t>
+      </w:r>
+      <w:proofErr w:type="spellEnd"/>
+      <w:r>
+        <w:rPr>
+          <w:lang w:val="en-US"/>
+        </w:rPr>
+        <w:t xml:space="preserve"> conversations into the same file:</w:t>
+      </w:r>
+    </w:p>
+    <w:p>
+      <w:pPr>
+        <w:rPr>
+          <w:b/>
+          <w:bCs/>
+          <w:lang w:val="en-US"/>
+        </w:rPr>
+      </w:pPr>
+      <w:proofErr w:type="spellStart"/>
+      <w:r>
+        <w:rPr>
+          <w:b/>
+          <w:bCs/>
+          <w:lang w:val="en-US"/>
+        </w:rPr>
+        <w:t>tshark</w:t>
+      </w:r>
+      <w:proofErr w:type="spellEnd"/>
+      <w:r>
+        <w:rPr>
+          <w:b/>
+          <w:bCs/>
+          <w:lang w:val="en-US"/>
+        </w:rPr>
+        <w:t xml:space="preserve"> -r </w:t>
       </w:r>
       <w:r>
         <w:rPr>
@@ -4497,53 +5193,25 @@
         </w:rPr>
         <w:t xml:space="preserve">.pcap -q -z </w:t>
       </w:r>
-      <w:r>
-        <w:rPr>
-          <w:b/>
-          <w:bCs/>
-          <w:lang w:val="en-US"/>
-        </w:rPr>
-        <w:t>conv</w:t>
-      </w:r>
-      <w:r>
-        <w:rPr>
-          <w:b/>
-          <w:bCs/>
-          <w:lang w:val="en-US"/>
-        </w:rPr>
-        <w:t>,</w:t>
-      </w:r>
-      <w:r>
-        <w:rPr>
-          <w:b/>
-          <w:bCs/>
-          <w:lang w:val="en-US"/>
-        </w:rPr>
-        <w:t>ip</w:t>
-      </w:r>
-      <w:r>
-        <w:rPr>
-          <w:b/>
-          <w:bCs/>
-          <w:lang w:val="en-US"/>
-        </w:rPr>
-        <w:t xml:space="preserve"> &gt;</w:t>
-      </w:r>
-      <w:r>
-        <w:rPr>
-          <w:b/>
-          <w:bCs/>
-          <w:lang w:val="en-US"/>
-        </w:rPr>
-        <w:t>&gt;</w:t>
-      </w:r>
-      <w:r>
-        <w:rPr>
-          <w:b/>
-          <w:bCs/>
-          <w:lang w:val="en-US"/>
-        </w:rPr>
-        <w:t xml:space="preserve"> </w:t>
+      <w:proofErr w:type="spellStart"/>
+      <w:proofErr w:type="gramStart"/>
+      <w:r>
+        <w:rPr>
+          <w:b/>
+          <w:bCs/>
+          <w:lang w:val="en-US"/>
+        </w:rPr>
+        <w:t>conv,ip</w:t>
+      </w:r>
+      <w:proofErr w:type="spellEnd"/>
+      <w:proofErr w:type="gramEnd"/>
+      <w:r>
+        <w:rPr>
+          <w:b/>
+          <w:bCs/>
+          <w:lang w:val="en-US"/>
+        </w:rPr>
+        <w:t xml:space="preserve"> &gt;&gt; </w:t>
       </w:r>
       <w:r>
         <w:rPr>
@@ -4575,6 +5243,7 @@
         <w:rPr>
           <w:b/>
           <w:bCs/>
+          <w:noProof/>
           <w:lang w:val="en-US"/>
         </w:rPr>
         <w:drawing>
@@ -4658,7 +5327,25 @@
           <w:bCs/>
           <w:lang w:val="en-US"/>
         </w:rPr>
-        <w:t xml:space="preserve">.txt | ollama run gemma4:26b </w:t>
+        <w:t xml:space="preserve">.txt | </w:t>
+      </w:r>
+      <w:proofErr w:type="spellStart"/>
+      <w:r>
+        <w:rPr>
+          <w:b/>
+          <w:bCs/>
+          <w:lang w:val="en-US"/>
+        </w:rPr>
+        <w:t>ollama</w:t>
+      </w:r>
+      <w:proofErr w:type="spellEnd"/>
+      <w:r>
+        <w:rPr>
+          <w:b/>
+          <w:bCs/>
+          <w:lang w:val="en-US"/>
+        </w:rPr>
+        <w:t xml:space="preserve"> run gemma4:26b </w:t>
       </w:r>
       <w:r>
         <w:rPr>
@@ -4669,6 +5356,7 @@
         </w:rPr>
         <w:t xml:space="preserve">where should we go next in the </w:t>
       </w:r>
+      <w:proofErr w:type="spellStart"/>
       <w:r>
         <w:rPr>
           <w:b/>
@@ -4685,17 +5373,28 @@
           <w:color w:val="47D459" w:themeColor="accent3" w:themeTint="99"/>
           <w:lang w:val="en-US"/>
         </w:rPr>
-        <w:t>cap investigation?</w:t>
-      </w:r>
-    </w:p>
-    <w:p>
-      <w:pPr>
-        <w:rPr>
-          <w:lang w:val="en-US"/>
-        </w:rPr>
-      </w:pPr>
-      <w:r>
-        <w:rPr>
+        <w:t>cap</w:t>
+      </w:r>
+      <w:proofErr w:type="spellEnd"/>
+      <w:r>
+        <w:rPr>
+          <w:b/>
+          <w:bCs/>
+          <w:color w:val="47D459" w:themeColor="accent3" w:themeTint="99"/>
+          <w:lang w:val="en-US"/>
+        </w:rPr>
+        <w:t xml:space="preserve"> investigation?</w:t>
+      </w:r>
+    </w:p>
+    <w:p>
+      <w:pPr>
+        <w:rPr>
+          <w:lang w:val="en-US"/>
+        </w:rPr>
+      </w:pPr>
+      <w:r>
+        <w:rPr>
+          <w:noProof/>
           <w:lang w:val="en-US"/>
         </w:rPr>
         <w:drawing>
@@ -4773,7 +5472,23 @@
         <w:rPr>
           <w:lang w:val="en-US"/>
         </w:rPr>
-        <w:t>, ofcourse we want to automate the selection of these protocols.</w:t>
+        <w:t xml:space="preserve">, </w:t>
+      </w:r>
+      <w:proofErr w:type="spellStart"/>
+      <w:proofErr w:type="gramStart"/>
+      <w:r>
+        <w:rPr>
+          <w:lang w:val="en-US"/>
+        </w:rPr>
+        <w:t>ofcourse</w:t>
+      </w:r>
+      <w:proofErr w:type="spellEnd"/>
+      <w:proofErr w:type="gramEnd"/>
+      <w:r>
+        <w:rPr>
+          <w:lang w:val="en-US"/>
+        </w:rPr>
+        <w:t xml:space="preserve"> we want to automate the selection of these protocols.</w:t>
       </w:r>
     </w:p>
     <w:p>
@@ -4785,13 +5500,23 @@
           <w:lang w:val="en-US"/>
         </w:rPr>
       </w:pPr>
-      <w:r>
-        <w:rPr>
-          <w:b/>
-          <w:bCs/>
-          <w:lang w:val="en-US"/>
-        </w:rPr>
-        <w:t xml:space="preserve">Tshark -r </w:t>
+      <w:proofErr w:type="spellStart"/>
+      <w:r>
+        <w:rPr>
+          <w:b/>
+          <w:bCs/>
+          <w:lang w:val="en-US"/>
+        </w:rPr>
+        <w:t>Tshark</w:t>
+      </w:r>
+      <w:proofErr w:type="spellEnd"/>
+      <w:r>
+        <w:rPr>
+          <w:b/>
+          <w:bCs/>
+          <w:lang w:val="en-US"/>
+        </w:rPr>
+        <w:t xml:space="preserve"> -r </w:t>
       </w:r>
       <w:r>
         <w:rPr>
@@ -4825,7 +5550,25 @@
           <w:bCs/>
           <w:lang w:val="en-US"/>
         </w:rPr>
-        <w:t xml:space="preserve">” | ollama run gemma4:26b </w:t>
+        <w:t xml:space="preserve">” | </w:t>
+      </w:r>
+      <w:proofErr w:type="spellStart"/>
+      <w:r>
+        <w:rPr>
+          <w:b/>
+          <w:bCs/>
+          <w:lang w:val="en-US"/>
+        </w:rPr>
+        <w:t>ollama</w:t>
+      </w:r>
+      <w:proofErr w:type="spellEnd"/>
+      <w:r>
+        <w:rPr>
+          <w:b/>
+          <w:bCs/>
+          <w:lang w:val="en-US"/>
+        </w:rPr>
+        <w:t xml:space="preserve"> run gemma4:26b </w:t>
       </w:r>
       <w:r>
         <w:rPr>
@@ -4845,6 +5588,7 @@
       </w:pPr>
       <w:r>
         <w:rPr>
+          <w:noProof/>
           <w:lang w:val="en-US"/>
         </w:rPr>
         <w:drawing>
@@ -4886,6 +5630,279 @@
     </w:p>
     <w:p>
       <w:pPr>
+        <w:pStyle w:val="Heading1"/>
+        <w:rPr>
+          <w:lang w:val="en-US"/>
+        </w:rPr>
+      </w:pPr>
+      <w:r>
+        <w:rPr>
+          <w:lang w:val="en-US"/>
+        </w:rPr>
+        <w:t>Disk Images</w:t>
+      </w:r>
+    </w:p>
+    <w:p>
+      <w:pPr>
+        <w:pStyle w:val="Heading2"/>
+        <w:rPr>
+          <w:lang w:val="en-US"/>
+        </w:rPr>
+      </w:pPr>
+    </w:p>
+    <w:p>
+      <w:pPr>
+        <w:pStyle w:val="Heading2"/>
+        <w:rPr>
+          <w:lang w:val="en-US"/>
+        </w:rPr>
+      </w:pPr>
+      <w:r>
+        <w:rPr>
+          <w:lang w:val="en-US"/>
+        </w:rPr>
+        <w:t>E01</w:t>
+      </w:r>
+    </w:p>
+    <w:p>
+      <w:pPr>
+        <w:rPr>
+          <w:lang w:val="en-US"/>
+        </w:rPr>
+      </w:pPr>
+      <w:r>
+        <w:rPr>
+          <w:lang w:val="en-US"/>
+        </w:rPr>
+        <w:t xml:space="preserve">-Convert an EnCase E01 to </w:t>
+      </w:r>
+      <w:proofErr w:type="gramStart"/>
+      <w:r>
+        <w:rPr>
+          <w:lang w:val="en-US"/>
+        </w:rPr>
+        <w:t>a .raw</w:t>
+      </w:r>
+      <w:proofErr w:type="gramEnd"/>
+      <w:r>
+        <w:rPr>
+          <w:lang w:val="en-US"/>
+        </w:rPr>
+        <w:t xml:space="preserve"> rile readable by foremost using ‘</w:t>
+      </w:r>
+      <w:proofErr w:type="spellStart"/>
+      <w:r>
+        <w:rPr>
+          <w:lang w:val="en-US"/>
+        </w:rPr>
+        <w:t>ewfexport</w:t>
+      </w:r>
+      <w:proofErr w:type="spellEnd"/>
+      <w:r>
+        <w:rPr>
+          <w:lang w:val="en-US"/>
+        </w:rPr>
+        <w:t>’</w:t>
+      </w:r>
+    </w:p>
+    <w:p>
+      <w:pPr>
+        <w:rPr>
+          <w:b/>
+          <w:bCs/>
+          <w:lang w:val="en-US"/>
+        </w:rPr>
+      </w:pPr>
+      <w:proofErr w:type="spellStart"/>
+      <w:r>
+        <w:rPr>
+          <w:b/>
+          <w:bCs/>
+          <w:lang w:val="en-US"/>
+        </w:rPr>
+        <w:t>e</w:t>
+      </w:r>
+      <w:r>
+        <w:rPr>
+          <w:b/>
+          <w:bCs/>
+          <w:lang w:val="en-US"/>
+        </w:rPr>
+        <w:t>wfexport</w:t>
+      </w:r>
+      <w:proofErr w:type="spellEnd"/>
+      <w:r>
+        <w:rPr>
+          <w:b/>
+          <w:bCs/>
+          <w:lang w:val="en-US"/>
+        </w:rPr>
+        <w:t xml:space="preserve"> </w:t>
+      </w:r>
+      <w:r>
+        <w:rPr>
+          <w:b/>
+          <w:bCs/>
+          <w:color w:val="47D459" w:themeColor="accent3" w:themeTint="99"/>
+          <w:lang w:val="en-US"/>
+        </w:rPr>
+        <w:t>drive1</w:t>
+      </w:r>
+      <w:r>
+        <w:rPr>
+          <w:b/>
+          <w:bCs/>
+          <w:lang w:val="en-US"/>
+        </w:rPr>
+        <w:t>.E01</w:t>
+      </w:r>
+    </w:p>
+    <w:p>
+      <w:pPr>
+        <w:rPr>
+          <w:lang w:val="en-US"/>
+        </w:rPr>
+      </w:pPr>
+      <w:r>
+        <w:rPr>
+          <w:lang w:val="en-US"/>
+        </w:rPr>
+        <w:t>-you’ll be prompted to input the file type, type “</w:t>
+      </w:r>
+      <w:r>
+        <w:rPr>
+          <w:b/>
+          <w:bCs/>
+          <w:lang w:val="en-US"/>
+        </w:rPr>
+        <w:t>raw</w:t>
+      </w:r>
+      <w:r>
+        <w:rPr>
+          <w:lang w:val="en-US"/>
+        </w:rPr>
+        <w:t>”</w:t>
+      </w:r>
+      <w:r>
+        <w:rPr>
+          <w:lang w:val="en-US"/>
+        </w:rPr>
+        <w:t>.</w:t>
+      </w:r>
+    </w:p>
+    <w:p>
+      <w:pPr>
+        <w:rPr>
+          <w:lang w:val="en-US"/>
+        </w:rPr>
+      </w:pPr>
+      <w:r>
+        <w:rPr>
+          <w:lang w:val="en-US"/>
+        </w:rPr>
+        <w:t xml:space="preserve">-you’ll be prompted to </w:t>
+      </w:r>
+      <w:r>
+        <w:rPr>
+          <w:lang w:val="en-US"/>
+        </w:rPr>
+        <w:t>name the file and directory, to place the .raw file in the current directory, just give the name of the file (</w:t>
+      </w:r>
+      <w:r>
+        <w:rPr>
+          <w:b/>
+          <w:bCs/>
+          <w:color w:val="47D459" w:themeColor="accent3" w:themeTint="99"/>
+          <w:lang w:val="en-US"/>
+        </w:rPr>
+        <w:t>drive1</w:t>
+      </w:r>
+      <w:r>
+        <w:rPr>
+          <w:color w:val="47D459" w:themeColor="accent3" w:themeTint="99"/>
+          <w:lang w:val="en-US"/>
+        </w:rPr>
+        <w:t xml:space="preserve"> </w:t>
+      </w:r>
+      <w:r>
+        <w:rPr>
+          <w:lang w:val="en-US"/>
+        </w:rPr>
+        <w:t>in this case)</w:t>
+      </w:r>
+      <w:r>
+        <w:rPr>
+          <w:lang w:val="en-US"/>
+        </w:rPr>
+        <w:t>.</w:t>
+      </w:r>
+    </w:p>
+    <w:p>
+      <w:pPr>
+        <w:rPr>
+          <w:lang w:val="en-US"/>
+        </w:rPr>
+      </w:pPr>
+      <w:r>
+        <w:rPr>
+          <w:lang w:val="en-US"/>
+        </w:rPr>
+        <w:t>-then press enter at the other prompts.</w:t>
+      </w:r>
+    </w:p>
+    <w:p>
+      <w:pPr>
+        <w:rPr>
+          <w:b/>
+          <w:bCs/>
+          <w:lang w:val="en-US"/>
+        </w:rPr>
+      </w:pPr>
+      <w:r>
+        <w:rPr>
+          <w:b/>
+          <w:bCs/>
+          <w:lang w:val="en-US"/>
+        </w:rPr>
+        <w:drawing>
+          <wp:inline distT="0" distB="0" distL="0" distR="0" wp14:anchorId="4CF74DE2" wp14:editId="3E4C55B8">
+            <wp:extent cx="5410200" cy="2666738"/>
+            <wp:effectExtent l="0" t="0" r="0" b="635"/>
+            <wp:docPr id="1591308239" name="Picture 1"/>
+            <wp:cNvGraphicFramePr>
+              <a:graphicFrameLocks xmlns:a="http://schemas.openxmlformats.org/drawingml/2006/main" noChangeAspect="1"/>
+            </wp:cNvGraphicFramePr>
+            <a:graphic xmlns:a="http://schemas.openxmlformats.org/drawingml/2006/main">
+              <a:graphicData uri="http://schemas.openxmlformats.org/drawingml/2006/picture">
+                <pic:pic xmlns:pic="http://schemas.openxmlformats.org/drawingml/2006/picture">
+                  <pic:nvPicPr>
+                    <pic:cNvPr id="1591308239" name=""/>
+                    <pic:cNvPicPr/>
+                  </pic:nvPicPr>
+                  <pic:blipFill>
+                    <a:blip r:embed="rId26"/>
+                    <a:stretch>
+                      <a:fillRect/>
+                    </a:stretch>
+                  </pic:blipFill>
+                  <pic:spPr>
+                    <a:xfrm>
+                      <a:off x="0" y="0"/>
+                      <a:ext cx="5411799" cy="2667526"/>
+                    </a:xfrm>
+                    <a:prstGeom prst="rect">
+                      <a:avLst/>
+                    </a:prstGeom>
+                  </pic:spPr>
+                </pic:pic>
+              </a:graphicData>
+            </a:graphic>
+          </wp:inline>
+        </w:drawing>
+      </w:r>
+    </w:p>
+    <w:p>
+      <w:pPr>
         <w:rPr>
           <w:lang w:val="en-US"/>
         </w:rPr>
@@ -4911,11 +5928,10 @@
 <file path=word/numbering.xml><?xml version="1.0" encoding="utf-8"?>
 <w:numbering xmlns:wpc="http://schemas.microsoft.com/office/word/2010/wordprocessingCanvas" xmlns:cx="http://schemas.microsoft.com/office/drawing/2014/chartex" xmlns:cx1="http://schemas.microsoft.com/office/drawing/2015/9/8/chartex" xmlns:cx2="http://schemas.microsoft.com/office/drawing/2015/10/21/chartex" xmlns:cx3="http://schemas.microsoft.com/office/drawing/2016/5/9/chartex" xmlns:cx4="http://schemas.microsoft.com/office/drawing/2016/5/10/chartex" xmlns:cx5="http://schemas.microsoft.com/office/drawing/2016/5/11/chartex" xmlns:cx6="http://schemas.microsoft.com/office/drawing/2016/5/12/chartex" xmlns:cx7="http://schemas.microsoft.com/office/drawing/2016/5/13/chartex" xmlns:cx8="http://schemas.microsoft.com/office/drawing/2016/5/14/chartex" xmlns:mc="http://schemas.openxmlformats.org/markup-compatibility/2006" xmlns:aink="http://schemas.microsoft.com/office/drawing/2016/ink" xmlns:am3d="http://schemas.microsoft.com/office/drawing/2017/model3d" xmlns:o="urn:schemas-microsoft-com:office:office" xmlns:oel="http://schemas.microsoft.com/office/2019/extlst" xmlns:r="http://schemas.openxmlformats.org/officeDocument/2006/relationships" xmlns:m="http://schemas.openxmlformats.org/officeDocument/2006/math" xmlns:v="urn:schemas-microsoft-com:vml" xmlns:wp14="http://schemas.microsoft.com/office/word/2010/wordprocessingDrawing" xmlns:wp="http://schemas.openxmlformats.org/drawingml/2006/wordprocessingDrawing" xmlns:w10="urn:schemas-microsoft-com:office:word" xmlns:w="http://schemas.openxmlformats.org/wordprocessingml/2006/main" xmlns:w14="http://schemas.microsoft.com/office/word/2010/wordml" xmlns:w15="http://schemas.microsoft.com/office/word/2012/wordml" xmlns:w16cex="http://schemas.microsoft.com/office/word/2018/wordml/cex" xmlns:w16cid="http://schemas.microsoft.com/office/word/2016/wordml/cid" xmlns:w16="http://schemas.microsoft.com/office/word/2018/wordml" xmlns:w16du="http://schemas.microsoft.com/office/word/2023/wordml/word16du" xmlns:w16sdtdh="http://schemas.microsoft.com/office/word/2020/wordml/sdtdatahash" xmlns:w16sdtfl="http://schemas.microsoft.com/office/word/2024/wordml/sdtformatlock" xmlns:w16se="http://schemas.microsoft.com/office/word/2015/wordml/symex" xmlns:wpg="http://schemas.microsoft.com/office/word/2010/wordprocessingGroup" xmlns:wpi="http://schemas.microsoft.com/office/word/2010/wordprocessingInk" xmlns:wne="http://schemas.microsoft.com/office/word/2006/wordml" xmlns:wps="http://schemas.microsoft.com/office/word/2010/wordprocessingShape" mc:Ignorable="w14 w15 w16se w16cid w16 w16cex w16sdtdh w16sdtfl w16du wp14">
   <w:abstractNum w:abstractNumId="0" w15:restartNumberingAfterBreak="0">
-    <w:nsid w:val="10471585"/>
+    <w:nsid w:val="0E0E5535"/>
     <w:multiLevelType w:val="hybridMultilevel"/>
-    <w:tmpl w:val="B9BE41FE"/>
-    <w:lvl w:ilvl="0" w:tplc="DA8A928E">
-      <w:start w:val="10"/>
+    <w:tmpl w:val="2C80756A"/>
+    <w:lvl w:ilvl="0" w:tplc="51D60696">
       <w:numFmt w:val="bullet"/>
       <w:lvlText w:val="-"/>
       <w:lvlJc w:val="left"/>
@@ -5024,10 +6040,11 @@
     </w:lvl>
   </w:abstractNum>
   <w:abstractNum w:abstractNumId="1" w15:restartNumberingAfterBreak="0">
-    <w:nsid w:val="26E97CE7"/>
+    <w:nsid w:val="10471585"/>
     <w:multiLevelType w:val="hybridMultilevel"/>
-    <w:tmpl w:val="1B50312A"/>
-    <w:lvl w:ilvl="0" w:tplc="A3604114">
+    <w:tmpl w:val="B9BE41FE"/>
+    <w:lvl w:ilvl="0" w:tplc="DA8A928E">
+      <w:start w:val="10"/>
       <w:numFmt w:val="bullet"/>
       <w:lvlText w:val="-"/>
       <w:lvlJc w:val="left"/>
@@ -5136,11 +6153,10 @@
     </w:lvl>
   </w:abstractNum>
   <w:abstractNum w:abstractNumId="2" w15:restartNumberingAfterBreak="0">
-    <w:nsid w:val="2C823C59"/>
+    <w:nsid w:val="26E97CE7"/>
     <w:multiLevelType w:val="hybridMultilevel"/>
-    <w:tmpl w:val="37FE686C"/>
-    <w:lvl w:ilvl="0" w:tplc="C55A8664">
-      <w:start w:val="2"/>
+    <w:tmpl w:val="1B50312A"/>
+    <w:lvl w:ilvl="0" w:tplc="A3604114">
       <w:numFmt w:val="bullet"/>
       <w:lvlText w:val="-"/>
       <w:lvlJc w:val="left"/>
@@ -5249,10 +6265,10 @@
     </w:lvl>
   </w:abstractNum>
   <w:abstractNum w:abstractNumId="3" w15:restartNumberingAfterBreak="0">
-    <w:nsid w:val="61F25AD8"/>
+    <w:nsid w:val="2C823C59"/>
     <w:multiLevelType w:val="hybridMultilevel"/>
-    <w:tmpl w:val="12CEDAC6"/>
-    <w:lvl w:ilvl="0" w:tplc="4E04755E">
+    <w:tmpl w:val="37FE686C"/>
+    <w:lvl w:ilvl="0" w:tplc="C55A8664">
       <w:start w:val="2"/>
       <w:numFmt w:val="bullet"/>
       <w:lvlText w:val="-"/>
@@ -5362,10 +6378,10 @@
     </w:lvl>
   </w:abstractNum>
   <w:abstractNum w:abstractNumId="4" w15:restartNumberingAfterBreak="0">
-    <w:nsid w:val="778A3759"/>
+    <w:nsid w:val="61F25AD8"/>
     <w:multiLevelType w:val="hybridMultilevel"/>
-    <w:tmpl w:val="E870BBB0"/>
-    <w:lvl w:ilvl="0" w:tplc="A104C756">
+    <w:tmpl w:val="12CEDAC6"/>
+    <w:lvl w:ilvl="0" w:tplc="4E04755E">
       <w:start w:val="2"/>
       <w:numFmt w:val="bullet"/>
       <w:lvlText w:val="-"/>
@@ -5474,19 +6490,135 @@
       </w:rPr>
     </w:lvl>
   </w:abstractNum>
+  <w:abstractNum w:abstractNumId="5" w15:restartNumberingAfterBreak="0">
+    <w:nsid w:val="778A3759"/>
+    <w:multiLevelType w:val="hybridMultilevel"/>
+    <w:tmpl w:val="E870BBB0"/>
+    <w:lvl w:ilvl="0" w:tplc="A104C756">
+      <w:start w:val="2"/>
+      <w:numFmt w:val="bullet"/>
+      <w:lvlText w:val="-"/>
+      <w:lvlJc w:val="left"/>
+      <w:pPr>
+        <w:ind w:left="720" w:hanging="360"/>
+      </w:pPr>
+      <w:rPr>
+        <w:rFonts w:ascii="Aptos" w:eastAsiaTheme="minorHAnsi" w:hAnsi="Aptos" w:cstheme="minorBidi" w:hint="default"/>
+      </w:rPr>
+    </w:lvl>
+    <w:lvl w:ilvl="1" w:tplc="14090003" w:tentative="1">
+      <w:start w:val="1"/>
+      <w:numFmt w:val="bullet"/>
+      <w:lvlText w:val="o"/>
+      <w:lvlJc w:val="left"/>
+      <w:pPr>
+        <w:ind w:left="1440" w:hanging="360"/>
+      </w:pPr>
+      <w:rPr>
+        <w:rFonts w:ascii="Courier New" w:hAnsi="Courier New" w:cs="Courier New" w:hint="default"/>
+      </w:rPr>
+    </w:lvl>
+    <w:lvl w:ilvl="2" w:tplc="14090005" w:tentative="1">
+      <w:start w:val="1"/>
+      <w:numFmt w:val="bullet"/>
+      <w:lvlText w:val=""/>
+      <w:lvlJc w:val="left"/>
+      <w:pPr>
+        <w:ind w:left="2160" w:hanging="360"/>
+      </w:pPr>
+      <w:rPr>
+        <w:rFonts w:ascii="Wingdings" w:hAnsi="Wingdings" w:hint="default"/>
+      </w:rPr>
+    </w:lvl>
+    <w:lvl w:ilvl="3" w:tplc="14090001" w:tentative="1">
+      <w:start w:val="1"/>
+      <w:numFmt w:val="bullet"/>
+      <w:lvlText w:val=""/>
+      <w:lvlJc w:val="left"/>
+      <w:pPr>
+        <w:ind w:left="2880" w:hanging="360"/>
+      </w:pPr>
+      <w:rPr>
+        <w:rFonts w:ascii="Symbol" w:hAnsi="Symbol" w:hint="default"/>
+      </w:rPr>
+    </w:lvl>
+    <w:lvl w:ilvl="4" w:tplc="14090003" w:tentative="1">
+      <w:start w:val="1"/>
+      <w:numFmt w:val="bullet"/>
+      <w:lvlText w:val="o"/>
+      <w:lvlJc w:val="left"/>
+      <w:pPr>
+        <w:ind w:left="3600" w:hanging="360"/>
+      </w:pPr>
+      <w:rPr>
+        <w:rFonts w:ascii="Courier New" w:hAnsi="Courier New" w:cs="Courier New" w:hint="default"/>
+      </w:rPr>
+    </w:lvl>
+    <w:lvl w:ilvl="5" w:tplc="14090005" w:tentative="1">
+      <w:start w:val="1"/>
+      <w:numFmt w:val="bullet"/>
+      <w:lvlText w:val=""/>
+      <w:lvlJc w:val="left"/>
+      <w:pPr>
+        <w:ind w:left="4320" w:hanging="360"/>
+      </w:pPr>
+      <w:rPr>
+        <w:rFonts w:ascii="Wingdings" w:hAnsi="Wingdings" w:hint="default"/>
+      </w:rPr>
+    </w:lvl>
+    <w:lvl w:ilvl="6" w:tplc="14090001" w:tentative="1">
+      <w:start w:val="1"/>
+      <w:numFmt w:val="bullet"/>
+      <w:lvlText w:val=""/>
+      <w:lvlJc w:val="left"/>
+      <w:pPr>
+        <w:ind w:left="5040" w:hanging="360"/>
+      </w:pPr>
+      <w:rPr>
+        <w:rFonts w:ascii="Symbol" w:hAnsi="Symbol" w:hint="default"/>
+      </w:rPr>
+    </w:lvl>
+    <w:lvl w:ilvl="7" w:tplc="14090003" w:tentative="1">
+      <w:start w:val="1"/>
+      <w:numFmt w:val="bullet"/>
+      <w:lvlText w:val="o"/>
+      <w:lvlJc w:val="left"/>
+      <w:pPr>
+        <w:ind w:left="5760" w:hanging="360"/>
+      </w:pPr>
+      <w:rPr>
+        <w:rFonts w:ascii="Courier New" w:hAnsi="Courier New" w:cs="Courier New" w:hint="default"/>
+      </w:rPr>
+    </w:lvl>
+    <w:lvl w:ilvl="8" w:tplc="14090005" w:tentative="1">
+      <w:start w:val="1"/>
+      <w:numFmt w:val="bullet"/>
+      <w:lvlText w:val=""/>
+      <w:lvlJc w:val="left"/>
+      <w:pPr>
+        <w:ind w:left="6480" w:hanging="360"/>
+      </w:pPr>
+      <w:rPr>
+        <w:rFonts w:ascii="Wingdings" w:hAnsi="Wingdings" w:hint="default"/>
+      </w:rPr>
+    </w:lvl>
+  </w:abstractNum>
   <w:num w:numId="1" w16cid:durableId="1140266764">
+    <w:abstractNumId w:val="2"/>
+  </w:num>
+  <w:num w:numId="2" w16cid:durableId="2037808572">
+    <w:abstractNumId w:val="3"/>
+  </w:num>
+  <w:num w:numId="3" w16cid:durableId="1909226655">
+    <w:abstractNumId w:val="4"/>
+  </w:num>
+  <w:num w:numId="4" w16cid:durableId="610867326">
+    <w:abstractNumId w:val="5"/>
+  </w:num>
+  <w:num w:numId="5" w16cid:durableId="967129457">
     <w:abstractNumId w:val="1"/>
   </w:num>
-  <w:num w:numId="2" w16cid:durableId="2037808572">
-    <w:abstractNumId w:val="2"/>
-  </w:num>
-  <w:num w:numId="3" w16cid:durableId="1909226655">
-    <w:abstractNumId w:val="3"/>
-  </w:num>
-  <w:num w:numId="4" w16cid:durableId="610867326">
-    <w:abstractNumId w:val="4"/>
-  </w:num>
-  <w:num w:numId="5" w16cid:durableId="967129457">
+  <w:num w:numId="6" w16cid:durableId="770273721">
     <w:abstractNumId w:val="0"/>
   </w:num>
 </w:numbering>

</xml_diff>

<commit_message>
added effort to my emerging insights and foremost script sections of tthe mid project presentation, updated weekly log
</commit_message>
<xml_diff>
--- a/File Processing Guide v0.1.docx
+++ b/File Processing Guide v0.1.docx
@@ -9,7 +9,7 @@
           <w:lang w:val="en-US"/>
         </w:rPr>
       </w:pPr>
-      <w:bookmarkStart w:id="0" w:name="_Toc239518449"/>
+      <w:bookmarkStart w:id="0" w:name="_Toc239750527"/>
       <w:r>
         <w:rPr>
           <w:lang w:val="en-US"/>
@@ -333,7 +333,7 @@
           <w:r>
             <w:fldChar w:fldCharType="separate"/>
           </w:r>
-          <w:hyperlink w:anchor="_Toc239518449" w:history="1">
+          <w:hyperlink w:anchor="_Toc239750527" w:history="1">
             <w:r>
               <w:rPr>
                 <w:rStyle w:val="Hyperlink"/>
@@ -361,7 +361,7 @@
                 <w:noProof/>
                 <w:webHidden/>
               </w:rPr>
-              <w:instrText xml:space="preserve"> PAGEREF _Toc239518449 \h </w:instrText>
+              <w:instrText xml:space="preserve"> PAGEREF _Toc239750527 \h </w:instrText>
             </w:r>
             <w:r>
               <w:rPr>
@@ -404,7 +404,7 @@
               <w:lang w:eastAsia="en-NZ"/>
             </w:rPr>
           </w:pPr>
-          <w:hyperlink w:anchor="_Toc239518450" w:history="1">
+          <w:hyperlink w:anchor="_Toc239750528" w:history="1">
             <w:r>
               <w:rPr>
                 <w:rStyle w:val="Hyperlink"/>
@@ -432,7 +432,7 @@
                 <w:noProof/>
                 <w:webHidden/>
               </w:rPr>
-              <w:instrText xml:space="preserve"> PAGEREF _Toc239518450 \h </w:instrText>
+              <w:instrText xml:space="preserve"> PAGEREF _Toc239750528 \h </w:instrText>
             </w:r>
             <w:r>
               <w:rPr>
@@ -475,7 +475,7 @@
               <w:lang w:eastAsia="en-NZ"/>
             </w:rPr>
           </w:pPr>
-          <w:hyperlink w:anchor="_Toc239518451" w:history="1">
+          <w:hyperlink w:anchor="_Toc239750529" w:history="1">
             <w:r>
               <w:rPr>
                 <w:rStyle w:val="Hyperlink"/>
@@ -503,7 +503,7 @@
                 <w:noProof/>
                 <w:webHidden/>
               </w:rPr>
-              <w:instrText xml:space="preserve"> PAGEREF _Toc239518451 \h </w:instrText>
+              <w:instrText xml:space="preserve"> PAGEREF _Toc239750529 \h </w:instrText>
             </w:r>
             <w:r>
               <w:rPr>
@@ -546,7 +546,7 @@
               <w:lang w:eastAsia="en-NZ"/>
             </w:rPr>
           </w:pPr>
-          <w:hyperlink w:anchor="_Toc239518452" w:history="1">
+          <w:hyperlink w:anchor="_Toc239750530" w:history="1">
             <w:r>
               <w:rPr>
                 <w:rStyle w:val="Hyperlink"/>
@@ -574,7 +574,7 @@
                 <w:noProof/>
                 <w:webHidden/>
               </w:rPr>
-              <w:instrText xml:space="preserve"> PAGEREF _Toc239518452 \h </w:instrText>
+              <w:instrText xml:space="preserve"> PAGEREF _Toc239750530 \h </w:instrText>
             </w:r>
             <w:r>
               <w:rPr>
@@ -617,7 +617,7 @@
               <w:lang w:eastAsia="en-NZ"/>
             </w:rPr>
           </w:pPr>
-          <w:hyperlink w:anchor="_Toc239518453" w:history="1">
+          <w:hyperlink w:anchor="_Toc239750531" w:history="1">
             <w:r>
               <w:rPr>
                 <w:rStyle w:val="Hyperlink"/>
@@ -645,7 +645,7 @@
                 <w:noProof/>
                 <w:webHidden/>
               </w:rPr>
-              <w:instrText xml:space="preserve"> PAGEREF _Toc239518453 \h </w:instrText>
+              <w:instrText xml:space="preserve"> PAGEREF _Toc239750531 \h </w:instrText>
             </w:r>
             <w:r>
               <w:rPr>
@@ -688,7 +688,7 @@
               <w:lang w:eastAsia="en-NZ"/>
             </w:rPr>
           </w:pPr>
-          <w:hyperlink w:anchor="_Toc239518454" w:history="1">
+          <w:hyperlink w:anchor="_Toc239750532" w:history="1">
             <w:r>
               <w:rPr>
                 <w:rStyle w:val="Hyperlink"/>
@@ -716,7 +716,78 @@
                 <w:noProof/>
                 <w:webHidden/>
               </w:rPr>
-              <w:instrText xml:space="preserve"> PAGEREF _Toc239518454 \h </w:instrText>
+              <w:instrText xml:space="preserve"> PAGEREF _Toc239750532 \h </w:instrText>
+            </w:r>
+            <w:r>
+              <w:rPr>
+                <w:noProof/>
+                <w:webHidden/>
+              </w:rPr>
+            </w:r>
+            <w:r>
+              <w:rPr>
+                <w:noProof/>
+                <w:webHidden/>
+              </w:rPr>
+              <w:fldChar w:fldCharType="separate"/>
+            </w:r>
+            <w:r>
+              <w:rPr>
+                <w:noProof/>
+                <w:webHidden/>
+              </w:rPr>
+              <w:t>4</w:t>
+            </w:r>
+            <w:r>
+              <w:rPr>
+                <w:noProof/>
+                <w:webHidden/>
+              </w:rPr>
+              <w:fldChar w:fldCharType="end"/>
+            </w:r>
+          </w:hyperlink>
+        </w:p>
+        <w:p>
+          <w:pPr>
+            <w:pStyle w:val="TOC2"/>
+            <w:tabs>
+              <w:tab w:val="right" w:leader="dot" w:pos="9016"/>
+            </w:tabs>
+            <w:rPr>
+              <w:rFonts w:eastAsiaTheme="minorEastAsia"/>
+              <w:noProof/>
+              <w:lang w:eastAsia="en-NZ"/>
+            </w:rPr>
+          </w:pPr>
+          <w:hyperlink w:anchor="_Toc239750533" w:history="1">
+            <w:r>
+              <w:rPr>
+                <w:rStyle w:val="Hyperlink"/>
+                <w:noProof/>
+                <w:lang w:val="en-US"/>
+              </w:rPr>
+              <w:t>BZ2</w:t>
+            </w:r>
+            <w:r>
+              <w:rPr>
+                <w:noProof/>
+                <w:webHidden/>
+              </w:rPr>
+              <w:tab/>
+            </w:r>
+            <w:r>
+              <w:rPr>
+                <w:noProof/>
+                <w:webHidden/>
+              </w:rPr>
+              <w:fldChar w:fldCharType="begin"/>
+            </w:r>
+            <w:r>
+              <w:rPr>
+                <w:noProof/>
+                <w:webHidden/>
+              </w:rPr>
+              <w:instrText xml:space="preserve"> PAGEREF _Toc239750533 \h </w:instrText>
             </w:r>
             <w:r>
               <w:rPr>
@@ -759,7 +830,7 @@
               <w:lang w:eastAsia="en-NZ"/>
             </w:rPr>
           </w:pPr>
-          <w:hyperlink w:anchor="_Toc239518455" w:history="1">
+          <w:hyperlink w:anchor="_Toc239750534" w:history="1">
             <w:r>
               <w:rPr>
                 <w:rStyle w:val="Hyperlink"/>
@@ -787,7 +858,7 @@
                 <w:noProof/>
                 <w:webHidden/>
               </w:rPr>
-              <w:instrText xml:space="preserve"> PAGEREF _Toc239518455 \h </w:instrText>
+              <w:instrText xml:space="preserve"> PAGEREF _Toc239750534 \h </w:instrText>
             </w:r>
             <w:r>
               <w:rPr>
@@ -830,7 +901,7 @@
               <w:lang w:eastAsia="en-NZ"/>
             </w:rPr>
           </w:pPr>
-          <w:hyperlink w:anchor="_Toc239518456" w:history="1">
+          <w:hyperlink w:anchor="_Toc239750535" w:history="1">
             <w:r>
               <w:rPr>
                 <w:rStyle w:val="Hyperlink"/>
@@ -858,7 +929,7 @@
                 <w:noProof/>
                 <w:webHidden/>
               </w:rPr>
-              <w:instrText xml:space="preserve"> PAGEREF _Toc239518456 \h </w:instrText>
+              <w:instrText xml:space="preserve"> PAGEREF _Toc239750535 \h </w:instrText>
             </w:r>
             <w:r>
               <w:rPr>
@@ -901,7 +972,7 @@
               <w:lang w:eastAsia="en-NZ"/>
             </w:rPr>
           </w:pPr>
-          <w:hyperlink w:anchor="_Toc239518457" w:history="1">
+          <w:hyperlink w:anchor="_Toc239750536" w:history="1">
             <w:r>
               <w:rPr>
                 <w:rStyle w:val="Hyperlink"/>
@@ -929,7 +1000,7 @@
                 <w:noProof/>
                 <w:webHidden/>
               </w:rPr>
-              <w:instrText xml:space="preserve"> PAGEREF _Toc239518457 \h </w:instrText>
+              <w:instrText xml:space="preserve"> PAGEREF _Toc239750536 \h </w:instrText>
             </w:r>
             <w:r>
               <w:rPr>
@@ -972,7 +1043,7 @@
               <w:lang w:eastAsia="en-NZ"/>
             </w:rPr>
           </w:pPr>
-          <w:hyperlink w:anchor="_Toc239518458" w:history="1">
+          <w:hyperlink w:anchor="_Toc239750537" w:history="1">
             <w:r>
               <w:rPr>
                 <w:rStyle w:val="Hyperlink"/>
@@ -1000,7 +1071,7 @@
                 <w:noProof/>
                 <w:webHidden/>
               </w:rPr>
-              <w:instrText xml:space="preserve"> PAGEREF _Toc239518458 \h </w:instrText>
+              <w:instrText xml:space="preserve"> PAGEREF _Toc239750537 \h </w:instrText>
             </w:r>
             <w:r>
               <w:rPr>
@@ -1043,7 +1114,7 @@
               <w:lang w:eastAsia="en-NZ"/>
             </w:rPr>
           </w:pPr>
-          <w:hyperlink w:anchor="_Toc239518459" w:history="1">
+          <w:hyperlink w:anchor="_Toc239750538" w:history="1">
             <w:r>
               <w:rPr>
                 <w:rStyle w:val="Hyperlink"/>
@@ -1071,7 +1142,7 @@
                 <w:noProof/>
                 <w:webHidden/>
               </w:rPr>
-              <w:instrText xml:space="preserve"> PAGEREF _Toc239518459 \h </w:instrText>
+              <w:instrText xml:space="preserve"> PAGEREF _Toc239750538 \h </w:instrText>
             </w:r>
             <w:r>
               <w:rPr>
@@ -1114,7 +1185,7 @@
               <w:lang w:eastAsia="en-NZ"/>
             </w:rPr>
           </w:pPr>
-          <w:hyperlink w:anchor="_Toc239518460" w:history="1">
+          <w:hyperlink w:anchor="_Toc239750539" w:history="1">
             <w:r>
               <w:rPr>
                 <w:rStyle w:val="Hyperlink"/>
@@ -1142,7 +1213,7 @@
                 <w:noProof/>
                 <w:webHidden/>
               </w:rPr>
-              <w:instrText xml:space="preserve"> PAGEREF _Toc239518460 \h </w:instrText>
+              <w:instrText xml:space="preserve"> PAGEREF _Toc239750539 \h </w:instrText>
             </w:r>
             <w:r>
               <w:rPr>
@@ -1185,7 +1256,7 @@
               <w:lang w:eastAsia="en-NZ"/>
             </w:rPr>
           </w:pPr>
-          <w:hyperlink w:anchor="_Toc239518461" w:history="1">
+          <w:hyperlink w:anchor="_Toc239750540" w:history="1">
             <w:r>
               <w:rPr>
                 <w:rStyle w:val="Hyperlink"/>
@@ -1213,7 +1284,7 @@
                 <w:noProof/>
                 <w:webHidden/>
               </w:rPr>
-              <w:instrText xml:space="preserve"> PAGEREF _Toc239518461 \h </w:instrText>
+              <w:instrText xml:space="preserve"> PAGEREF _Toc239750540 \h </w:instrText>
             </w:r>
             <w:r>
               <w:rPr>
@@ -1256,7 +1327,7 @@
               <w:lang w:eastAsia="en-NZ"/>
             </w:rPr>
           </w:pPr>
-          <w:hyperlink w:anchor="_Toc239518462" w:history="1">
+          <w:hyperlink w:anchor="_Toc239750541" w:history="1">
             <w:r>
               <w:rPr>
                 <w:rStyle w:val="Hyperlink"/>
@@ -1284,7 +1355,7 @@
                 <w:noProof/>
                 <w:webHidden/>
               </w:rPr>
-              <w:instrText xml:space="preserve"> PAGEREF _Toc239518462 \h </w:instrText>
+              <w:instrText xml:space="preserve"> PAGEREF _Toc239750541 \h </w:instrText>
             </w:r>
             <w:r>
               <w:rPr>
@@ -1327,7 +1398,7 @@
               <w:lang w:eastAsia="en-NZ"/>
             </w:rPr>
           </w:pPr>
-          <w:hyperlink w:anchor="_Toc239518463" w:history="1">
+          <w:hyperlink w:anchor="_Toc239750542" w:history="1">
             <w:r>
               <w:rPr>
                 <w:rStyle w:val="Hyperlink"/>
@@ -1355,7 +1426,7 @@
                 <w:noProof/>
                 <w:webHidden/>
               </w:rPr>
-              <w:instrText xml:space="preserve"> PAGEREF _Toc239518463 \h </w:instrText>
+              <w:instrText xml:space="preserve"> PAGEREF _Toc239750542 \h </w:instrText>
             </w:r>
             <w:r>
               <w:rPr>
@@ -1398,7 +1469,7 @@
               <w:lang w:eastAsia="en-NZ"/>
             </w:rPr>
           </w:pPr>
-          <w:hyperlink w:anchor="_Toc239518464" w:history="1">
+          <w:hyperlink w:anchor="_Toc239750543" w:history="1">
             <w:r>
               <w:rPr>
                 <w:rStyle w:val="Hyperlink"/>
@@ -1426,7 +1497,7 @@
                 <w:noProof/>
                 <w:webHidden/>
               </w:rPr>
-              <w:instrText xml:space="preserve"> PAGEREF _Toc239518464 \h </w:instrText>
+              <w:instrText xml:space="preserve"> PAGEREF _Toc239750543 \h </w:instrText>
             </w:r>
             <w:r>
               <w:rPr>
@@ -1469,7 +1540,7 @@
               <w:lang w:eastAsia="en-NZ"/>
             </w:rPr>
           </w:pPr>
-          <w:hyperlink w:anchor="_Toc239518465" w:history="1">
+          <w:hyperlink w:anchor="_Toc239750544" w:history="1">
             <w:r>
               <w:rPr>
                 <w:rStyle w:val="Hyperlink"/>
@@ -1497,7 +1568,7 @@
                 <w:noProof/>
                 <w:webHidden/>
               </w:rPr>
-              <w:instrText xml:space="preserve"> PAGEREF _Toc239518465 \h </w:instrText>
+              <w:instrText xml:space="preserve"> PAGEREF _Toc239750544 \h </w:instrText>
             </w:r>
             <w:r>
               <w:rPr>
@@ -1540,7 +1611,7 @@
               <w:lang w:eastAsia="en-NZ"/>
             </w:rPr>
           </w:pPr>
-          <w:hyperlink w:anchor="_Toc239518466" w:history="1">
+          <w:hyperlink w:anchor="_Toc239750545" w:history="1">
             <w:r>
               <w:rPr>
                 <w:rStyle w:val="Hyperlink"/>
@@ -1568,7 +1639,7 @@
                 <w:noProof/>
                 <w:webHidden/>
               </w:rPr>
-              <w:instrText xml:space="preserve"> PAGEREF _Toc239518466 \h </w:instrText>
+              <w:instrText xml:space="preserve"> PAGEREF _Toc239750545 \h </w:instrText>
             </w:r>
             <w:r>
               <w:rPr>
@@ -1611,7 +1682,7 @@
               <w:lang w:eastAsia="en-NZ"/>
             </w:rPr>
           </w:pPr>
-          <w:hyperlink w:anchor="_Toc239518467" w:history="1">
+          <w:hyperlink w:anchor="_Toc239750546" w:history="1">
             <w:r>
               <w:rPr>
                 <w:rStyle w:val="Hyperlink"/>
@@ -1639,7 +1710,7 @@
                 <w:noProof/>
                 <w:webHidden/>
               </w:rPr>
-              <w:instrText xml:space="preserve"> PAGEREF _Toc239518467 \h </w:instrText>
+              <w:instrText xml:space="preserve"> PAGEREF _Toc239750546 \h </w:instrText>
             </w:r>
             <w:r>
               <w:rPr>
@@ -1660,6 +1731,148 @@
                 <w:webHidden/>
               </w:rPr>
               <w:t>8</w:t>
+            </w:r>
+            <w:r>
+              <w:rPr>
+                <w:noProof/>
+                <w:webHidden/>
+              </w:rPr>
+              <w:fldChar w:fldCharType="end"/>
+            </w:r>
+          </w:hyperlink>
+        </w:p>
+        <w:p>
+          <w:pPr>
+            <w:pStyle w:val="TOC1"/>
+            <w:tabs>
+              <w:tab w:val="right" w:leader="dot" w:pos="9016"/>
+            </w:tabs>
+            <w:rPr>
+              <w:rFonts w:eastAsiaTheme="minorEastAsia"/>
+              <w:noProof/>
+              <w:lang w:eastAsia="en-NZ"/>
+            </w:rPr>
+          </w:pPr>
+          <w:hyperlink w:anchor="_Toc239750547" w:history="1">
+            <w:r>
+              <w:rPr>
+                <w:rStyle w:val="Hyperlink"/>
+                <w:noProof/>
+                <w:lang w:val="en-US"/>
+              </w:rPr>
+              <w:t>Disk Images</w:t>
+            </w:r>
+            <w:r>
+              <w:rPr>
+                <w:noProof/>
+                <w:webHidden/>
+              </w:rPr>
+              <w:tab/>
+            </w:r>
+            <w:r>
+              <w:rPr>
+                <w:noProof/>
+                <w:webHidden/>
+              </w:rPr>
+              <w:fldChar w:fldCharType="begin"/>
+            </w:r>
+            <w:r>
+              <w:rPr>
+                <w:noProof/>
+                <w:webHidden/>
+              </w:rPr>
+              <w:instrText xml:space="preserve"> PAGEREF _Toc239750547 \h </w:instrText>
+            </w:r>
+            <w:r>
+              <w:rPr>
+                <w:noProof/>
+                <w:webHidden/>
+              </w:rPr>
+            </w:r>
+            <w:r>
+              <w:rPr>
+                <w:noProof/>
+                <w:webHidden/>
+              </w:rPr>
+              <w:fldChar w:fldCharType="separate"/>
+            </w:r>
+            <w:r>
+              <w:rPr>
+                <w:noProof/>
+                <w:webHidden/>
+              </w:rPr>
+              <w:t>9</w:t>
+            </w:r>
+            <w:r>
+              <w:rPr>
+                <w:noProof/>
+                <w:webHidden/>
+              </w:rPr>
+              <w:fldChar w:fldCharType="end"/>
+            </w:r>
+          </w:hyperlink>
+        </w:p>
+        <w:p>
+          <w:pPr>
+            <w:pStyle w:val="TOC2"/>
+            <w:tabs>
+              <w:tab w:val="right" w:leader="dot" w:pos="9016"/>
+            </w:tabs>
+            <w:rPr>
+              <w:rFonts w:eastAsiaTheme="minorEastAsia"/>
+              <w:noProof/>
+              <w:lang w:eastAsia="en-NZ"/>
+            </w:rPr>
+          </w:pPr>
+          <w:hyperlink w:anchor="_Toc239750548" w:history="1">
+            <w:r>
+              <w:rPr>
+                <w:rStyle w:val="Hyperlink"/>
+                <w:noProof/>
+                <w:lang w:val="en-US"/>
+              </w:rPr>
+              <w:t>E01</w:t>
+            </w:r>
+            <w:r>
+              <w:rPr>
+                <w:noProof/>
+                <w:webHidden/>
+              </w:rPr>
+              <w:tab/>
+            </w:r>
+            <w:r>
+              <w:rPr>
+                <w:noProof/>
+                <w:webHidden/>
+              </w:rPr>
+              <w:fldChar w:fldCharType="begin"/>
+            </w:r>
+            <w:r>
+              <w:rPr>
+                <w:noProof/>
+                <w:webHidden/>
+              </w:rPr>
+              <w:instrText xml:space="preserve"> PAGEREF _Toc239750548 \h </w:instrText>
+            </w:r>
+            <w:r>
+              <w:rPr>
+                <w:noProof/>
+                <w:webHidden/>
+              </w:rPr>
+            </w:r>
+            <w:r>
+              <w:rPr>
+                <w:noProof/>
+                <w:webHidden/>
+              </w:rPr>
+              <w:fldChar w:fldCharType="separate"/>
+            </w:r>
+            <w:r>
+              <w:rPr>
+                <w:noProof/>
+                <w:webHidden/>
+              </w:rPr>
+              <w:t>9</w:t>
             </w:r>
             <w:r>
               <w:rPr>
@@ -1766,7 +1979,7 @@
           <w:lang w:val="en-US"/>
         </w:rPr>
       </w:pPr>
-      <w:bookmarkStart w:id="1" w:name="_Toc239518450"/>
+      <w:bookmarkStart w:id="1" w:name="_Toc239750528"/>
       <w:r>
         <w:rPr>
           <w:lang w:val="en-US"/>
@@ -1835,7 +2048,7 @@
         </w:rPr>
       </w:pPr>
       <w:bookmarkStart w:id="2" w:name="_Toc239337273"/>
-      <w:bookmarkStart w:id="3" w:name="_Toc239518451"/>
+      <w:bookmarkStart w:id="3" w:name="_Toc239750529"/>
       <w:r>
         <w:rPr>
           <w:lang w:val="en-US"/>
@@ -2469,7 +2682,7 @@
           <w:lang w:val="en-US"/>
         </w:rPr>
       </w:pPr>
-      <w:bookmarkStart w:id="4" w:name="_Toc239518452"/>
+      <w:bookmarkStart w:id="4" w:name="_Toc239750530"/>
       <w:r>
         <w:rPr>
           <w:lang w:val="en-US"/>
@@ -2485,7 +2698,7 @@
           <w:lang w:val="en-US"/>
         </w:rPr>
       </w:pPr>
-      <w:bookmarkStart w:id="5" w:name="_Toc239518453"/>
+      <w:bookmarkStart w:id="5" w:name="_Toc239750531"/>
       <w:r>
         <w:rPr>
           <w:lang w:val="en-US"/>
@@ -2707,7 +2920,7 @@
           <w:lang w:val="en-US"/>
         </w:rPr>
       </w:pPr>
-      <w:bookmarkStart w:id="6" w:name="_Toc239518454"/>
+      <w:bookmarkStart w:id="6" w:name="_Toc239750532"/>
       <w:r>
         <w:rPr>
           <w:lang w:val="en-US"/>
@@ -2891,12 +3104,14 @@
           <w:lang w:val="en-US"/>
         </w:rPr>
       </w:pPr>
+      <w:bookmarkStart w:id="7" w:name="_Toc239750533"/>
       <w:r>
         <w:rPr>
           <w:lang w:val="en-US"/>
         </w:rPr>
         <w:t>BZ2</w:t>
       </w:r>
+      <w:bookmarkEnd w:id="7"/>
     </w:p>
     <w:p>
       <w:pPr>
@@ -2970,15 +3185,14 @@
           <w:lang w:val="en-US"/>
         </w:rPr>
       </w:pPr>
-      <w:bookmarkStart w:id="7" w:name="_Toc239518455"/>
-      <w:r>
-        <w:rPr>
-          <w:lang w:val="en-US"/>
-        </w:rPr>
-        <w:lastRenderedPageBreak/>
+      <w:bookmarkStart w:id="8" w:name="_Toc239750534"/>
+      <w:r>
+        <w:rPr>
+          <w:lang w:val="en-US"/>
+        </w:rPr>
         <w:t>Images</w:t>
       </w:r>
-      <w:bookmarkEnd w:id="7"/>
+      <w:bookmarkEnd w:id="8"/>
     </w:p>
     <w:p>
       <w:pPr>
@@ -2987,14 +3201,14 @@
           <w:lang w:val="en-US"/>
         </w:rPr>
       </w:pPr>
-      <w:bookmarkStart w:id="8" w:name="_Toc239518456"/>
+      <w:bookmarkStart w:id="9" w:name="_Toc239750535"/>
       <w:r>
         <w:rPr>
           <w:lang w:val="en-US"/>
         </w:rPr>
         <w:t>BMP</w:t>
       </w:r>
-      <w:bookmarkEnd w:id="8"/>
+      <w:bookmarkEnd w:id="9"/>
     </w:p>
     <w:p>
       <w:pPr>
@@ -3226,14 +3440,14 @@
           <w:lang w:val="en-US"/>
         </w:rPr>
       </w:pPr>
-      <w:bookmarkStart w:id="9" w:name="_Toc239518457"/>
+      <w:bookmarkStart w:id="10" w:name="_Toc239750536"/>
       <w:r>
         <w:rPr>
           <w:lang w:val="en-US"/>
         </w:rPr>
         <w:t>GIF</w:t>
       </w:r>
-      <w:bookmarkEnd w:id="9"/>
+      <w:bookmarkEnd w:id="10"/>
     </w:p>
     <w:p>
       <w:pPr>
@@ -3532,14 +3746,14 @@
           <w:lang w:val="en-US"/>
         </w:rPr>
       </w:pPr>
-      <w:bookmarkStart w:id="10" w:name="_Toc239518458"/>
+      <w:bookmarkStart w:id="11" w:name="_Toc239750537"/>
       <w:r>
         <w:rPr>
           <w:lang w:val="en-US"/>
         </w:rPr>
         <w:t>JPEG</w:t>
       </w:r>
-      <w:bookmarkEnd w:id="10"/>
+      <w:bookmarkEnd w:id="11"/>
     </w:p>
     <w:p>
       <w:pPr>
@@ -3623,7 +3837,7 @@
           <w:lang w:val="en-US"/>
         </w:rPr>
       </w:pPr>
-      <w:bookmarkStart w:id="11" w:name="_Toc239518459"/>
+      <w:bookmarkStart w:id="12" w:name="_Toc239750538"/>
       <w:r>
         <w:rPr>
           <w:lang w:val="en-US"/>
@@ -3631,7 +3845,7 @@
         <w:lastRenderedPageBreak/>
         <w:t>PNG</w:t>
       </w:r>
-      <w:bookmarkEnd w:id="11"/>
+      <w:bookmarkEnd w:id="12"/>
     </w:p>
     <w:p>
       <w:pPr>
@@ -3848,7 +4062,7 @@
           <w:lang w:val="en-US"/>
         </w:rPr>
       </w:pPr>
-      <w:bookmarkStart w:id="12" w:name="_Toc239518460"/>
+      <w:bookmarkStart w:id="13" w:name="_Toc239750539"/>
       <w:r>
         <w:rPr>
           <w:lang w:val="en-US"/>
@@ -3856,7 +4070,7 @@
         <w:lastRenderedPageBreak/>
         <w:t>Office</w:t>
       </w:r>
-      <w:bookmarkEnd w:id="12"/>
+      <w:bookmarkEnd w:id="13"/>
     </w:p>
     <w:p>
       <w:pPr>
@@ -3865,14 +4079,14 @@
           <w:lang w:val="en-US"/>
         </w:rPr>
       </w:pPr>
-      <w:bookmarkStart w:id="13" w:name="_Toc239518461"/>
+      <w:bookmarkStart w:id="14" w:name="_Toc239750540"/>
       <w:r>
         <w:rPr>
           <w:lang w:val="en-US"/>
         </w:rPr>
         <w:t>DOCX</w:t>
       </w:r>
-      <w:bookmarkEnd w:id="13"/>
+      <w:bookmarkEnd w:id="14"/>
     </w:p>
     <w:p>
       <w:pPr>
@@ -4068,14 +4282,14 @@
           <w:lang w:val="en-US"/>
         </w:rPr>
       </w:pPr>
-      <w:bookmarkStart w:id="14" w:name="_Toc239518462"/>
+      <w:bookmarkStart w:id="15" w:name="_Toc239750541"/>
       <w:r>
         <w:rPr>
           <w:lang w:val="en-US"/>
         </w:rPr>
         <w:t>PPTX</w:t>
       </w:r>
-      <w:bookmarkEnd w:id="14"/>
+      <w:bookmarkEnd w:id="15"/>
     </w:p>
     <w:p>
       <w:pPr>
@@ -4284,14 +4498,14 @@
           <w:lang w:val="en-US"/>
         </w:rPr>
       </w:pPr>
-      <w:bookmarkStart w:id="15" w:name="_Toc239518463"/>
+      <w:bookmarkStart w:id="16" w:name="_Toc239750542"/>
       <w:r>
         <w:rPr>
           <w:lang w:val="en-US"/>
         </w:rPr>
         <w:t>XLSX</w:t>
       </w:r>
-      <w:bookmarkEnd w:id="15"/>
+      <w:bookmarkEnd w:id="16"/>
     </w:p>
     <w:p>
       <w:pPr>
@@ -4678,7 +4892,7 @@
           <w:lang w:val="en-US"/>
         </w:rPr>
       </w:pPr>
-      <w:bookmarkStart w:id="16" w:name="_Toc239518464"/>
+      <w:bookmarkStart w:id="17" w:name="_Toc239750543"/>
       <w:r>
         <w:rPr>
           <w:lang w:val="en-US"/>
@@ -4686,7 +4900,7 @@
         <w:lastRenderedPageBreak/>
         <w:t>Nmap</w:t>
       </w:r>
-      <w:bookmarkEnd w:id="16"/>
+      <w:bookmarkEnd w:id="17"/>
     </w:p>
     <w:p>
       <w:pPr>
@@ -4695,14 +4909,14 @@
           <w:lang w:val="en-US"/>
         </w:rPr>
       </w:pPr>
-      <w:bookmarkStart w:id="17" w:name="_Toc239518465"/>
+      <w:bookmarkStart w:id="18" w:name="_Toc239750544"/>
       <w:r>
         <w:rPr>
           <w:lang w:val="en-US"/>
         </w:rPr>
         <w:t>XML</w:t>
       </w:r>
-      <w:bookmarkEnd w:id="17"/>
+      <w:bookmarkEnd w:id="18"/>
     </w:p>
     <w:p>
       <w:pPr>
@@ -4884,14 +5098,14 @@
           <w:lang w:val="en-US"/>
         </w:rPr>
       </w:pPr>
-      <w:bookmarkStart w:id="18" w:name="_Toc239518466"/>
+      <w:bookmarkStart w:id="19" w:name="_Toc239750545"/>
       <w:r>
         <w:rPr>
           <w:lang w:val="en-US"/>
         </w:rPr>
         <w:t>Wireshark</w:t>
       </w:r>
-      <w:bookmarkEnd w:id="18"/>
+      <w:bookmarkEnd w:id="19"/>
     </w:p>
     <w:p>
       <w:pPr>
@@ -4900,7 +5114,7 @@
           <w:lang w:val="en-US"/>
         </w:rPr>
       </w:pPr>
-      <w:bookmarkStart w:id="19" w:name="_Toc239518467"/>
+      <w:bookmarkStart w:id="20" w:name="_Toc239750546"/>
       <w:proofErr w:type="spellStart"/>
       <w:r>
         <w:rPr>
@@ -4908,7 +5122,7 @@
         </w:rPr>
         <w:t>Pcap</w:t>
       </w:r>
-      <w:bookmarkEnd w:id="19"/>
+      <w:bookmarkEnd w:id="20"/>
       <w:proofErr w:type="spellEnd"/>
     </w:p>
     <w:p>
@@ -5635,12 +5849,14 @@
           <w:lang w:val="en-US"/>
         </w:rPr>
       </w:pPr>
+      <w:bookmarkStart w:id="21" w:name="_Toc239750547"/>
       <w:r>
         <w:rPr>
           <w:lang w:val="en-US"/>
         </w:rPr>
         <w:t>Disk Images</w:t>
       </w:r>
+      <w:bookmarkEnd w:id="21"/>
     </w:p>
     <w:p>
       <w:pPr>
@@ -5657,12 +5873,14 @@
           <w:lang w:val="en-US"/>
         </w:rPr>
       </w:pPr>
+      <w:bookmarkStart w:id="22" w:name="_Toc239750548"/>
       <w:r>
         <w:rPr>
           <w:lang w:val="en-US"/>
         </w:rPr>
         <w:t>E01</w:t>
       </w:r>
+      <w:bookmarkEnd w:id="22"/>
     </w:p>
     <w:p>
       <w:pPr>
@@ -5862,6 +6080,7 @@
         <w:rPr>
           <w:b/>
           <w:bCs/>
+          <w:noProof/>
           <w:lang w:val="en-US"/>
         </w:rPr>
         <w:drawing>

</xml_diff>